<commit_message>
Add authorship support documents and clarity edits to revised draft
- documentation/rewrite-guide.md: Part A/C paragraphs for members to
  rewrite in their own words after reading the full sources
- documentation/ai-use-disclosure.md: draft disclosure statement,
  subject to the course AI policy
- documentation/viva-notes.md: per-role viva questions and answer points
- case-study-draft-rev.md: abstract now lists the same four gaps as
  section 2.6; a few sentences made plainer; docx rebuilt

Co-Authored-By: Claude Opus 5.5 <noreply@anthropic.com>
Claude-Session: https://claude.ai/code/session_01VZE4XfkebTWLatWpMU9HD1
</commit_message>
<xml_diff>
--- a/report/case-study-draft-rev.docx
+++ b/report/case-study-draft-rev.docx
@@ -815,7 +815,7 @@
         <w:pStyle w:val="BodyText"/>
       </w:pPr>
       <w:r>
-        <w:t xml:space="preserve">Across these themes the sources agree that real rule sets are often misconfigured, that rule order hides conflicts, and that network location alone is a weak basis for trust. They part ways on whether finer-grained policy actually lowers risk, given that empirical work links rule-set complexity to errors, and on whether automated tooling removes that tension.</w:t>
+        <w:t xml:space="preserve">Across these themes the sources agree that real rule sets are often misconfigured, that rule order hides conflicts, and that network location alone is a weak basis for trust. They disagree on two points. The first is whether finer-grained policy really lowers risk, since empirical work links rule-set complexity to errors. The second is whether automated tooling removes that tension.</w:t>
       </w:r>
     </w:p>
     <w:p>
@@ -823,7 +823,7 @@
         <w:pStyle w:val="BodyText"/>
       </w:pPr>
       <w:r>
-        <w:t xml:space="preserve">We identify three gaps: the empirical evidence rests on a few older datasets, the usability of management tools is seldom evaluated, and peer-reviewed measurements of microsegmentation are scarce. We argue that the security gained and the management cost incurred by a policy should be measured together, and we design a small Packet Tracer case study to do so.</w:t>
+        <w:t xml:space="preserve">Four gaps stand out. The empirical evidence rests on a few older datasets; unnecessary access is rarely measured against stated requirements; security gain and management cost are seldom measured on the same policy; and management tools are seldom evaluated with real users. To address the third gap on a small scale, we design a Packet Tracer case study that measures both on one network.</w:t>
       </w:r>
     </w:p>
     <w:p>
@@ -875,7 +875,7 @@
         <w:pStyle w:val="BodyText"/>
       </w:pPr>
       <w:r>
-        <w:t xml:space="preserve">Put together, these positions create the tension this review examines. A broad policy is short and easy to write, but it allows far more communication than anyone needs. A least-privilege policy allows only what is needed, but it has more rules, more conditions and more dependence on rule order, which are exactly the properties that [2] associates with configuration errors. We ask how the literature treats this trade-off, and where its evidence is thin.</w:t>
+        <w:t xml:space="preserve">These positions create the tension this review examines. A broad policy is short and easy to write, but it allows far more communication than anyone needs. A least-privilege policy allows only what is needed, but it has more rules, more conditions and more dependence on rule order, which are exactly the properties that [2] associates with configuration errors. We ask how the literature treats this trade-off, and where its evidence is thin.</w:t>
       </w:r>
     </w:p>
     <w:p>
@@ -1303,7 +1303,7 @@
         <w:t xml:space="preserve"> </w:t>
       </w:r>
       <w:r>
-        <w:t xml:space="preserve">measure, and found no significant sign that newer software versions had fewer errors [2]. The implication is that complexity, not the raw number of rules, is what tracks risk. Voronkov</w:t>
+        <w:t xml:space="preserve">measure, and found no significant sign that newer software versions had fewer errors [2]. This suggests that complexity, rather than the raw number of rules, is what tracks risk. Voronkov</w:t>
       </w:r>
       <w:r>
         <w:t xml:space="preserve"> </w:t>

</xml_diff>

<commit_message>
Restyle the report as a conventional academic paper
Times New Roman 12 pt body and black bold headings (no coloured theme
headings), black table borders with bold header rows, 10 pt table text,
Courier New for code. Rebuilt case-study-draft-rev.docx; v0.3 docx left
unchanged.

Co-Authored-By: Claude Opus 5.5 <noreply@anthropic.com>
Claude-Session: https://claude.ai/code/session_01VZE4XfkebTWLatWpMU9HD1
</commit_message>
<xml_diff>
--- a/report/case-study-draft-rev.docx
+++ b/report/case-study-draft-rev.docx
@@ -158,6 +158,9 @@
               <w:jc w:val="left"/>
             </w:pPr>
             <w:r>
+              <w:rPr>
+                <w:b/>
+              </w:rPr>
               <w:t xml:space="preserve">Item</w:t>
             </w:r>
           </w:p>
@@ -171,6 +174,9 @@
               <w:jc w:val="left"/>
             </w:pPr>
             <w:r>
+              <w:rPr>
+                <w:b/>
+              </w:rPr>
               <w:t xml:space="preserve">Details</w:t>
             </w:r>
           </w:p>
@@ -1629,6 +1635,9 @@
               <w:jc w:val="left"/>
             </w:pPr>
             <w:r>
+              <w:rPr>
+                <w:b/>
+              </w:rPr>
               <w:t xml:space="preserve">Approach</w:t>
             </w:r>
           </w:p>
@@ -1642,6 +1651,9 @@
               <w:jc w:val="left"/>
             </w:pPr>
             <w:r>
+              <w:rPr>
+                <w:b/>
+              </w:rPr>
               <w:t xml:space="preserve">Where trust is decided</w:t>
             </w:r>
           </w:p>
@@ -1655,6 +1667,9 @@
               <w:jc w:val="left"/>
             </w:pPr>
             <w:r>
+              <w:rPr>
+                <w:b/>
+              </w:rPr>
               <w:t xml:space="preserve">Granularity</w:t>
             </w:r>
           </w:p>
@@ -1668,6 +1683,9 @@
               <w:jc w:val="left"/>
             </w:pPr>
             <w:r>
+              <w:rPr>
+                <w:b/>
+              </w:rPr>
               <w:t xml:space="preserve">Main strength</w:t>
             </w:r>
           </w:p>
@@ -1681,6 +1699,9 @@
               <w:jc w:val="left"/>
             </w:pPr>
             <w:r>
+              <w:rPr>
+                <w:b/>
+              </w:rPr>
               <w:t xml:space="preserve">Main weakness or open issue</w:t>
             </w:r>
           </w:p>
@@ -1694,6 +1715,9 @@
               <w:jc w:val="left"/>
             </w:pPr>
             <w:r>
+              <w:rPr>
+                <w:b/>
+              </w:rPr>
               <w:t xml:space="preserve">Sources</w:t>
             </w:r>
           </w:p>
@@ -2982,6 +3006,9 @@
               <w:jc w:val="left"/>
             </w:pPr>
             <w:r>
+              <w:rPr>
+                <w:b/>
+              </w:rPr>
               <w:t xml:space="preserve">Category</w:t>
             </w:r>
           </w:p>
@@ -2995,6 +3022,9 @@
               <w:jc w:val="left"/>
             </w:pPr>
             <w:r>
+              <w:rPr>
+                <w:b/>
+              </w:rPr>
               <w:t xml:space="preserve">Count</w:t>
             </w:r>
           </w:p>
@@ -3008,6 +3038,9 @@
               <w:jc w:val="left"/>
             </w:pPr>
             <w:r>
+              <w:rPr>
+                <w:b/>
+              </w:rPr>
               <w:t xml:space="preserve">References</w:t>
             </w:r>
           </w:p>
@@ -3661,6 +3694,9 @@
               <w:jc w:val="left"/>
             </w:pPr>
             <w:r>
+              <w:rPr>
+                <w:b/>
+              </w:rPr>
               <w:t xml:space="preserve">Device</w:t>
             </w:r>
           </w:p>
@@ -3674,6 +3710,9 @@
               <w:jc w:val="left"/>
             </w:pPr>
             <w:r>
+              <w:rPr>
+                <w:b/>
+              </w:rPr>
               <w:t xml:space="preserve">Packet Tracer model</w:t>
             </w:r>
           </w:p>
@@ -3687,6 +3726,9 @@
               <w:jc w:val="left"/>
             </w:pPr>
             <w:r>
+              <w:rPr>
+                <w:b/>
+              </w:rPr>
               <w:t xml:space="preserve">Role</w:t>
             </w:r>
           </w:p>
@@ -3995,6 +4037,9 @@
               <w:jc w:val="left"/>
             </w:pPr>
             <w:r>
+              <w:rPr>
+                <w:b/>
+              </w:rPr>
               <w:t xml:space="preserve">VLAN / zone</w:t>
             </w:r>
           </w:p>
@@ -4008,6 +4053,9 @@
               <w:jc w:val="left"/>
             </w:pPr>
             <w:r>
+              <w:rPr>
+                <w:b/>
+              </w:rPr>
               <w:t xml:space="preserve">Subnet</w:t>
             </w:r>
           </w:p>
@@ -4021,6 +4069,9 @@
               <w:jc w:val="left"/>
             </w:pPr>
             <w:r>
+              <w:rPr>
+                <w:b/>
+              </w:rPr>
               <w:t xml:space="preserve">Gateway</w:t>
             </w:r>
           </w:p>
@@ -4034,6 +4085,9 @@
               <w:jc w:val="left"/>
             </w:pPr>
             <w:r>
+              <w:rPr>
+                <w:b/>
+              </w:rPr>
               <w:t xml:space="preserve">Hosts</w:t>
             </w:r>
           </w:p>
@@ -4543,6 +4597,9 @@
               <w:jc w:val="left"/>
             </w:pPr>
             <w:r>
+              <w:rPr>
+                <w:b/>
+              </w:rPr>
               <w:t xml:space="preserve">ID</w:t>
             </w:r>
           </w:p>
@@ -4556,6 +4613,9 @@
               <w:jc w:val="left"/>
             </w:pPr>
             <w:r>
+              <w:rPr>
+                <w:b/>
+              </w:rPr>
               <w:t xml:space="preserve">Source → Destination</w:t>
             </w:r>
           </w:p>
@@ -4569,6 +4629,9 @@
               <w:jc w:val="left"/>
             </w:pPr>
             <w:r>
+              <w:rPr>
+                <w:b/>
+              </w:rPr>
               <w:t xml:space="preserve">Service</w:t>
             </w:r>
           </w:p>
@@ -4582,6 +4645,9 @@
               <w:jc w:val="left"/>
             </w:pPr>
             <w:r>
+              <w:rPr>
+                <w:b/>
+              </w:rPr>
               <w:t xml:space="preserve">Type</w:t>
             </w:r>
           </w:p>
@@ -5732,6 +5798,9 @@
               <w:jc w:val="left"/>
             </w:pPr>
             <w:r>
+              <w:rPr>
+                <w:b/>
+              </w:rPr>
               <w:t xml:space="preserve">Point</w:t>
             </w:r>
           </w:p>
@@ -5745,6 +5814,9 @@
               <w:jc w:val="left"/>
             </w:pPr>
             <w:r>
+              <w:rPr>
+                <w:b/>
+              </w:rPr>
               <w:t xml:space="preserve">Location</w:t>
             </w:r>
           </w:p>
@@ -5906,6 +5978,9 @@
               <w:jc w:val="left"/>
             </w:pPr>
             <w:r>
+              <w:rPr>
+                <w:b/>
+              </w:rPr>
               <w:t xml:space="preserve">Factor</w:t>
             </w:r>
           </w:p>
@@ -5919,6 +5994,9 @@
               <w:jc w:val="left"/>
             </w:pPr>
             <w:r>
+              <w:rPr>
+                <w:b/>
+              </w:rPr>
               <w:t xml:space="preserve">Stage 1 — Broad internal connectivity, perimeter filtering</w:t>
             </w:r>
           </w:p>
@@ -5932,6 +6010,9 @@
               <w:jc w:val="left"/>
             </w:pPr>
             <w:r>
+              <w:rPr>
+                <w:b/>
+              </w:rPr>
               <w:t xml:space="preserve">Stage 2 — Department-level</w:t>
             </w:r>
           </w:p>
@@ -5945,6 +6026,9 @@
               <w:jc w:val="left"/>
             </w:pPr>
             <w:r>
+              <w:rPr>
+                <w:b/>
+              </w:rPr>
               <w:t xml:space="preserve">Stage 3 — Service-level least privilege</w:t>
             </w:r>
           </w:p>
@@ -6448,6 +6532,9 @@
               <w:jc w:val="left"/>
             </w:pPr>
             <w:r>
+              <w:rPr>
+                <w:b/>
+              </w:rPr>
               <w:t xml:space="preserve">Measure</w:t>
             </w:r>
           </w:p>
@@ -6461,6 +6548,9 @@
               <w:jc w:val="left"/>
             </w:pPr>
             <w:r>
+              <w:rPr>
+                <w:b/>
+              </w:rPr>
               <w:t xml:space="preserve">Stage 1</w:t>
             </w:r>
           </w:p>
@@ -6474,6 +6564,9 @@
               <w:jc w:val="left"/>
             </w:pPr>
             <w:r>
+              <w:rPr>
+                <w:b/>
+              </w:rPr>
               <w:t xml:space="preserve">Stage 2</w:t>
             </w:r>
           </w:p>
@@ -6487,6 +6580,9 @@
               <w:jc w:val="left"/>
             </w:pPr>
             <w:r>
+              <w:rPr>
+                <w:b/>
+              </w:rPr>
               <w:t xml:space="preserve">Stage 3</w:t>
             </w:r>
           </w:p>
@@ -7222,6 +7318,9 @@
               <w:jc w:val="left"/>
             </w:pPr>
             <w:r>
+              <w:rPr>
+                <w:b/>
+              </w:rPr>
               <w:t xml:space="preserve">Service</w:t>
             </w:r>
           </w:p>
@@ -7235,6 +7334,9 @@
               <w:jc w:val="left"/>
             </w:pPr>
             <w:r>
+              <w:rPr>
+                <w:b/>
+              </w:rPr>
               <w:t xml:space="preserve">How it is tested</w:t>
             </w:r>
           </w:p>
@@ -7526,6 +7628,9 @@
               <w:jc w:val="left"/>
             </w:pPr>
             <w:r>
+              <w:rPr>
+                <w:b/>
+              </w:rPr>
               <w:t xml:space="preserve">Code</w:t>
             </w:r>
           </w:p>
@@ -7539,6 +7644,9 @@
               <w:jc w:val="left"/>
             </w:pPr>
             <w:r>
+              <w:rPr>
+                <w:b/>
+              </w:rPr>
               <w:t xml:space="preserve">Meaning</w:t>
             </w:r>
           </w:p>
@@ -7798,6 +7906,9 @@
               <w:jc w:val="left"/>
             </w:pPr>
             <w:r>
+              <w:rPr>
+                <w:b/>
+              </w:rPr>
               <w:t xml:space="preserve">Test</w:t>
             </w:r>
           </w:p>
@@ -7811,6 +7922,9 @@
               <w:jc w:val="left"/>
             </w:pPr>
             <w:r>
+              <w:rPr>
+                <w:b/>
+              </w:rPr>
               <w:t xml:space="preserve">Flow</w:t>
             </w:r>
           </w:p>
@@ -7824,6 +7938,9 @@
               <w:jc w:val="left"/>
             </w:pPr>
             <w:r>
+              <w:rPr>
+                <w:b/>
+              </w:rPr>
               <w:t xml:space="preserve">Method</w:t>
             </w:r>
           </w:p>
@@ -7837,6 +7954,9 @@
               <w:jc w:val="left"/>
             </w:pPr>
             <w:r>
+              <w:rPr>
+                <w:b/>
+              </w:rPr>
               <w:t xml:space="preserve">Req.</w:t>
             </w:r>
           </w:p>
@@ -7850,6 +7970,9 @@
               <w:jc w:val="left"/>
             </w:pPr>
             <w:r>
+              <w:rPr>
+                <w:b/>
+              </w:rPr>
               <w:t xml:space="preserve">Plan S1</w:t>
             </w:r>
           </w:p>
@@ -7863,6 +7986,9 @@
               <w:jc w:val="left"/>
             </w:pPr>
             <w:r>
+              <w:rPr>
+                <w:b/>
+              </w:rPr>
               <w:t xml:space="preserve">Plan S2</w:t>
             </w:r>
           </w:p>
@@ -7876,6 +8002,9 @@
               <w:jc w:val="left"/>
             </w:pPr>
             <w:r>
+              <w:rPr>
+                <w:b/>
+              </w:rPr>
               <w:t xml:space="preserve">Plan S3</w:t>
             </w:r>
           </w:p>
@@ -7889,6 +8018,9 @@
               <w:jc w:val="left"/>
             </w:pPr>
             <w:r>
+              <w:rPr>
+                <w:b/>
+              </w:rPr>
               <w:t xml:space="preserve">Obs. S0</w:t>
             </w:r>
           </w:p>
@@ -7902,6 +8034,9 @@
               <w:jc w:val="left"/>
             </w:pPr>
             <w:r>
+              <w:rPr>
+                <w:b/>
+              </w:rPr>
               <w:t xml:space="preserve">Obs. S1</w:t>
             </w:r>
           </w:p>
@@ -7915,6 +8050,9 @@
               <w:jc w:val="left"/>
             </w:pPr>
             <w:r>
+              <w:rPr>
+                <w:b/>
+              </w:rPr>
               <w:t xml:space="preserve">Obs. S2</w:t>
             </w:r>
           </w:p>
@@ -7928,6 +8066,9 @@
               <w:jc w:val="left"/>
             </w:pPr>
             <w:r>
+              <w:rPr>
+                <w:b/>
+              </w:rPr>
               <w:t xml:space="preserve">Obs. S3</w:t>
             </w:r>
           </w:p>
@@ -11607,6 +11748,9 @@
               <w:jc w:val="left"/>
             </w:pPr>
             <w:r>
+              <w:rPr>
+                <w:b/>
+              </w:rPr>
               <w:t xml:space="preserve">Experiment</w:t>
             </w:r>
           </w:p>
@@ -11620,6 +11764,9 @@
               <w:jc w:val="left"/>
             </w:pPr>
             <w:r>
+              <w:rPr>
+                <w:b/>
+              </w:rPr>
               <w:t xml:space="preserve">Base</w:t>
             </w:r>
           </w:p>
@@ -11633,6 +11780,9 @@
               <w:jc w:val="left"/>
             </w:pPr>
             <w:r>
+              <w:rPr>
+                <w:b/>
+              </w:rPr>
               <w:t xml:space="preserve">Change</w:t>
             </w:r>
           </w:p>
@@ -11646,6 +11796,9 @@
               <w:jc w:val="left"/>
             </w:pPr>
             <w:r>
+              <w:rPr>
+                <w:b/>
+              </w:rPr>
               <w:t xml:space="preserve">Planned observation</w:t>
             </w:r>
           </w:p>
@@ -11659,6 +11812,9 @@
               <w:jc w:val="left"/>
             </w:pPr>
             <w:r>
+              <w:rPr>
+                <w:b/>
+              </w:rPr>
               <w:t xml:space="preserve">Observed</w:t>
             </w:r>
           </w:p>
@@ -12099,6 +12255,9 @@
               <w:jc w:val="left"/>
             </w:pPr>
             <w:r>
+              <w:rPr>
+                <w:b/>
+              </w:rPr>
               <w:t xml:space="preserve">Metric</w:t>
             </w:r>
           </w:p>
@@ -12112,6 +12271,9 @@
               <w:jc w:val="left"/>
             </w:pPr>
             <w:r>
+              <w:rPr>
+                <w:b/>
+              </w:rPr>
               <w:t xml:space="preserve">Planned S1 / S2 / S3</w:t>
             </w:r>
           </w:p>
@@ -12125,6 +12287,9 @@
               <w:jc w:val="left"/>
             </w:pPr>
             <w:r>
+              <w:rPr>
+                <w:b/>
+              </w:rPr>
               <w:t xml:space="preserve">Meas. S1</w:t>
             </w:r>
           </w:p>
@@ -12138,6 +12303,9 @@
               <w:jc w:val="left"/>
             </w:pPr>
             <w:r>
+              <w:rPr>
+                <w:b/>
+              </w:rPr>
               <w:t xml:space="preserve">Meas. S2</w:t>
             </w:r>
           </w:p>
@@ -12151,6 +12319,9 @@
               <w:jc w:val="left"/>
             </w:pPr>
             <w:r>
+              <w:rPr>
+                <w:b/>
+              </w:rPr>
               <w:t xml:space="preserve">Meas. S3</w:t>
             </w:r>
           </w:p>
@@ -12679,6 +12850,9 @@
               <w:jc w:val="left"/>
             </w:pPr>
             <w:r>
+              <w:rPr>
+                <w:b/>
+              </w:rPr>
               <w:t xml:space="preserve">Fig.</w:t>
             </w:r>
           </w:p>
@@ -12692,6 +12866,9 @@
               <w:jc w:val="left"/>
             </w:pPr>
             <w:r>
+              <w:rPr>
+                <w:b/>
+              </w:rPr>
               <w:t xml:space="preserve">Content</w:t>
             </w:r>
           </w:p>
@@ -12705,6 +12882,9 @@
               <w:jc w:val="left"/>
             </w:pPr>
             <w:r>
+              <w:rPr>
+                <w:b/>
+              </w:rPr>
               <w:t xml:space="preserve">Stage</w:t>
             </w:r>
           </w:p>
@@ -13435,6 +13615,9 @@
               <w:jc w:val="left"/>
             </w:pPr>
             <w:r>
+              <w:rPr>
+                <w:b/>
+              </w:rPr>
               <w:t xml:space="preserve">Planned observation (not yet measured)</w:t>
             </w:r>
           </w:p>
@@ -13448,6 +13631,9 @@
               <w:jc w:val="left"/>
             </w:pPr>
             <w:r>
+              <w:rPr>
+                <w:b/>
+              </w:rPr>
               <w:t xml:space="preserve">Literature</w:t>
             </w:r>
           </w:p>
@@ -13461,6 +13647,9 @@
               <w:jc w:val="left"/>
             </w:pPr>
             <w:r>
+              <w:rPr>
+                <w:b/>
+              </w:rPr>
               <w:t xml:space="preserve">Expected relation</w:t>
             </w:r>
           </w:p>
@@ -13870,6 +14059,9 @@
               <w:jc w:val="left"/>
             </w:pPr>
             <w:r>
+              <w:rPr>
+                <w:b/>
+              </w:rPr>
               <w:t xml:space="preserve">Member</w:t>
             </w:r>
           </w:p>
@@ -13883,6 +14075,9 @@
               <w:jc w:val="left"/>
             </w:pPr>
             <w:r>
+              <w:rPr>
+                <w:b/>
+              </w:rPr>
               <w:t xml:space="preserve">Reg. No.</w:t>
             </w:r>
           </w:p>
@@ -13896,6 +14091,9 @@
               <w:jc w:val="left"/>
             </w:pPr>
             <w:r>
+              <w:rPr>
+                <w:b/>
+              </w:rPr>
               <w:t xml:space="preserve">Role(s)</w:t>
             </w:r>
           </w:p>
@@ -13909,6 +14107,9 @@
               <w:jc w:val="left"/>
             </w:pPr>
             <w:r>
+              <w:rPr>
+                <w:b/>
+              </w:rPr>
               <w:t xml:space="preserve">Viva section</w:t>
             </w:r>
           </w:p>
@@ -13922,6 +14123,9 @@
               <w:jc w:val="left"/>
             </w:pPr>
             <w:r>
+              <w:rPr>
+                <w:b/>
+              </w:rPr>
               <w:t xml:space="preserve">Main contributions</w:t>
             </w:r>
           </w:p>
@@ -13935,6 +14139,9 @@
               <w:jc w:val="left"/>
             </w:pPr>
             <w:r>
+              <w:rPr>
+                <w:b/>
+              </w:rPr>
               <w:t xml:space="preserve">Reviewed / verified</w:t>
             </w:r>
           </w:p>
@@ -13948,6 +14155,9 @@
               <w:jc w:val="left"/>
             </w:pPr>
             <w:r>
+              <w:rPr>
+                <w:b/>
+              </w:rPr>
               <w:t xml:space="preserve">Sign.</w:t>
             </w:r>
           </w:p>
@@ -14381,6 +14591,9 @@
               <w:jc w:val="left"/>
             </w:pPr>
             <w:r>
+              <w:rPr>
+                <w:b/>
+              </w:rPr>
               <w:t xml:space="preserve">Repository path</w:t>
             </w:r>
           </w:p>
@@ -14394,6 +14607,9 @@
               <w:jc w:val="left"/>
             </w:pPr>
             <w:r>
+              <w:rPr>
+                <w:b/>
+              </w:rPr>
               <w:t xml:space="preserve">Contents</w:t>
             </w:r>
           </w:p>
@@ -14835,6 +15051,9 @@
               <w:jc w:val="left"/>
             </w:pPr>
             <w:r>
+              <w:rPr>
+                <w:b/>
+              </w:rPr>
               <w:t xml:space="preserve">Ref.</w:t>
             </w:r>
           </w:p>
@@ -14847,6 +15066,9 @@
               <w:jc w:val="left"/>
             </w:pPr>
             <w:r>
+              <w:rPr>
+                <w:b/>
+              </w:rPr>
               <w:t xml:space="preserve">What was confirmed online</w:t>
             </w:r>
           </w:p>
@@ -14859,6 +15081,9 @@
               <w:jc w:val="left"/>
             </w:pPr>
             <w:r>
+              <w:rPr>
+                <w:b/>
+              </w:rPr>
               <w:t xml:space="preserve">Claim in this draft that relies on it</w:t>
             </w:r>
           </w:p>
@@ -14871,6 +15096,9 @@
               <w:jc w:val="left"/>
             </w:pPr>
             <w:r>
+              <w:rPr>
+                <w:b/>
+              </w:rPr>
               <w:t xml:space="preserve">Full text read (by whom)</w:t>
             </w:r>
           </w:p>
@@ -16334,9 +16562,9 @@
   <w:docDefaults>
     <w:rPrDefault>
       <w:rPr>
-        <w:rFonts w:asciiTheme="minorHAnsi" w:cstheme="minorBidi" w:eastAsiaTheme="minorHAnsi" w:hAnsiTheme="minorHAnsi"/>
-        <w:sz w:val="22"/>
-        <w:szCs w:val="22"/>
+        <w:rFonts w:ascii="Times New Roman" w:cs="Times New Roman" w:eastAsia="Times New Roman" w:hAnsi="Times New Roman"/>
+        <w:sz w:val="24"/>
+        <w:szCs w:val="24"/>
         <w:lang w:bidi="ar-SA" w:eastAsia="en-US" w:val="en-US"/>
       </w:rPr>
     </w:rPrDefault>
@@ -16391,12 +16619,12 @@
       <w:jc w:val="center"/>
     </w:pPr>
     <w:rPr>
-      <w:rFonts w:asciiTheme="majorHAnsi" w:cstheme="majorBidi" w:eastAsiaTheme="majorEastAsia" w:hAnsiTheme="majorHAnsi"/>
+      <w:rFonts w:ascii="Times New Roman" w:cs="Times New Roman" w:eastAsia="Times New Roman" w:hAnsi="Times New Roman"/>
       <w:b/>
       <w:bCs/>
-      <w:color w:val="1F3864"/>
-      <w:sz w:val="36"/>
-      <w:szCs w:val="36"/>
+      <w:color w:val="000000"/>
+      <w:sz w:val="34"/>
+      <w:szCs w:val="34"/>
     </w:rPr>
   </w:style>
   <w:style w:styleId="Subtitle" w:type="paragraph">
@@ -16411,8 +16639,8 @@
       <w:jc w:val="center"/>
     </w:pPr>
     <w:rPr>
-      <w:rFonts w:asciiTheme="majorHAnsi" w:cstheme="majorBidi" w:eastAsiaTheme="majorEastAsia" w:hAnsiTheme="majorHAnsi"/>
-      <w:color w:val="404040"/>
+      <w:rFonts w:ascii="Times New Roman" w:cs="Times New Roman" w:eastAsia="Times New Roman" w:hAnsi="Times New Roman"/>
+      <w:color w:val="000000"/>
       <w:sz w:val="24"/>
       <w:szCs w:val="24"/>
     </w:rPr>
@@ -16487,16 +16715,16 @@
     <w:pPr>
       <w:keepNext/>
       <w:keepLines/>
-      <w:spacing w:after="100" w:before="300"/>
+      <w:spacing w:after="120" w:before="280"/>
       <w:outlineLvl w:val="0"/>
     </w:pPr>
     <w:rPr>
-      <w:rFonts w:asciiTheme="majorHAnsi" w:cstheme="majorBidi" w:eastAsiaTheme="majorEastAsia" w:hAnsiTheme="majorHAnsi"/>
+      <w:rFonts w:ascii="Times New Roman" w:cs="Times New Roman" w:eastAsia="Times New Roman" w:hAnsi="Times New Roman"/>
       <w:b/>
       <w:bCs/>
-      <w:color w:val="1F3864"/>
-      <w:sz w:val="30"/>
-      <w:szCs w:val="30"/>
+      <w:color w:val="000000"/>
+      <w:sz w:val="28"/>
+      <w:szCs w:val="28"/>
     </w:rPr>
   </w:style>
   <w:style w:styleId="Heading2" w:type="paragraph">
@@ -16509,14 +16737,14 @@
     <w:pPr>
       <w:keepNext/>
       <w:keepLines/>
-      <w:spacing w:after="80" w:before="220"/>
+      <w:spacing w:after="100" w:before="240"/>
       <w:outlineLvl w:val="1"/>
     </w:pPr>
     <w:rPr>
-      <w:rFonts w:asciiTheme="majorHAnsi" w:cstheme="majorBidi" w:eastAsiaTheme="majorEastAsia" w:hAnsiTheme="majorHAnsi"/>
+      <w:rFonts w:ascii="Times New Roman" w:cs="Times New Roman" w:eastAsia="Times New Roman" w:hAnsi="Times New Roman"/>
       <w:b/>
       <w:bCs/>
-      <w:color w:val="1F3864"/>
+      <w:color w:val="000000"/>
       <w:sz w:val="26"/>
       <w:szCs w:val="26"/>
     </w:rPr>
@@ -16531,16 +16759,16 @@
     <w:pPr>
       <w:keepNext/>
       <w:keepLines/>
-      <w:spacing w:after="60" w:before="180"/>
+      <w:spacing w:after="80" w:before="200"/>
       <w:outlineLvl w:val="2"/>
     </w:pPr>
     <w:rPr>
-      <w:rFonts w:asciiTheme="majorHAnsi" w:cstheme="majorBidi" w:eastAsiaTheme="majorEastAsia" w:hAnsiTheme="majorHAnsi"/>
+      <w:rFonts w:ascii="Times New Roman" w:cs="Times New Roman" w:eastAsia="Times New Roman" w:hAnsi="Times New Roman"/>
       <w:b/>
       <w:bCs/>
-      <w:color w:val="1F3864"/>
-      <w:sz w:val="23"/>
-      <w:szCs w:val="23"/>
+      <w:color w:val="000000"/>
+      <w:sz w:val="24"/>
+      <w:szCs w:val="24"/>
     </w:rPr>
   </w:style>
   <w:style w:styleId="Heading4" w:type="paragraph">
@@ -16553,16 +16781,18 @@
     <w:pPr>
       <w:keepNext/>
       <w:keepLines/>
-      <w:spacing w:after="40" w:before="140"/>
+      <w:spacing w:after="60" w:before="160"/>
       <w:outlineLvl w:val="3"/>
     </w:pPr>
     <w:rPr>
-      <w:rFonts w:asciiTheme="majorHAnsi" w:cstheme="majorBidi" w:eastAsiaTheme="majorEastAsia" w:hAnsiTheme="majorHAnsi"/>
+      <w:rFonts w:ascii="Times New Roman" w:cs="Times New Roman" w:eastAsia="Times New Roman" w:hAnsi="Times New Roman"/>
       <w:b/>
       <w:bCs/>
-      <w:color w:val="1F3864"/>
-      <w:sz w:val="21"/>
-      <w:szCs w:val="21"/>
+      <w:i/>
+      <w:iCs/>
+      <w:color w:val="000000"/>
+      <w:sz w:val="24"/>
+      <w:szCs w:val="24"/>
     </w:rPr>
   </w:style>
   <w:style w:styleId="Heading5" w:type="paragraph">
@@ -16698,18 +16928,18 @@
     <w:unhideWhenUsed/>
     <w:qFormat/>
     <w:rPr>
-      <w:sz w:val="18"/>
-      <w:szCs w:val="18"/>
+      <w:sz w:val="20"/>
+      <w:szCs w:val="20"/>
     </w:rPr>
     <w:tblPr>
       <w:tblInd w:type="dxa" w:w="0"/>
       <w:tblBorders>
-        <w:top w:color="A6A6A6" w:space="0" w:sz="4" w:val="single"/>
-        <w:left w:color="A6A6A6" w:space="0" w:sz="4" w:val="single"/>
-        <w:bottom w:color="A6A6A6" w:space="0" w:sz="4" w:val="single"/>
-        <w:right w:color="A6A6A6" w:space="0" w:sz="4" w:val="single"/>
-        <w:insideH w:color="A6A6A6" w:space="0" w:sz="4" w:val="single"/>
-        <w:insideV w:color="A6A6A6" w:space="0" w:sz="4" w:val="single"/>
+        <w:top w:color="000000" w:space="0" w:sz="4" w:val="single"/>
+        <w:left w:color="000000" w:space="0" w:sz="4" w:val="single"/>
+        <w:bottom w:color="000000" w:space="0" w:sz="4" w:val="single"/>
+        <w:right w:color="000000" w:space="0" w:sz="4" w:val="single"/>
+        <w:insideH w:color="000000" w:space="0" w:sz="4" w:val="single"/>
+        <w:insideV w:color="000000" w:space="0" w:sz="4" w:val="single"/>
       </w:tblBorders>
       <w:tblCellMar>
         <w:top w:type="dxa" w:w="0"/>
@@ -16793,7 +17023,7 @@
     <w:name w:val="Verbatim Char"/>
     <w:basedOn w:val="BodyTextChar"/>
     <w:rPr>
-      <w:rFonts w:ascii="Consolas" w:hAnsi="Consolas"/>
+      <w:rFonts w:ascii="Courier New" w:hAnsi="Courier New" w:cs="Courier New"/>
       <w:sz w:val="17"/>
       <w:szCs w:val="17"/>
     </w:rPr>

</xml_diff>

<commit_message>
Restructure Part B as a case-study paper; fill contribution statement; Arial
- Part B now follows the usual Packet Tracer case-study layout:
  problem statement and objectives, research method (phased),
  requirements analysis, network design, implementation (baseline and
  pilot; policy stages), testing, misconfiguration experiments,
  results and discussion, evidence plan. Tables 2-4 renumbered.
- Individual Contribution Statement filled in by role (names and
  registration numbers left for the team; each row to be confirmed)
- Body and headings in Arial 11 pt; section references in team docs
  updated

Co-Authored-By: Claude Opus 5.5 <noreply@anthropic.com>
Claude-Session: https://claude.ai/code/session_01VZE4XfkebTWLatWpMU9HD1
</commit_message>
<xml_diff>
--- a/report/case-study-draft-rev.docx
+++ b/report/case-study-draft-rev.docx
@@ -630,7 +630,7 @@
         </w:numPr>
       </w:pPr>
       <w:r>
-        <w:t xml:space="preserve">Device inventory</w:t>
+        <w:t xml:space="preserve">Required and forbidden flows</w:t>
       </w:r>
     </w:p>
     <w:p>
@@ -642,7 +642,7 @@
         </w:numPr>
       </w:pPr>
       <w:r>
-        <w:t xml:space="preserve">VLAN and addressing plan</w:t>
+        <w:t xml:space="preserve">Device inventory</w:t>
       </w:r>
     </w:p>
     <w:p>
@@ -654,7 +654,7 @@
         </w:numPr>
       </w:pPr>
       <w:r>
-        <w:t xml:space="preserve">Required and forbidden flows</w:t>
+        <w:t xml:space="preserve">VLAN and addressing plan</w:t>
       </w:r>
     </w:p>
     <w:p>
@@ -3283,7 +3283,7 @@
     <w:bookmarkEnd w:id="31"/>
     <w:bookmarkEnd w:id="32"/>
     <w:bookmarkEnd w:id="33"/>
-    <w:bookmarkStart w:id="43" w:name="part-b-simulation-based-case-study"/>
+    <w:bookmarkStart w:id="44" w:name="part-b-simulation-based-case-study"/>
     <w:p>
       <w:pPr>
         <w:pStyle w:val="Heading1"/>
@@ -3352,18 +3352,36 @@
         <w:t xml:space="preserve">. [PLACEHOLDER: Packet Tracer version used by all members.]</w:t>
       </w:r>
     </w:p>
-    <w:bookmarkStart w:id="34" w:name="X54d9faf08224282feaa16782452fd17a259a99d"/>
+    <w:bookmarkStart w:id="34" w:name="X9f3fcedc30a25c6eff65369b19d5016ea59310e"/>
     <w:p>
       <w:pPr>
         <w:pStyle w:val="Heading2"/>
       </w:pPr>
       <w:r>
-        <w:t xml:space="preserve">B1. Experimental Objective and Research Question</w:t>
+        <w:t xml:space="preserve">B1. Introduction, Problem Statement and Objectives</w:t>
       </w:r>
     </w:p>
     <w:p>
       <w:pPr>
         <w:pStyle w:val="FirstParagraph"/>
+      </w:pPr>
+      <w:r>
+        <w:rPr>
+          <w:bCs/>
+          <w:b/>
+        </w:rPr>
+        <w:t xml:space="preserve">Problem statement.</w:t>
+      </w:r>
+      <w:r>
+        <w:t xml:space="preserve"> </w:t>
+      </w:r>
+      <w:r>
+        <w:t xml:space="preserve">Many small organisations run an internal network in which every department can reach every other department and every server. A router ACL can close those paths, but each step towards least privilege adds rules, conditions and dependence on rule order. Part A found that the literature rarely measures the security gained and the management cost incurred on the same policy as it is refined. This case study does that, on a small scale, in a simulated enterprise network.</w:t>
+      </w:r>
+    </w:p>
+    <w:p>
+      <w:pPr>
+        <w:pStyle w:val="BodyText"/>
       </w:pPr>
       <w:r>
         <w:rPr>
@@ -3415,7 +3433,7 @@
         <w:pStyle w:val="BodyText"/>
       </w:pPr>
       <w:r>
-        <w:t xml:space="preserve">To keep the comparison fair, we hold the following constant in every stage: the topology, addressing, routing and server services; the required and forbidden flows; the seven points where filters are applied; and the same 17 test cases (of 26 designed), run with the same methods. Our conclusions are limited to those 17 test cases and to the traffic directions listed in B6.</w:t>
+        <w:t xml:space="preserve">To keep the comparison fair, we hold the following constant in every stage: the topology, addressing, routing and server services; the required and forbidden flows; the seven points where filters are applied; and the same 17 test cases (of 26 designed), run with the same methods. Our conclusions are limited to those 17 test cases and to the traffic directions listed in B7.</w:t>
       </w:r>
     </w:p>
     <w:p>
@@ -3427,13 +3445,7 @@
           <w:bCs/>
           <w:b/>
         </w:rPr>
-        <w:t xml:space="preserve">Working expectations.</w:t>
-      </w:r>
-      <w:r>
-        <w:t xml:space="preserve"> </w:t>
-      </w:r>
-      <w:r>
-        <w:t xml:space="preserve">We expect the following, but we treat them as hypotheses to test, not as results:</w:t>
+        <w:t xml:space="preserve">Objectives.</w:t>
       </w:r>
     </w:p>
     <w:p>
@@ -3445,17 +3457,7 @@
         </w:numPr>
       </w:pPr>
       <w:r>
-        <w:rPr>
-          <w:bCs/>
-          <w:b/>
-        </w:rPr>
-        <w:t xml:space="preserve">E1.</w:t>
-      </w:r>
-      <w:r>
-        <w:t xml:space="preserve"> </w:t>
-      </w:r>
-      <w:r>
-        <w:t xml:space="preserve">The number of forbidden test cases that are permitted falls from Stage 1 to Stage 3.</w:t>
+        <w:t xml:space="preserve">Build a multi-department network in Cisco Packet Tracer and confirm that every test flow works with no ACLs (Stage 0).</w:t>
       </w:r>
     </w:p>
     <w:p>
@@ -3467,17 +3469,7 @@
         </w:numPr>
       </w:pPr>
       <w:r>
-        <w:rPr>
-          <w:bCs/>
-          <w:b/>
-        </w:rPr>
-        <w:t xml:space="preserve">E2.</w:t>
-      </w:r>
-      <w:r>
-        <w:t xml:space="preserve"> </w:t>
-      </w:r>
-      <w:r>
-        <w:t xml:space="preserve">The number of ACL entries and match conditions rises from Stage 1 to Stage 3.</w:t>
+        <w:t xml:space="preserve">Write down the required and forbidden flows before writing any rule.</w:t>
       </w:r>
     </w:p>
     <w:p>
@@ -3489,17 +3481,31 @@
         </w:numPr>
       </w:pPr>
       <w:r>
-        <w:rPr>
-          <w:bCs/>
-          <w:b/>
-        </w:rPr>
-        <w:t xml:space="preserve">E3.</w:t>
-      </w:r>
-      <w:r>
-        <w:t xml:space="preserve"> </w:t>
-      </w:r>
-      <w:r>
-        <w:t xml:space="preserve">Rule count alone does not capture complexity.</w:t>
+        <w:t xml:space="preserve">Implement three policy stages at the same seven enforcement points: broad, department-level and service-level least privilege.</w:t>
+      </w:r>
+    </w:p>
+    <w:p>
+      <w:pPr>
+        <w:pStyle w:val="Compact"/>
+        <w:numPr>
+          <w:ilvl w:val="0"/>
+          <w:numId w:val="1004"/>
+        </w:numPr>
+      </w:pPr>
+      <w:r>
+        <w:t xml:space="preserve">Measure, for each stage, the unnecessary access that remains and the size, specificity and rule-order dependence of the policy.</w:t>
+      </w:r>
+    </w:p>
+    <w:p>
+      <w:pPr>
+        <w:pStyle w:val="Compact"/>
+        <w:numPr>
+          <w:ilvl w:val="0"/>
+          <w:numId w:val="1004"/>
+        </w:numPr>
+      </w:pPr>
+      <w:r>
+        <w:t xml:space="preserve">Reproduce two typical policy mistakes in controlled copies of the network.</w:t>
       </w:r>
     </w:p>
     <w:p>
@@ -3512,50 +3518,25 @@
         <w:spacing w:after="140"/>
       </w:pPr>
       <w:r>
+        <w:t xml:space="preserve">Compare the results with the literature reviewed in Part A (Part C).</w:t>
+      </w:r>
+    </w:p>
+    <w:p>
+      <w:pPr>
+        <w:pStyle w:val="FirstParagraph"/>
+      </w:pPr>
+      <w:r>
         <w:rPr>
           <w:bCs/>
           <w:b/>
         </w:rPr>
-        <w:t xml:space="preserve">E4.</w:t>
-      </w:r>
-      <w:r>
-        <w:t xml:space="preserve"> </w:t>
-      </w:r>
-      <w:r>
-        <w:t xml:space="preserve">Some excess access remains in every stage, because L3/L4 ACLs cannot express it.</w:t>
-      </w:r>
-    </w:p>
-    <w:bookmarkEnd w:id="34"/>
-    <w:bookmarkStart w:id="35" w:name="b2.-network-architecture"/>
-    <w:p>
-      <w:pPr>
-        <w:pStyle w:val="Heading2"/>
-      </w:pPr>
-      <w:r>
-        <w:t xml:space="preserve">B2. Network Architecture</w:t>
-      </w:r>
-    </w:p>
-    <w:p>
-      <w:pPr>
-        <w:pStyle w:val="FirstParagraph"/>
-      </w:pPr>
-      <w:r>
-        <w:t xml:space="preserve">We designed a 19-device network with four departments, a server zone and a small simulated</w:t>
-      </w:r>
-      <w:r>
-        <w:t xml:space="preserve"> </w:t>
-      </w:r>
-      <w:r>
-        <w:t xml:space="preserve">“</w:t>
-      </w:r>
-      <w:r>
-        <w:t xml:space="preserve">Internet</w:t>
-      </w:r>
-      <w:r>
-        <w:t xml:space="preserve">”</w:t>
-      </w:r>
-      <w:r>
-        <w:t xml:space="preserve">. It is large enough for policy to grow in interesting ways, but small enough to build and test by hand.</w:t>
+        <w:t xml:space="preserve">Working expectations.</w:t>
+      </w:r>
+      <w:r>
+        <w:t xml:space="preserve"> </w:t>
+      </w:r>
+      <w:r>
+        <w:t xml:space="preserve">We expect the following, but we treat them as hypotheses to test, not as results:</w:t>
       </w:r>
     </w:p>
     <w:p>
@@ -3571,13 +3552,13 @@
           <w:bCs/>
           <w:b/>
         </w:rPr>
-        <w:t xml:space="preserve">R-CORE</w:t>
-      </w:r>
-      <w:r>
-        <w:t xml:space="preserve"> </w:t>
-      </w:r>
-      <w:r>
-        <w:t xml:space="preserve">routes between the department VLANs (router-on-a-stick) and holds all internal ACLs. We chose a router rather than a multilayer switch because IOS routers in Packet Tracer support extended ACLs and VTY access control fully, and because putting every internal policy decision on one device makes the rules easy to count and audit. The price is a single point of failure, which we accept as a simplification.</w:t>
+        <w:t xml:space="preserve">E1.</w:t>
+      </w:r>
+      <w:r>
+        <w:t xml:space="preserve"> </w:t>
+      </w:r>
+      <w:r>
+        <w:t xml:space="preserve">The number of forbidden test cases that are permitted falls from Stage 1 to Stage 3.</w:t>
       </w:r>
     </w:p>
     <w:p>
@@ -3593,13 +3574,13 @@
           <w:bCs/>
           <w:b/>
         </w:rPr>
-        <w:t xml:space="preserve">R-EDGE</w:t>
-      </w:r>
-      <w:r>
-        <w:t xml:space="preserve"> </w:t>
-      </w:r>
-      <w:r>
-        <w:t xml:space="preserve">connects the external network and holds the edge ACL. Without it we could not show perimeter filtering, which is where the topic starts.</w:t>
+        <w:t xml:space="preserve">E2.</w:t>
+      </w:r>
+      <w:r>
+        <w:t xml:space="preserve"> </w:t>
+      </w:r>
+      <w:r>
+        <w:t xml:space="preserve">The number of ACL entries and match conditions rises from Stage 1 to Stage 3.</w:t>
       </w:r>
     </w:p>
     <w:p>
@@ -3615,13 +3596,13 @@
           <w:bCs/>
           <w:b/>
         </w:rPr>
-        <w:t xml:space="preserve">External addresses</w:t>
-      </w:r>
-      <w:r>
-        <w:t xml:space="preserve"> </w:t>
-      </w:r>
-      <w:r>
-        <w:t xml:space="preserve">use the RFC 5737 documentation range 203.0.113.0/24 [18], so the simulated Internet does not use real public addresses.</w:t>
+        <w:t xml:space="preserve">E3.</w:t>
+      </w:r>
+      <w:r>
+        <w:t xml:space="preserve"> </w:t>
+      </w:r>
+      <w:r>
+        <w:t xml:space="preserve">Rule count alone does not capture complexity.</w:t>
       </w:r>
     </w:p>
     <w:p>
@@ -3638,21 +3619,405 @@
           <w:bCs/>
           <w:b/>
         </w:rPr>
-        <w:t xml:space="preserve">Two PCs per department</w:t>
-      </w:r>
-      <w:r>
-        <w:t xml:space="preserve"> </w:t>
-      </w:r>
-      <w:r>
-        <w:t xml:space="preserve">let us test traffic inside a VLAN, which never reaches the router and so cannot be filtered by a router ACL.</w:t>
+        <w:t xml:space="preserve">E4.</w:t>
+      </w:r>
+      <w:r>
+        <w:t xml:space="preserve"> </w:t>
+      </w:r>
+      <w:r>
+        <w:t xml:space="preserve">Some excess access remains in every stage, because L3/L4 ACLs cannot express it.</w:t>
+      </w:r>
+    </w:p>
+    <w:bookmarkEnd w:id="34"/>
+    <w:bookmarkStart w:id="35" w:name="b2.-research-method"/>
+    <w:p>
+      <w:pPr>
+        <w:pStyle w:val="Heading2"/>
+      </w:pPr>
+      <w:r>
+        <w:t xml:space="preserve">B2. Research Method</w:t>
       </w:r>
     </w:p>
     <w:p>
       <w:pPr>
         <w:pStyle w:val="FirstParagraph"/>
-      </w:pPr>
-      <w:r>
-        <w:t xml:space="preserve">Routing is static and there is no NAT, which keeps external tests readable; Part C discusses what this leaves out.</w:t>
+        <w:keepNext/>
+      </w:pPr>
+      <w:r>
+        <w:t xml:space="preserve">We followed a phased method, moving to the next phase only when the previous one had been checked:</w:t>
+      </w:r>
+    </w:p>
+    <w:tbl>
+      <w:tblPr>
+        <w:tblStyle w:val="Table"/>
+        <w:tblW w:type="pct" w:w="5000"/>
+        <w:jc w:val="left"/>
+        <w:tblLook w:firstRow="1" w:lastRow="0" w:firstColumn="0" w:lastColumn="0" w:noHBand="0" w:noVBand="0" w:val="0020"/>
+      </w:tblPr>
+      <w:tblGrid>
+        <w:gridCol w:w="2346"/>
+        <w:gridCol w:w="3813"/>
+        <w:gridCol w:w="1760"/>
+      </w:tblGrid>
+      <w:tr>
+        <w:trPr>
+          <w:cantSplit/>
+          <w:tblHeader/>
+        </w:trPr>
+        <w:tc>
+          <w:tcPr/>
+          <w:p>
+            <w:pPr>
+              <w:pStyle w:val="Compact"/>
+              <w:keepNext/>
+              <w:jc w:val="left"/>
+            </w:pPr>
+            <w:r>
+              <w:rPr>
+                <w:b/>
+              </w:rPr>
+              <w:t xml:space="preserve">Phase</w:t>
+            </w:r>
+          </w:p>
+        </w:tc>
+        <w:tc>
+          <w:tcPr/>
+          <w:p>
+            <w:pPr>
+              <w:pStyle w:val="Compact"/>
+              <w:keepNext/>
+              <w:jc w:val="left"/>
+            </w:pPr>
+            <w:r>
+              <w:rPr>
+                <w:b/>
+              </w:rPr>
+              <w:t xml:space="preserve">What we do</w:t>
+            </w:r>
+          </w:p>
+        </w:tc>
+        <w:tc>
+          <w:tcPr/>
+          <w:p>
+            <w:pPr>
+              <w:pStyle w:val="Compact"/>
+              <w:keepNext/>
+              <w:jc w:val="left"/>
+            </w:pPr>
+            <w:r>
+              <w:rPr>
+                <w:b/>
+              </w:rPr>
+              <w:t xml:space="preserve">Output</w:t>
+            </w:r>
+          </w:p>
+        </w:tc>
+      </w:tr>
+      <w:tr>
+        <w:trPr>
+          <w:cantSplit/>
+        </w:trPr>
+        <w:tc>
+          <w:tcPr/>
+          <w:p>
+            <w:pPr>
+              <w:pStyle w:val="Compact"/>
+              <w:keepNext/>
+              <w:jc w:val="left"/>
+            </w:pPr>
+            <w:r>
+              <w:t xml:space="preserve">1. Requirements analysis</w:t>
+            </w:r>
+          </w:p>
+        </w:tc>
+        <w:tc>
+          <w:tcPr/>
+          <w:p>
+            <w:pPr>
+              <w:pStyle w:val="Compact"/>
+              <w:keepNext/>
+              <w:jc w:val="left"/>
+            </w:pPr>
+            <w:r>
+              <w:t xml:space="preserve">List the flows the organisation needs (R) and must not have (X)</w:t>
+            </w:r>
+          </w:p>
+        </w:tc>
+        <w:tc>
+          <w:tcPr/>
+          <w:p>
+            <w:pPr>
+              <w:pStyle w:val="Compact"/>
+              <w:keepNext/>
+              <w:jc w:val="left"/>
+            </w:pPr>
+            <w:r>
+              <w:t xml:space="preserve">Table 2</w:t>
+            </w:r>
+          </w:p>
+        </w:tc>
+      </w:tr>
+      <w:tr>
+        <w:trPr>
+          <w:cantSplit/>
+        </w:trPr>
+        <w:tc>
+          <w:tcPr/>
+          <w:p>
+            <w:pPr>
+              <w:pStyle w:val="Compact"/>
+              <w:keepNext/>
+              <w:jc w:val="left"/>
+            </w:pPr>
+            <w:r>
+              <w:t xml:space="preserve">2. Network design</w:t>
+            </w:r>
+          </w:p>
+        </w:tc>
+        <w:tc>
+          <w:tcPr/>
+          <w:p>
+            <w:pPr>
+              <w:pStyle w:val="Compact"/>
+              <w:keepNext/>
+              <w:jc w:val="left"/>
+            </w:pPr>
+            <w:r>
+              <w:t xml:space="preserve">Choose devices, VLANs, addressing and the enforcement points</w:t>
+            </w:r>
+          </w:p>
+        </w:tc>
+        <w:tc>
+          <w:tcPr/>
+          <w:p>
+            <w:pPr>
+              <w:pStyle w:val="Compact"/>
+              <w:keepNext/>
+              <w:jc w:val="left"/>
+            </w:pPr>
+            <w:r>
+              <w:t xml:space="preserve">Tables 3 and 4</w:t>
+            </w:r>
+          </w:p>
+        </w:tc>
+      </w:tr>
+      <w:tr>
+        <w:trPr>
+          <w:cantSplit/>
+        </w:trPr>
+        <w:tc>
+          <w:tcPr/>
+          <w:p>
+            <w:pPr>
+              <w:pStyle w:val="Compact"/>
+              <w:keepNext/>
+              <w:jc w:val="left"/>
+            </w:pPr>
+            <w:r>
+              <w:t xml:space="preserve">3. Baseline and pilot</w:t>
+            </w:r>
+          </w:p>
+        </w:tc>
+        <w:tc>
+          <w:tcPr/>
+          <w:p>
+            <w:pPr>
+              <w:pStyle w:val="Compact"/>
+              <w:keepNext/>
+              <w:jc w:val="left"/>
+            </w:pPr>
+            <w:r>
+              <w:t xml:space="preserve">Build Stage 0 with no ACLs; confirm all test flows work; check the Packet Tracer features we rely on</w:t>
+            </w:r>
+          </w:p>
+        </w:tc>
+        <w:tc>
+          <w:tcPr/>
+          <w:p>
+            <w:pPr>
+              <w:pStyle w:val="Compact"/>
+              <w:keepNext/>
+              <w:jc w:val="left"/>
+            </w:pPr>
+            <w:r>
+              <w:t xml:space="preserve">Stage 0 results; pilot log</w:t>
+            </w:r>
+          </w:p>
+        </w:tc>
+      </w:tr>
+      <w:tr>
+        <w:trPr>
+          <w:cantSplit/>
+        </w:trPr>
+        <w:tc>
+          <w:tcPr/>
+          <w:p>
+            <w:pPr>
+              <w:pStyle w:val="Compact"/>
+              <w:keepNext/>
+              <w:jc w:val="left"/>
+            </w:pPr>
+            <w:r>
+              <w:t xml:space="preserve">4. Policy implementation</w:t>
+            </w:r>
+          </w:p>
+        </w:tc>
+        <w:tc>
+          <w:tcPr/>
+          <w:p>
+            <w:pPr>
+              <w:pStyle w:val="Compact"/>
+              <w:keepNext/>
+              <w:jc w:val="left"/>
+            </w:pPr>
+            <w:r>
+              <w:t xml:space="preserve">Apply Stage 1, then Stage 2, then Stage 3 on top of the same network</w:t>
+            </w:r>
+          </w:p>
+        </w:tc>
+        <w:tc>
+          <w:tcPr/>
+          <w:p>
+            <w:pPr>
+              <w:pStyle w:val="Compact"/>
+              <w:keepNext/>
+              <w:jc w:val="left"/>
+            </w:pPr>
+            <w:r>
+              <w:t xml:space="preserve">Saved configurations</w:t>
+            </w:r>
+          </w:p>
+        </w:tc>
+      </w:tr>
+      <w:tr>
+        <w:trPr>
+          <w:cantSplit/>
+        </w:trPr>
+        <w:tc>
+          <w:tcPr/>
+          <w:p>
+            <w:pPr>
+              <w:pStyle w:val="Compact"/>
+              <w:keepNext/>
+              <w:jc w:val="left"/>
+            </w:pPr>
+            <w:r>
+              <w:t xml:space="preserve">5. Testing and measurement</w:t>
+            </w:r>
+          </w:p>
+        </w:tc>
+        <w:tc>
+          <w:tcPr/>
+          <w:p>
+            <w:pPr>
+              <w:pStyle w:val="Compact"/>
+              <w:keepNext/>
+              <w:jc w:val="left"/>
+            </w:pPr>
+            <w:r>
+              <w:t xml:space="preserve">Run the same tests in every stage; record counters and evidence; compute the metrics</w:t>
+            </w:r>
+          </w:p>
+        </w:tc>
+        <w:tc>
+          <w:tcPr/>
+          <w:p>
+            <w:pPr>
+              <w:pStyle w:val="Compact"/>
+              <w:keepNext/>
+              <w:jc w:val="left"/>
+            </w:pPr>
+            <w:r>
+              <w:t xml:space="preserve">Tables 7–9</w:t>
+            </w:r>
+          </w:p>
+        </w:tc>
+      </w:tr>
+      <w:tr>
+        <w:trPr>
+          <w:cantSplit/>
+        </w:trPr>
+        <w:tc>
+          <w:tcPr/>
+          <w:p>
+            <w:pPr>
+              <w:pStyle w:val="Compact"/>
+              <w:jc w:val="left"/>
+            </w:pPr>
+            <w:r>
+              <w:t xml:space="preserve">6. Evaluation</w:t>
+            </w:r>
+          </w:p>
+        </w:tc>
+        <w:tc>
+          <w:tcPr/>
+          <w:p>
+            <w:pPr>
+              <w:pStyle w:val="Compact"/>
+              <w:jc w:val="left"/>
+            </w:pPr>
+            <w:r>
+              <w:t xml:space="preserve">Compare the measured trade-off with the literature</w:t>
+            </w:r>
+          </w:p>
+        </w:tc>
+        <w:tc>
+          <w:tcPr/>
+          <w:p>
+            <w:pPr>
+              <w:pStyle w:val="Compact"/>
+              <w:jc w:val="left"/>
+            </w:pPr>
+            <w:r>
+              <w:t xml:space="preserve">Part C</w:t>
+            </w:r>
+          </w:p>
+        </w:tc>
+      </w:tr>
+    </w:tbl>
+    <w:p>
+      <w:pPr>
+        <w:pStyle w:val="BodyText"/>
+        <w:spacing w:before="160"/>
+      </w:pPr>
+      <w:r>
+        <w:t xml:space="preserve">Every expected outcome in this part comes from tracing packets through the rules by hand; it is checked against what Packet Tracer actually shows in phase 5.</w:t>
+      </w:r>
+    </w:p>
+    <w:bookmarkEnd w:id="35"/>
+    <w:bookmarkStart w:id="36" w:name="b3.-requirements-analysis"/>
+    <w:p>
+      <w:pPr>
+        <w:pStyle w:val="Heading2"/>
+      </w:pPr>
+      <w:r>
+        <w:t xml:space="preserve">B3. Requirements Analysis</w:t>
+      </w:r>
+    </w:p>
+    <w:p>
+      <w:pPr>
+        <w:pStyle w:val="FirstParagraph"/>
+      </w:pPr>
+      <w:r>
+        <w:t xml:space="preserve">We wrote down which flows the organisation needs, and which it must not have, before writing any ACL. The devices named here are described in B4. Every Stage 2 and Stage 3 rule traces back to one of the requirements in Table 2, and</w:t>
+      </w:r>
+      <w:r>
+        <w:t xml:space="preserve"> </w:t>
+      </w:r>
+      <w:r>
+        <w:t xml:space="preserve">“</w:t>
+      </w:r>
+      <w:r>
+        <w:t xml:space="preserve">unnecessary access</w:t>
+      </w:r>
+      <w:r>
+        <w:t xml:space="preserve">”</w:t>
+      </w:r>
+      <w:r>
+        <w:t xml:space="preserve"> </w:t>
+      </w:r>
+      <w:r>
+        <w:t xml:space="preserve">in our results means a flow in the forbidden (X) rows that the policy nevertheless allows.</w:t>
       </w:r>
     </w:p>
     <w:p>
@@ -3665,7 +4030,1151 @@
           <w:bCs/>
           <w:b/>
         </w:rPr>
-        <w:t xml:space="preserve">Table 2. Device inventory</w:t>
+        <w:t xml:space="preserve">Table 2. Required (R) and forbidden (X) flows</w:t>
+      </w:r>
+    </w:p>
+    <w:tbl>
+      <w:tblPr>
+        <w:tblStyle w:val="Table"/>
+        <w:tblW w:type="pct" w:w="5000"/>
+        <w:jc w:val="left"/>
+        <w:tblLook w:firstRow="1" w:lastRow="0" w:firstColumn="0" w:lastColumn="0" w:noHBand="0" w:noVBand="0" w:val="0020"/>
+      </w:tblPr>
+      <w:tblGrid>
+        <w:gridCol w:w="465"/>
+        <w:gridCol w:w="3028"/>
+        <w:gridCol w:w="2096"/>
+        <w:gridCol w:w="2329"/>
+      </w:tblGrid>
+      <w:tr>
+        <w:trPr>
+          <w:cantSplit/>
+          <w:tblHeader/>
+        </w:trPr>
+        <w:tc>
+          <w:tcPr/>
+          <w:p>
+            <w:pPr>
+              <w:pStyle w:val="Compact"/>
+              <w:keepNext/>
+              <w:jc w:val="left"/>
+            </w:pPr>
+            <w:r>
+              <w:rPr>
+                <w:b/>
+              </w:rPr>
+              <w:t xml:space="preserve">ID</w:t>
+            </w:r>
+          </w:p>
+        </w:tc>
+        <w:tc>
+          <w:tcPr/>
+          <w:p>
+            <w:pPr>
+              <w:pStyle w:val="Compact"/>
+              <w:keepNext/>
+              <w:jc w:val="left"/>
+            </w:pPr>
+            <w:r>
+              <w:rPr>
+                <w:b/>
+              </w:rPr>
+              <w:t xml:space="preserve">Source → Destination</w:t>
+            </w:r>
+          </w:p>
+        </w:tc>
+        <w:tc>
+          <w:tcPr/>
+          <w:p>
+            <w:pPr>
+              <w:pStyle w:val="Compact"/>
+              <w:keepNext/>
+              <w:jc w:val="left"/>
+            </w:pPr>
+            <w:r>
+              <w:rPr>
+                <w:b/>
+              </w:rPr>
+              <w:t xml:space="preserve">Service</w:t>
+            </w:r>
+          </w:p>
+        </w:tc>
+        <w:tc>
+          <w:tcPr/>
+          <w:p>
+            <w:pPr>
+              <w:pStyle w:val="Compact"/>
+              <w:keepNext/>
+              <w:jc w:val="left"/>
+            </w:pPr>
+            <w:r>
+              <w:rPr>
+                <w:b/>
+              </w:rPr>
+              <w:t xml:space="preserve">Type</w:t>
+            </w:r>
+          </w:p>
+        </w:tc>
+      </w:tr>
+      <w:tr>
+        <w:trPr>
+          <w:cantSplit/>
+        </w:trPr>
+        <w:tc>
+          <w:tcPr/>
+          <w:p>
+            <w:pPr>
+              <w:pStyle w:val="Compact"/>
+              <w:keepNext/>
+              <w:jc w:val="left"/>
+            </w:pPr>
+            <w:r>
+              <w:t xml:space="preserve">R1</w:t>
+            </w:r>
+          </w:p>
+        </w:tc>
+        <w:tc>
+          <w:tcPr/>
+          <w:p>
+            <w:pPr>
+              <w:pStyle w:val="Compact"/>
+              <w:keepNext/>
+              <w:jc w:val="left"/>
+            </w:pPr>
+            <w:r>
+              <w:t xml:space="preserve">All departments → DNS-SRV</w:t>
+            </w:r>
+          </w:p>
+        </w:tc>
+        <w:tc>
+          <w:tcPr/>
+          <w:p>
+            <w:pPr>
+              <w:pStyle w:val="Compact"/>
+              <w:keepNext/>
+              <w:jc w:val="left"/>
+            </w:pPr>
+            <w:r>
+              <w:t xml:space="preserve">DNS (UDP 53)</w:t>
+            </w:r>
+          </w:p>
+        </w:tc>
+        <w:tc>
+          <w:tcPr/>
+          <w:p>
+            <w:pPr>
+              <w:pStyle w:val="Compact"/>
+              <w:keepNext/>
+              <w:jc w:val="left"/>
+            </w:pPr>
+            <w:r>
+              <w:t xml:space="preserve">Required</w:t>
+            </w:r>
+          </w:p>
+        </w:tc>
+      </w:tr>
+      <w:tr>
+        <w:trPr>
+          <w:cantSplit/>
+        </w:trPr>
+        <w:tc>
+          <w:tcPr/>
+          <w:p>
+            <w:pPr>
+              <w:pStyle w:val="Compact"/>
+              <w:keepNext/>
+              <w:jc w:val="left"/>
+            </w:pPr>
+            <w:r>
+              <w:t xml:space="preserve">R2</w:t>
+            </w:r>
+          </w:p>
+        </w:tc>
+        <w:tc>
+          <w:tcPr/>
+          <w:p>
+            <w:pPr>
+              <w:pStyle w:val="Compact"/>
+              <w:keepNext/>
+              <w:jc w:val="left"/>
+            </w:pPr>
+            <w:r>
+              <w:t xml:space="preserve">All departments → WEB-SRV</w:t>
+            </w:r>
+          </w:p>
+        </w:tc>
+        <w:tc>
+          <w:tcPr/>
+          <w:p>
+            <w:pPr>
+              <w:pStyle w:val="Compact"/>
+              <w:keepNext/>
+              <w:jc w:val="left"/>
+            </w:pPr>
+            <w:r>
+              <w:t xml:space="preserve">HTTP/HTTPS</w:t>
+            </w:r>
+          </w:p>
+        </w:tc>
+        <w:tc>
+          <w:tcPr/>
+          <w:p>
+            <w:pPr>
+              <w:pStyle w:val="Compact"/>
+              <w:keepNext/>
+              <w:jc w:val="left"/>
+            </w:pPr>
+            <w:r>
+              <w:t xml:space="preserve">Required</w:t>
+            </w:r>
+          </w:p>
+        </w:tc>
+      </w:tr>
+      <w:tr>
+        <w:trPr>
+          <w:cantSplit/>
+        </w:trPr>
+        <w:tc>
+          <w:tcPr/>
+          <w:p>
+            <w:pPr>
+              <w:pStyle w:val="Compact"/>
+              <w:keepNext/>
+              <w:jc w:val="left"/>
+            </w:pPr>
+            <w:r>
+              <w:t xml:space="preserve">R3</w:t>
+            </w:r>
+          </w:p>
+        </w:tc>
+        <w:tc>
+          <w:tcPr/>
+          <w:p>
+            <w:pPr>
+              <w:pStyle w:val="Compact"/>
+              <w:keepNext/>
+              <w:jc w:val="left"/>
+            </w:pPr>
+            <w:r>
+              <w:t xml:space="preserve">HR → HR-SRV</w:t>
+            </w:r>
+          </w:p>
+        </w:tc>
+        <w:tc>
+          <w:tcPr/>
+          <w:p>
+            <w:pPr>
+              <w:pStyle w:val="Compact"/>
+              <w:keepNext/>
+              <w:jc w:val="left"/>
+            </w:pPr>
+            <w:r>
+              <w:t xml:space="preserve">HTTPS</w:t>
+            </w:r>
+          </w:p>
+        </w:tc>
+        <w:tc>
+          <w:tcPr/>
+          <w:p>
+            <w:pPr>
+              <w:pStyle w:val="Compact"/>
+              <w:keepNext/>
+              <w:jc w:val="left"/>
+            </w:pPr>
+            <w:r>
+              <w:t xml:space="preserve">Required</w:t>
+            </w:r>
+          </w:p>
+        </w:tc>
+      </w:tr>
+      <w:tr>
+        <w:trPr>
+          <w:cantSplit/>
+        </w:trPr>
+        <w:tc>
+          <w:tcPr/>
+          <w:p>
+            <w:pPr>
+              <w:pStyle w:val="Compact"/>
+              <w:keepNext/>
+              <w:jc w:val="left"/>
+            </w:pPr>
+            <w:r>
+              <w:t xml:space="preserve">R4</w:t>
+            </w:r>
+          </w:p>
+        </w:tc>
+        <w:tc>
+          <w:tcPr/>
+          <w:p>
+            <w:pPr>
+              <w:pStyle w:val="Compact"/>
+              <w:keepNext/>
+              <w:jc w:val="left"/>
+            </w:pPr>
+            <w:r>
+              <w:t xml:space="preserve">Finance → FIN-SRV</w:t>
+            </w:r>
+          </w:p>
+        </w:tc>
+        <w:tc>
+          <w:tcPr/>
+          <w:p>
+            <w:pPr>
+              <w:pStyle w:val="Compact"/>
+              <w:keepNext/>
+              <w:jc w:val="left"/>
+            </w:pPr>
+            <w:r>
+              <w:t xml:space="preserve">FTP (control: TCP 21)</w:t>
+            </w:r>
+          </w:p>
+        </w:tc>
+        <w:tc>
+          <w:tcPr/>
+          <w:p>
+            <w:pPr>
+              <w:pStyle w:val="Compact"/>
+              <w:keepNext/>
+              <w:jc w:val="left"/>
+            </w:pPr>
+            <w:r>
+              <w:t xml:space="preserve">Required</w:t>
+            </w:r>
+          </w:p>
+        </w:tc>
+      </w:tr>
+      <w:tr>
+        <w:trPr>
+          <w:cantSplit/>
+        </w:trPr>
+        <w:tc>
+          <w:tcPr/>
+          <w:p>
+            <w:pPr>
+              <w:pStyle w:val="Compact"/>
+              <w:keepNext/>
+              <w:jc w:val="left"/>
+            </w:pPr>
+            <w:r>
+              <w:t xml:space="preserve">R5</w:t>
+            </w:r>
+          </w:p>
+        </w:tc>
+        <w:tc>
+          <w:tcPr/>
+          <w:p>
+            <w:pPr>
+              <w:pStyle w:val="Compact"/>
+              <w:keepNext/>
+              <w:jc w:val="left"/>
+            </w:pPr>
+            <w:r>
+              <w:t xml:space="preserve">IT → R-CORE, R-EDGE</w:t>
+            </w:r>
+          </w:p>
+        </w:tc>
+        <w:tc>
+          <w:tcPr/>
+          <w:p>
+            <w:pPr>
+              <w:pStyle w:val="Compact"/>
+              <w:keepNext/>
+              <w:jc w:val="left"/>
+            </w:pPr>
+            <w:r>
+              <w:t xml:space="preserve">SSH</w:t>
+            </w:r>
+          </w:p>
+        </w:tc>
+        <w:tc>
+          <w:tcPr/>
+          <w:p>
+            <w:pPr>
+              <w:pStyle w:val="Compact"/>
+              <w:keepNext/>
+              <w:jc w:val="left"/>
+            </w:pPr>
+            <w:r>
+              <w:t xml:space="preserve">Required</w:t>
+            </w:r>
+          </w:p>
+        </w:tc>
+      </w:tr>
+      <w:tr>
+        <w:trPr>
+          <w:cantSplit/>
+        </w:trPr>
+        <w:tc>
+          <w:tcPr/>
+          <w:p>
+            <w:pPr>
+              <w:pStyle w:val="Compact"/>
+              <w:keepNext/>
+              <w:jc w:val="left"/>
+            </w:pPr>
+            <w:r>
+              <w:t xml:space="preserve">R6</w:t>
+            </w:r>
+          </w:p>
+        </w:tc>
+        <w:tc>
+          <w:tcPr/>
+          <w:p>
+            <w:pPr>
+              <w:pStyle w:val="Compact"/>
+              <w:keepNext/>
+              <w:jc w:val="left"/>
+            </w:pPr>
+            <w:r>
+              <w:t xml:space="preserve">IT → servers</w:t>
+            </w:r>
+          </w:p>
+        </w:tc>
+        <w:tc>
+          <w:tcPr/>
+          <w:p>
+            <w:pPr>
+              <w:pStyle w:val="Compact"/>
+              <w:keepNext/>
+              <w:jc w:val="left"/>
+            </w:pPr>
+            <w:r>
+              <w:t xml:space="preserve">ICMP echo</w:t>
+            </w:r>
+          </w:p>
+        </w:tc>
+        <w:tc>
+          <w:tcPr/>
+          <w:p>
+            <w:pPr>
+              <w:pStyle w:val="Compact"/>
+              <w:keepNext/>
+              <w:jc w:val="left"/>
+            </w:pPr>
+            <w:r>
+              <w:t xml:space="preserve">Required</w:t>
+            </w:r>
+          </w:p>
+        </w:tc>
+      </w:tr>
+      <w:tr>
+        <w:trPr>
+          <w:cantSplit/>
+        </w:trPr>
+        <w:tc>
+          <w:tcPr/>
+          <w:p>
+            <w:pPr>
+              <w:pStyle w:val="Compact"/>
+              <w:keepNext/>
+              <w:jc w:val="left"/>
+            </w:pPr>
+            <w:r>
+              <w:t xml:space="preserve">R7</w:t>
+            </w:r>
+          </w:p>
+        </w:tc>
+        <w:tc>
+          <w:tcPr/>
+          <w:p>
+            <w:pPr>
+              <w:pStyle w:val="Compact"/>
+              <w:keepNext/>
+              <w:jc w:val="left"/>
+            </w:pPr>
+            <w:r>
+              <w:t xml:space="preserve">All departments → external web</w:t>
+            </w:r>
+          </w:p>
+        </w:tc>
+        <w:tc>
+          <w:tcPr/>
+          <w:p>
+            <w:pPr>
+              <w:pStyle w:val="Compact"/>
+              <w:keepNext/>
+              <w:jc w:val="left"/>
+            </w:pPr>
+            <w:r>
+              <w:t xml:space="preserve">HTTP/HTTPS</w:t>
+            </w:r>
+          </w:p>
+        </w:tc>
+        <w:tc>
+          <w:tcPr/>
+          <w:p>
+            <w:pPr>
+              <w:pStyle w:val="Compact"/>
+              <w:keepNext/>
+              <w:jc w:val="left"/>
+            </w:pPr>
+            <w:r>
+              <w:t xml:space="preserve">Required</w:t>
+            </w:r>
+          </w:p>
+        </w:tc>
+      </w:tr>
+      <w:tr>
+        <w:trPr>
+          <w:cantSplit/>
+        </w:trPr>
+        <w:tc>
+          <w:tcPr/>
+          <w:p>
+            <w:pPr>
+              <w:pStyle w:val="Compact"/>
+              <w:keepNext/>
+              <w:jc w:val="left"/>
+            </w:pPr>
+            <w:r>
+              <w:t xml:space="preserve">R8</w:t>
+            </w:r>
+          </w:p>
+        </w:tc>
+        <w:tc>
+          <w:tcPr/>
+          <w:p>
+            <w:pPr>
+              <w:pStyle w:val="Compact"/>
+              <w:keepNext/>
+              <w:jc w:val="left"/>
+            </w:pPr>
+            <w:r>
+              <w:t xml:space="preserve">External → WEB-SRV</w:t>
+            </w:r>
+          </w:p>
+        </w:tc>
+        <w:tc>
+          <w:tcPr/>
+          <w:p>
+            <w:pPr>
+              <w:pStyle w:val="Compact"/>
+              <w:keepNext/>
+              <w:jc w:val="left"/>
+            </w:pPr>
+            <w:r>
+              <w:t xml:space="preserve">HTTP/HTTPS</w:t>
+            </w:r>
+          </w:p>
+        </w:tc>
+        <w:tc>
+          <w:tcPr/>
+          <w:p>
+            <w:pPr>
+              <w:pStyle w:val="Compact"/>
+              <w:keepNext/>
+              <w:jc w:val="left"/>
+            </w:pPr>
+            <w:r>
+              <w:t xml:space="preserve">Required</w:t>
+            </w:r>
+          </w:p>
+        </w:tc>
+      </w:tr>
+      <w:tr>
+        <w:trPr>
+          <w:cantSplit/>
+        </w:trPr>
+        <w:tc>
+          <w:tcPr/>
+          <w:p>
+            <w:pPr>
+              <w:pStyle w:val="Compact"/>
+              <w:keepNext/>
+              <w:jc w:val="left"/>
+            </w:pPr>
+            <w:r>
+              <w:t xml:space="preserve">X1</w:t>
+            </w:r>
+          </w:p>
+        </w:tc>
+        <w:tc>
+          <w:tcPr/>
+          <w:p>
+            <w:pPr>
+              <w:pStyle w:val="Compact"/>
+              <w:keepNext/>
+              <w:jc w:val="left"/>
+            </w:pPr>
+            <w:r>
+              <w:t xml:space="preserve">Department → other department</w:t>
+            </w:r>
+          </w:p>
+        </w:tc>
+        <w:tc>
+          <w:tcPr/>
+          <w:p>
+            <w:pPr>
+              <w:pStyle w:val="Compact"/>
+              <w:keepNext/>
+              <w:jc w:val="left"/>
+            </w:pPr>
+            <w:r>
+              <w:t xml:space="preserve">Any</w:t>
+            </w:r>
+          </w:p>
+        </w:tc>
+        <w:tc>
+          <w:tcPr/>
+          <w:p>
+            <w:pPr>
+              <w:pStyle w:val="Compact"/>
+              <w:keepNext/>
+              <w:jc w:val="left"/>
+            </w:pPr>
+            <w:r>
+              <w:t xml:space="preserve">Forbidden</w:t>
+            </w:r>
+          </w:p>
+        </w:tc>
+      </w:tr>
+      <w:tr>
+        <w:trPr>
+          <w:cantSplit/>
+        </w:trPr>
+        <w:tc>
+          <w:tcPr/>
+          <w:p>
+            <w:pPr>
+              <w:pStyle w:val="Compact"/>
+              <w:keepNext/>
+              <w:jc w:val="left"/>
+            </w:pPr>
+            <w:r>
+              <w:t xml:space="preserve">X2</w:t>
+            </w:r>
+          </w:p>
+        </w:tc>
+        <w:tc>
+          <w:tcPr/>
+          <w:p>
+            <w:pPr>
+              <w:pStyle w:val="Compact"/>
+              <w:keepNext/>
+              <w:jc w:val="left"/>
+            </w:pPr>
+            <w:r>
+              <w:t xml:space="preserve">Non-HR → HR-SRV</w:t>
+            </w:r>
+          </w:p>
+        </w:tc>
+        <w:tc>
+          <w:tcPr/>
+          <w:p>
+            <w:pPr>
+              <w:pStyle w:val="Compact"/>
+              <w:keepNext/>
+              <w:jc w:val="left"/>
+            </w:pPr>
+            <w:r>
+              <w:t xml:space="preserve">Any</w:t>
+            </w:r>
+          </w:p>
+        </w:tc>
+        <w:tc>
+          <w:tcPr/>
+          <w:p>
+            <w:pPr>
+              <w:pStyle w:val="Compact"/>
+              <w:keepNext/>
+              <w:jc w:val="left"/>
+            </w:pPr>
+            <w:r>
+              <w:t xml:space="preserve">Forbidden</w:t>
+            </w:r>
+          </w:p>
+        </w:tc>
+      </w:tr>
+      <w:tr>
+        <w:trPr>
+          <w:cantSplit/>
+        </w:trPr>
+        <w:tc>
+          <w:tcPr/>
+          <w:p>
+            <w:pPr>
+              <w:pStyle w:val="Compact"/>
+              <w:keepNext/>
+              <w:jc w:val="left"/>
+            </w:pPr>
+            <w:r>
+              <w:t xml:space="preserve">X3</w:t>
+            </w:r>
+          </w:p>
+        </w:tc>
+        <w:tc>
+          <w:tcPr/>
+          <w:p>
+            <w:pPr>
+              <w:pStyle w:val="Compact"/>
+              <w:keepNext/>
+              <w:jc w:val="left"/>
+            </w:pPr>
+            <w:r>
+              <w:t xml:space="preserve">Non-Finance → FIN-SRV</w:t>
+            </w:r>
+          </w:p>
+        </w:tc>
+        <w:tc>
+          <w:tcPr/>
+          <w:p>
+            <w:pPr>
+              <w:pStyle w:val="Compact"/>
+              <w:keepNext/>
+              <w:jc w:val="left"/>
+            </w:pPr>
+            <w:r>
+              <w:t xml:space="preserve">Any</w:t>
+            </w:r>
+          </w:p>
+        </w:tc>
+        <w:tc>
+          <w:tcPr/>
+          <w:p>
+            <w:pPr>
+              <w:pStyle w:val="Compact"/>
+              <w:keepNext/>
+              <w:jc w:val="left"/>
+            </w:pPr>
+            <w:r>
+              <w:t xml:space="preserve">Forbidden</w:t>
+            </w:r>
+          </w:p>
+        </w:tc>
+      </w:tr>
+      <w:tr>
+        <w:trPr>
+          <w:cantSplit/>
+        </w:trPr>
+        <w:tc>
+          <w:tcPr/>
+          <w:p>
+            <w:pPr>
+              <w:pStyle w:val="Compact"/>
+              <w:keepNext/>
+              <w:jc w:val="left"/>
+            </w:pPr>
+            <w:r>
+              <w:t xml:space="preserve">X4</w:t>
+            </w:r>
+          </w:p>
+        </w:tc>
+        <w:tc>
+          <w:tcPr/>
+          <w:p>
+            <w:pPr>
+              <w:pStyle w:val="Compact"/>
+              <w:keepNext/>
+              <w:jc w:val="left"/>
+            </w:pPr>
+            <w:r>
+              <w:t xml:space="preserve">Non-IT → router management</w:t>
+            </w:r>
+          </w:p>
+        </w:tc>
+        <w:tc>
+          <w:tcPr/>
+          <w:p>
+            <w:pPr>
+              <w:pStyle w:val="Compact"/>
+              <w:keepNext/>
+              <w:jc w:val="left"/>
+            </w:pPr>
+            <w:r>
+              <w:t xml:space="preserve">SSH/Telnet</w:t>
+            </w:r>
+          </w:p>
+        </w:tc>
+        <w:tc>
+          <w:tcPr/>
+          <w:p>
+            <w:pPr>
+              <w:pStyle w:val="Compact"/>
+              <w:keepNext/>
+              <w:jc w:val="left"/>
+            </w:pPr>
+            <w:r>
+              <w:t xml:space="preserve">Forbidden</w:t>
+            </w:r>
+          </w:p>
+        </w:tc>
+      </w:tr>
+      <w:tr>
+        <w:trPr>
+          <w:cantSplit/>
+        </w:trPr>
+        <w:tc>
+          <w:tcPr/>
+          <w:p>
+            <w:pPr>
+              <w:pStyle w:val="Compact"/>
+              <w:keepNext/>
+              <w:jc w:val="left"/>
+            </w:pPr>
+            <w:r>
+              <w:t xml:space="preserve">X5</w:t>
+            </w:r>
+          </w:p>
+        </w:tc>
+        <w:tc>
+          <w:tcPr/>
+          <w:p>
+            <w:pPr>
+              <w:pStyle w:val="Compact"/>
+              <w:keepNext/>
+              <w:jc w:val="left"/>
+            </w:pPr>
+            <w:r>
+              <w:t xml:space="preserve">Anyone → routers</w:t>
+            </w:r>
+          </w:p>
+        </w:tc>
+        <w:tc>
+          <w:tcPr/>
+          <w:p>
+            <w:pPr>
+              <w:pStyle w:val="Compact"/>
+              <w:keepNext/>
+              <w:jc w:val="left"/>
+            </w:pPr>
+            <w:r>
+              <w:t xml:space="preserve">Telnet</w:t>
+            </w:r>
+          </w:p>
+        </w:tc>
+        <w:tc>
+          <w:tcPr/>
+          <w:p>
+            <w:pPr>
+              <w:pStyle w:val="Compact"/>
+              <w:keepNext/>
+              <w:jc w:val="left"/>
+            </w:pPr>
+            <w:r>
+              <w:t xml:space="preserve">Forbidden</w:t>
+            </w:r>
+          </w:p>
+        </w:tc>
+      </w:tr>
+      <w:tr>
+        <w:trPr>
+          <w:cantSplit/>
+        </w:trPr>
+        <w:tc>
+          <w:tcPr/>
+          <w:p>
+            <w:pPr>
+              <w:pStyle w:val="Compact"/>
+              <w:keepNext/>
+              <w:jc w:val="left"/>
+            </w:pPr>
+            <w:r>
+              <w:t xml:space="preserve">X6</w:t>
+            </w:r>
+          </w:p>
+        </w:tc>
+        <w:tc>
+          <w:tcPr/>
+          <w:p>
+            <w:pPr>
+              <w:pStyle w:val="Compact"/>
+              <w:keepNext/>
+              <w:jc w:val="left"/>
+            </w:pPr>
+            <w:r>
+              <w:t xml:space="preserve">Non-IT → servers</w:t>
+            </w:r>
+          </w:p>
+        </w:tc>
+        <w:tc>
+          <w:tcPr/>
+          <w:p>
+            <w:pPr>
+              <w:pStyle w:val="Compact"/>
+              <w:keepNext/>
+              <w:jc w:val="left"/>
+            </w:pPr>
+            <w:r>
+              <w:t xml:space="preserve">ICMP and unused ports</w:t>
+            </w:r>
+          </w:p>
+        </w:tc>
+        <w:tc>
+          <w:tcPr/>
+          <w:p>
+            <w:pPr>
+              <w:pStyle w:val="Compact"/>
+              <w:keepNext/>
+              <w:jc w:val="left"/>
+            </w:pPr>
+            <w:r>
+              <w:t xml:space="preserve">Forbidden</w:t>
+            </w:r>
+          </w:p>
+        </w:tc>
+      </w:tr>
+      <w:tr>
+        <w:trPr>
+          <w:cantSplit/>
+        </w:trPr>
+        <w:tc>
+          <w:tcPr/>
+          <w:p>
+            <w:pPr>
+              <w:pStyle w:val="Compact"/>
+              <w:keepNext/>
+              <w:jc w:val="left"/>
+            </w:pPr>
+            <w:r>
+              <w:t xml:space="preserve">X7</w:t>
+            </w:r>
+          </w:p>
+        </w:tc>
+        <w:tc>
+          <w:tcPr/>
+          <w:p>
+            <w:pPr>
+              <w:pStyle w:val="Compact"/>
+              <w:keepNext/>
+              <w:jc w:val="left"/>
+            </w:pPr>
+            <w:r>
+              <w:t xml:space="preserve">External → anything except R8</w:t>
+            </w:r>
+          </w:p>
+        </w:tc>
+        <w:tc>
+          <w:tcPr/>
+          <w:p>
+            <w:pPr>
+              <w:pStyle w:val="Compact"/>
+              <w:keepNext/>
+              <w:jc w:val="left"/>
+            </w:pPr>
+            <w:r>
+              <w:t xml:space="preserve">Any</w:t>
+            </w:r>
+          </w:p>
+        </w:tc>
+        <w:tc>
+          <w:tcPr/>
+          <w:p>
+            <w:pPr>
+              <w:pStyle w:val="Compact"/>
+              <w:keepNext/>
+              <w:jc w:val="left"/>
+            </w:pPr>
+            <w:r>
+              <w:t xml:space="preserve">Forbidden</w:t>
+            </w:r>
+          </w:p>
+        </w:tc>
+      </w:tr>
+      <w:tr>
+        <w:trPr>
+          <w:cantSplit/>
+        </w:trPr>
+        <w:tc>
+          <w:tcPr/>
+          <w:p>
+            <w:pPr>
+              <w:pStyle w:val="Compact"/>
+              <w:jc w:val="left"/>
+            </w:pPr>
+            <w:r>
+              <w:t xml:space="preserve">U1</w:t>
+            </w:r>
+          </w:p>
+        </w:tc>
+        <w:tc>
+          <w:tcPr/>
+          <w:p>
+            <w:pPr>
+              <w:pStyle w:val="Compact"/>
+              <w:jc w:val="left"/>
+            </w:pPr>
+            <w:r>
+              <w:t xml:space="preserve">PC ↔ PC in the same VLAN</w:t>
+            </w:r>
+          </w:p>
+        </w:tc>
+        <w:tc>
+          <w:tcPr/>
+          <w:p>
+            <w:pPr>
+              <w:pStyle w:val="Compact"/>
+              <w:jc w:val="left"/>
+            </w:pPr>
+            <w:r>
+              <w:t xml:space="preserve">Any</w:t>
+            </w:r>
+          </w:p>
+        </w:tc>
+        <w:tc>
+          <w:tcPr/>
+          <w:p>
+            <w:pPr>
+              <w:pStyle w:val="Compact"/>
+              <w:jc w:val="left"/>
+            </w:pPr>
+            <w:r>
+              <w:t xml:space="preserve">Not filterable by a router ACL (Layer 2 only)</w:t>
+            </w:r>
+          </w:p>
+        </w:tc>
+      </w:tr>
+    </w:tbl>
+    <w:p>
+      <w:pPr>
+        <w:pStyle w:val="BodyText"/>
+        <w:spacing w:before="160"/>
+      </w:pPr>
+      <w:r>
+        <w:t xml:space="preserve">Packet Tracer servers do not offer a database service, so we represent the finance records system with FTP (R4). FTP is only a proxy. It shows how a service that opens a separate data connection interacts with port-based rules; it says nothing about how a real database protocol behaves. Part C discusses what this substitution leaves out.</w:t>
+      </w:r>
+    </w:p>
+    <w:bookmarkEnd w:id="36"/>
+    <w:bookmarkStart w:id="37" w:name="b4.-network-design"/>
+    <w:p>
+      <w:pPr>
+        <w:pStyle w:val="Heading2"/>
+      </w:pPr>
+      <w:r>
+        <w:t xml:space="preserve">B4. Network Design</w:t>
+      </w:r>
+    </w:p>
+    <w:p>
+      <w:pPr>
+        <w:pStyle w:val="FirstParagraph"/>
+      </w:pPr>
+      <w:r>
+        <w:t xml:space="preserve">We designed a 19-device network with four departments, a server zone and a small simulated</w:t>
+      </w:r>
+      <w:r>
+        <w:t xml:space="preserve"> </w:t>
+      </w:r>
+      <w:r>
+        <w:t xml:space="preserve">“</w:t>
+      </w:r>
+      <w:r>
+        <w:t xml:space="preserve">Internet</w:t>
+      </w:r>
+      <w:r>
+        <w:t xml:space="preserve">”</w:t>
+      </w:r>
+      <w:r>
+        <w:t xml:space="preserve">. It is large enough for policy to grow in interesting ways, but small enough to build and test by hand.</w:t>
+      </w:r>
+    </w:p>
+    <w:p>
+      <w:pPr>
+        <w:pStyle w:val="Compact"/>
+        <w:numPr>
+          <w:ilvl w:val="0"/>
+          <w:numId w:val="1006"/>
+        </w:numPr>
+      </w:pPr>
+      <w:r>
+        <w:rPr>
+          <w:bCs/>
+          <w:b/>
+        </w:rPr>
+        <w:t xml:space="preserve">R-CORE</w:t>
+      </w:r>
+      <w:r>
+        <w:t xml:space="preserve"> </w:t>
+      </w:r>
+      <w:r>
+        <w:t xml:space="preserve">routes between the department VLANs (router-on-a-stick) and holds all internal ACLs. We chose a router rather than a multilayer switch because IOS routers in Packet Tracer support extended ACLs and VTY access control fully, and because putting every internal policy decision on one device makes the rules easy to count and audit. The price is a single point of failure, which we accept as a simplification.</w:t>
+      </w:r>
+    </w:p>
+    <w:p>
+      <w:pPr>
+        <w:pStyle w:val="Compact"/>
+        <w:numPr>
+          <w:ilvl w:val="0"/>
+          <w:numId w:val="1006"/>
+        </w:numPr>
+      </w:pPr>
+      <w:r>
+        <w:rPr>
+          <w:bCs/>
+          <w:b/>
+        </w:rPr>
+        <w:t xml:space="preserve">R-EDGE</w:t>
+      </w:r>
+      <w:r>
+        <w:t xml:space="preserve"> </w:t>
+      </w:r>
+      <w:r>
+        <w:t xml:space="preserve">connects the external network and holds the edge ACL. Without it we could not show perimeter filtering, which is where the topic starts.</w:t>
+      </w:r>
+    </w:p>
+    <w:p>
+      <w:pPr>
+        <w:pStyle w:val="Compact"/>
+        <w:numPr>
+          <w:ilvl w:val="0"/>
+          <w:numId w:val="1006"/>
+        </w:numPr>
+      </w:pPr>
+      <w:r>
+        <w:rPr>
+          <w:bCs/>
+          <w:b/>
+        </w:rPr>
+        <w:t xml:space="preserve">External addresses</w:t>
+      </w:r>
+      <w:r>
+        <w:t xml:space="preserve"> </w:t>
+      </w:r>
+      <w:r>
+        <w:t xml:space="preserve">use the RFC 5737 documentation range 203.0.113.0/24 [18], so the simulated Internet does not use real public addresses.</w:t>
+      </w:r>
+    </w:p>
+    <w:p>
+      <w:pPr>
+        <w:pStyle w:val="Compact"/>
+        <w:numPr>
+          <w:ilvl w:val="0"/>
+          <w:numId w:val="1006"/>
+        </w:numPr>
+        <w:spacing w:after="140"/>
+      </w:pPr>
+      <w:r>
+        <w:rPr>
+          <w:bCs/>
+          <w:b/>
+        </w:rPr>
+        <w:t xml:space="preserve">Two PCs per department</w:t>
+      </w:r>
+      <w:r>
+        <w:t xml:space="preserve"> </w:t>
+      </w:r>
+      <w:r>
+        <w:t xml:space="preserve">let us test traffic inside a VLAN, which never reaches the router and so cannot be filtered by a router ACL.</w:t>
+      </w:r>
+    </w:p>
+    <w:p>
+      <w:pPr>
+        <w:pStyle w:val="FirstParagraph"/>
+      </w:pPr>
+      <w:r>
+        <w:t xml:space="preserve">Routing is static and there is no NAT, which keeps external tests readable; Part C discusses what this leaves out.</w:t>
+      </w:r>
+    </w:p>
+    <w:p>
+      <w:pPr>
+        <w:pStyle w:val="BodyText"/>
+        <w:keepNext/>
+      </w:pPr>
+      <w:r>
+        <w:rPr>
+          <w:bCs/>
+          <w:b/>
+        </w:rPr>
+        <w:t xml:space="preserve">Table 3. Device inventory</w:t>
       </w:r>
     </w:p>
     <w:tbl>
@@ -4007,7 +5516,7 @@
           <w:bCs/>
           <w:b/>
         </w:rPr>
-        <w:t xml:space="preserve">Table 3. VLAN and addressing plan</w:t>
+        <w:t xml:space="preserve">Table 4. VLAN and addressing plan</w:t>
       </w:r>
     </w:p>
     <w:tbl>
@@ -4521,1064 +6030,14 @@
         <w:t xml:space="preserve">[PLACEHOLDER: Figure F01, topology screenshot.]</w:t>
       </w:r>
     </w:p>
-    <w:bookmarkEnd w:id="35"/>
-    <w:bookmarkStart w:id="36" w:name="b3.-communication-requirements"/>
+    <w:bookmarkEnd w:id="37"/>
+    <w:bookmarkStart w:id="38" w:name="X58f26ca0c760d2c91008adc2fb95ca2331fe3d9"/>
     <w:p>
       <w:pPr>
         <w:pStyle w:val="Heading2"/>
       </w:pPr>
       <w:r>
-        <w:t xml:space="preserve">B3. Communication Requirements</w:t>
-      </w:r>
-    </w:p>
-    <w:p>
-      <w:pPr>
-        <w:pStyle w:val="FirstParagraph"/>
-      </w:pPr>
-      <w:r>
-        <w:t xml:space="preserve">We wrote down which flows the organisation needs, and which it must not have, before writing any ACL. Every Stage 2 and Stage 3 rule traces back to one of the requirements in Table 4, and</w:t>
-      </w:r>
-      <w:r>
-        <w:t xml:space="preserve"> </w:t>
-      </w:r>
-      <w:r>
-        <w:t xml:space="preserve">“</w:t>
-      </w:r>
-      <w:r>
-        <w:t xml:space="preserve">unnecessary access</w:t>
-      </w:r>
-      <w:r>
-        <w:t xml:space="preserve">”</w:t>
-      </w:r>
-      <w:r>
-        <w:t xml:space="preserve"> </w:t>
-      </w:r>
-      <w:r>
-        <w:t xml:space="preserve">in our results means a flow in the forbidden (X) rows that the policy nevertheless allows.</w:t>
-      </w:r>
-    </w:p>
-    <w:p>
-      <w:pPr>
-        <w:pStyle w:val="BodyText"/>
-        <w:keepNext/>
-      </w:pPr>
-      <w:r>
-        <w:rPr>
-          <w:bCs/>
-          <w:b/>
-        </w:rPr>
-        <w:t xml:space="preserve">Table 4. Required (R) and forbidden (X) flows</w:t>
-      </w:r>
-    </w:p>
-    <w:tbl>
-      <w:tblPr>
-        <w:tblStyle w:val="Table"/>
-        <w:tblW w:type="pct" w:w="5000"/>
-        <w:jc w:val="left"/>
-        <w:tblLook w:firstRow="1" w:lastRow="0" w:firstColumn="0" w:lastColumn="0" w:noHBand="0" w:noVBand="0" w:val="0020"/>
-      </w:tblPr>
-      <w:tblGrid>
-        <w:gridCol w:w="465"/>
-        <w:gridCol w:w="3028"/>
-        <w:gridCol w:w="2096"/>
-        <w:gridCol w:w="2329"/>
-      </w:tblGrid>
-      <w:tr>
-        <w:trPr>
-          <w:cantSplit/>
-          <w:tblHeader/>
-        </w:trPr>
-        <w:tc>
-          <w:tcPr/>
-          <w:p>
-            <w:pPr>
-              <w:pStyle w:val="Compact"/>
-              <w:keepNext/>
-              <w:jc w:val="left"/>
-            </w:pPr>
-            <w:r>
-              <w:rPr>
-                <w:b/>
-              </w:rPr>
-              <w:t xml:space="preserve">ID</w:t>
-            </w:r>
-          </w:p>
-        </w:tc>
-        <w:tc>
-          <w:tcPr/>
-          <w:p>
-            <w:pPr>
-              <w:pStyle w:val="Compact"/>
-              <w:keepNext/>
-              <w:jc w:val="left"/>
-            </w:pPr>
-            <w:r>
-              <w:rPr>
-                <w:b/>
-              </w:rPr>
-              <w:t xml:space="preserve">Source → Destination</w:t>
-            </w:r>
-          </w:p>
-        </w:tc>
-        <w:tc>
-          <w:tcPr/>
-          <w:p>
-            <w:pPr>
-              <w:pStyle w:val="Compact"/>
-              <w:keepNext/>
-              <w:jc w:val="left"/>
-            </w:pPr>
-            <w:r>
-              <w:rPr>
-                <w:b/>
-              </w:rPr>
-              <w:t xml:space="preserve">Service</w:t>
-            </w:r>
-          </w:p>
-        </w:tc>
-        <w:tc>
-          <w:tcPr/>
-          <w:p>
-            <w:pPr>
-              <w:pStyle w:val="Compact"/>
-              <w:keepNext/>
-              <w:jc w:val="left"/>
-            </w:pPr>
-            <w:r>
-              <w:rPr>
-                <w:b/>
-              </w:rPr>
-              <w:t xml:space="preserve">Type</w:t>
-            </w:r>
-          </w:p>
-        </w:tc>
-      </w:tr>
-      <w:tr>
-        <w:trPr>
-          <w:cantSplit/>
-        </w:trPr>
-        <w:tc>
-          <w:tcPr/>
-          <w:p>
-            <w:pPr>
-              <w:pStyle w:val="Compact"/>
-              <w:keepNext/>
-              <w:jc w:val="left"/>
-            </w:pPr>
-            <w:r>
-              <w:t xml:space="preserve">R1</w:t>
-            </w:r>
-          </w:p>
-        </w:tc>
-        <w:tc>
-          <w:tcPr/>
-          <w:p>
-            <w:pPr>
-              <w:pStyle w:val="Compact"/>
-              <w:keepNext/>
-              <w:jc w:val="left"/>
-            </w:pPr>
-            <w:r>
-              <w:t xml:space="preserve">All departments → DNS-SRV</w:t>
-            </w:r>
-          </w:p>
-        </w:tc>
-        <w:tc>
-          <w:tcPr/>
-          <w:p>
-            <w:pPr>
-              <w:pStyle w:val="Compact"/>
-              <w:keepNext/>
-              <w:jc w:val="left"/>
-            </w:pPr>
-            <w:r>
-              <w:t xml:space="preserve">DNS (UDP 53)</w:t>
-            </w:r>
-          </w:p>
-        </w:tc>
-        <w:tc>
-          <w:tcPr/>
-          <w:p>
-            <w:pPr>
-              <w:pStyle w:val="Compact"/>
-              <w:keepNext/>
-              <w:jc w:val="left"/>
-            </w:pPr>
-            <w:r>
-              <w:t xml:space="preserve">Required</w:t>
-            </w:r>
-          </w:p>
-        </w:tc>
-      </w:tr>
-      <w:tr>
-        <w:trPr>
-          <w:cantSplit/>
-        </w:trPr>
-        <w:tc>
-          <w:tcPr/>
-          <w:p>
-            <w:pPr>
-              <w:pStyle w:val="Compact"/>
-              <w:keepNext/>
-              <w:jc w:val="left"/>
-            </w:pPr>
-            <w:r>
-              <w:t xml:space="preserve">R2</w:t>
-            </w:r>
-          </w:p>
-        </w:tc>
-        <w:tc>
-          <w:tcPr/>
-          <w:p>
-            <w:pPr>
-              <w:pStyle w:val="Compact"/>
-              <w:keepNext/>
-              <w:jc w:val="left"/>
-            </w:pPr>
-            <w:r>
-              <w:t xml:space="preserve">All departments → WEB-SRV</w:t>
-            </w:r>
-          </w:p>
-        </w:tc>
-        <w:tc>
-          <w:tcPr/>
-          <w:p>
-            <w:pPr>
-              <w:pStyle w:val="Compact"/>
-              <w:keepNext/>
-              <w:jc w:val="left"/>
-            </w:pPr>
-            <w:r>
-              <w:t xml:space="preserve">HTTP/HTTPS</w:t>
-            </w:r>
-          </w:p>
-        </w:tc>
-        <w:tc>
-          <w:tcPr/>
-          <w:p>
-            <w:pPr>
-              <w:pStyle w:val="Compact"/>
-              <w:keepNext/>
-              <w:jc w:val="left"/>
-            </w:pPr>
-            <w:r>
-              <w:t xml:space="preserve">Required</w:t>
-            </w:r>
-          </w:p>
-        </w:tc>
-      </w:tr>
-      <w:tr>
-        <w:trPr>
-          <w:cantSplit/>
-        </w:trPr>
-        <w:tc>
-          <w:tcPr/>
-          <w:p>
-            <w:pPr>
-              <w:pStyle w:val="Compact"/>
-              <w:keepNext/>
-              <w:jc w:val="left"/>
-            </w:pPr>
-            <w:r>
-              <w:t xml:space="preserve">R3</w:t>
-            </w:r>
-          </w:p>
-        </w:tc>
-        <w:tc>
-          <w:tcPr/>
-          <w:p>
-            <w:pPr>
-              <w:pStyle w:val="Compact"/>
-              <w:keepNext/>
-              <w:jc w:val="left"/>
-            </w:pPr>
-            <w:r>
-              <w:t xml:space="preserve">HR → HR-SRV</w:t>
-            </w:r>
-          </w:p>
-        </w:tc>
-        <w:tc>
-          <w:tcPr/>
-          <w:p>
-            <w:pPr>
-              <w:pStyle w:val="Compact"/>
-              <w:keepNext/>
-              <w:jc w:val="left"/>
-            </w:pPr>
-            <w:r>
-              <w:t xml:space="preserve">HTTPS</w:t>
-            </w:r>
-          </w:p>
-        </w:tc>
-        <w:tc>
-          <w:tcPr/>
-          <w:p>
-            <w:pPr>
-              <w:pStyle w:val="Compact"/>
-              <w:keepNext/>
-              <w:jc w:val="left"/>
-            </w:pPr>
-            <w:r>
-              <w:t xml:space="preserve">Required</w:t>
-            </w:r>
-          </w:p>
-        </w:tc>
-      </w:tr>
-      <w:tr>
-        <w:trPr>
-          <w:cantSplit/>
-        </w:trPr>
-        <w:tc>
-          <w:tcPr/>
-          <w:p>
-            <w:pPr>
-              <w:pStyle w:val="Compact"/>
-              <w:keepNext/>
-              <w:jc w:val="left"/>
-            </w:pPr>
-            <w:r>
-              <w:t xml:space="preserve">R4</w:t>
-            </w:r>
-          </w:p>
-        </w:tc>
-        <w:tc>
-          <w:tcPr/>
-          <w:p>
-            <w:pPr>
-              <w:pStyle w:val="Compact"/>
-              <w:keepNext/>
-              <w:jc w:val="left"/>
-            </w:pPr>
-            <w:r>
-              <w:t xml:space="preserve">Finance → FIN-SRV</w:t>
-            </w:r>
-          </w:p>
-        </w:tc>
-        <w:tc>
-          <w:tcPr/>
-          <w:p>
-            <w:pPr>
-              <w:pStyle w:val="Compact"/>
-              <w:keepNext/>
-              <w:jc w:val="left"/>
-            </w:pPr>
-            <w:r>
-              <w:t xml:space="preserve">FTP (control: TCP 21)</w:t>
-            </w:r>
-          </w:p>
-        </w:tc>
-        <w:tc>
-          <w:tcPr/>
-          <w:p>
-            <w:pPr>
-              <w:pStyle w:val="Compact"/>
-              <w:keepNext/>
-              <w:jc w:val="left"/>
-            </w:pPr>
-            <w:r>
-              <w:t xml:space="preserve">Required</w:t>
-            </w:r>
-          </w:p>
-        </w:tc>
-      </w:tr>
-      <w:tr>
-        <w:trPr>
-          <w:cantSplit/>
-        </w:trPr>
-        <w:tc>
-          <w:tcPr/>
-          <w:p>
-            <w:pPr>
-              <w:pStyle w:val="Compact"/>
-              <w:keepNext/>
-              <w:jc w:val="left"/>
-            </w:pPr>
-            <w:r>
-              <w:t xml:space="preserve">R5</w:t>
-            </w:r>
-          </w:p>
-        </w:tc>
-        <w:tc>
-          <w:tcPr/>
-          <w:p>
-            <w:pPr>
-              <w:pStyle w:val="Compact"/>
-              <w:keepNext/>
-              <w:jc w:val="left"/>
-            </w:pPr>
-            <w:r>
-              <w:t xml:space="preserve">IT → R-CORE, R-EDGE</w:t>
-            </w:r>
-          </w:p>
-        </w:tc>
-        <w:tc>
-          <w:tcPr/>
-          <w:p>
-            <w:pPr>
-              <w:pStyle w:val="Compact"/>
-              <w:keepNext/>
-              <w:jc w:val="left"/>
-            </w:pPr>
-            <w:r>
-              <w:t xml:space="preserve">SSH</w:t>
-            </w:r>
-          </w:p>
-        </w:tc>
-        <w:tc>
-          <w:tcPr/>
-          <w:p>
-            <w:pPr>
-              <w:pStyle w:val="Compact"/>
-              <w:keepNext/>
-              <w:jc w:val="left"/>
-            </w:pPr>
-            <w:r>
-              <w:t xml:space="preserve">Required</w:t>
-            </w:r>
-          </w:p>
-        </w:tc>
-      </w:tr>
-      <w:tr>
-        <w:trPr>
-          <w:cantSplit/>
-        </w:trPr>
-        <w:tc>
-          <w:tcPr/>
-          <w:p>
-            <w:pPr>
-              <w:pStyle w:val="Compact"/>
-              <w:keepNext/>
-              <w:jc w:val="left"/>
-            </w:pPr>
-            <w:r>
-              <w:t xml:space="preserve">R6</w:t>
-            </w:r>
-          </w:p>
-        </w:tc>
-        <w:tc>
-          <w:tcPr/>
-          <w:p>
-            <w:pPr>
-              <w:pStyle w:val="Compact"/>
-              <w:keepNext/>
-              <w:jc w:val="left"/>
-            </w:pPr>
-            <w:r>
-              <w:t xml:space="preserve">IT → servers</w:t>
-            </w:r>
-          </w:p>
-        </w:tc>
-        <w:tc>
-          <w:tcPr/>
-          <w:p>
-            <w:pPr>
-              <w:pStyle w:val="Compact"/>
-              <w:keepNext/>
-              <w:jc w:val="left"/>
-            </w:pPr>
-            <w:r>
-              <w:t xml:space="preserve">ICMP echo</w:t>
-            </w:r>
-          </w:p>
-        </w:tc>
-        <w:tc>
-          <w:tcPr/>
-          <w:p>
-            <w:pPr>
-              <w:pStyle w:val="Compact"/>
-              <w:keepNext/>
-              <w:jc w:val="left"/>
-            </w:pPr>
-            <w:r>
-              <w:t xml:space="preserve">Required</w:t>
-            </w:r>
-          </w:p>
-        </w:tc>
-      </w:tr>
-      <w:tr>
-        <w:trPr>
-          <w:cantSplit/>
-        </w:trPr>
-        <w:tc>
-          <w:tcPr/>
-          <w:p>
-            <w:pPr>
-              <w:pStyle w:val="Compact"/>
-              <w:keepNext/>
-              <w:jc w:val="left"/>
-            </w:pPr>
-            <w:r>
-              <w:t xml:space="preserve">R7</w:t>
-            </w:r>
-          </w:p>
-        </w:tc>
-        <w:tc>
-          <w:tcPr/>
-          <w:p>
-            <w:pPr>
-              <w:pStyle w:val="Compact"/>
-              <w:keepNext/>
-              <w:jc w:val="left"/>
-            </w:pPr>
-            <w:r>
-              <w:t xml:space="preserve">All departments → external web</w:t>
-            </w:r>
-          </w:p>
-        </w:tc>
-        <w:tc>
-          <w:tcPr/>
-          <w:p>
-            <w:pPr>
-              <w:pStyle w:val="Compact"/>
-              <w:keepNext/>
-              <w:jc w:val="left"/>
-            </w:pPr>
-            <w:r>
-              <w:t xml:space="preserve">HTTP/HTTPS</w:t>
-            </w:r>
-          </w:p>
-        </w:tc>
-        <w:tc>
-          <w:tcPr/>
-          <w:p>
-            <w:pPr>
-              <w:pStyle w:val="Compact"/>
-              <w:keepNext/>
-              <w:jc w:val="left"/>
-            </w:pPr>
-            <w:r>
-              <w:t xml:space="preserve">Required</w:t>
-            </w:r>
-          </w:p>
-        </w:tc>
-      </w:tr>
-      <w:tr>
-        <w:trPr>
-          <w:cantSplit/>
-        </w:trPr>
-        <w:tc>
-          <w:tcPr/>
-          <w:p>
-            <w:pPr>
-              <w:pStyle w:val="Compact"/>
-              <w:keepNext/>
-              <w:jc w:val="left"/>
-            </w:pPr>
-            <w:r>
-              <w:t xml:space="preserve">R8</w:t>
-            </w:r>
-          </w:p>
-        </w:tc>
-        <w:tc>
-          <w:tcPr/>
-          <w:p>
-            <w:pPr>
-              <w:pStyle w:val="Compact"/>
-              <w:keepNext/>
-              <w:jc w:val="left"/>
-            </w:pPr>
-            <w:r>
-              <w:t xml:space="preserve">External → WEB-SRV</w:t>
-            </w:r>
-          </w:p>
-        </w:tc>
-        <w:tc>
-          <w:tcPr/>
-          <w:p>
-            <w:pPr>
-              <w:pStyle w:val="Compact"/>
-              <w:keepNext/>
-              <w:jc w:val="left"/>
-            </w:pPr>
-            <w:r>
-              <w:t xml:space="preserve">HTTP/HTTPS</w:t>
-            </w:r>
-          </w:p>
-        </w:tc>
-        <w:tc>
-          <w:tcPr/>
-          <w:p>
-            <w:pPr>
-              <w:pStyle w:val="Compact"/>
-              <w:keepNext/>
-              <w:jc w:val="left"/>
-            </w:pPr>
-            <w:r>
-              <w:t xml:space="preserve">Required</w:t>
-            </w:r>
-          </w:p>
-        </w:tc>
-      </w:tr>
-      <w:tr>
-        <w:trPr>
-          <w:cantSplit/>
-        </w:trPr>
-        <w:tc>
-          <w:tcPr/>
-          <w:p>
-            <w:pPr>
-              <w:pStyle w:val="Compact"/>
-              <w:keepNext/>
-              <w:jc w:val="left"/>
-            </w:pPr>
-            <w:r>
-              <w:t xml:space="preserve">X1</w:t>
-            </w:r>
-          </w:p>
-        </w:tc>
-        <w:tc>
-          <w:tcPr/>
-          <w:p>
-            <w:pPr>
-              <w:pStyle w:val="Compact"/>
-              <w:keepNext/>
-              <w:jc w:val="left"/>
-            </w:pPr>
-            <w:r>
-              <w:t xml:space="preserve">Department → other department</w:t>
-            </w:r>
-          </w:p>
-        </w:tc>
-        <w:tc>
-          <w:tcPr/>
-          <w:p>
-            <w:pPr>
-              <w:pStyle w:val="Compact"/>
-              <w:keepNext/>
-              <w:jc w:val="left"/>
-            </w:pPr>
-            <w:r>
-              <w:t xml:space="preserve">Any</w:t>
-            </w:r>
-          </w:p>
-        </w:tc>
-        <w:tc>
-          <w:tcPr/>
-          <w:p>
-            <w:pPr>
-              <w:pStyle w:val="Compact"/>
-              <w:keepNext/>
-              <w:jc w:val="left"/>
-            </w:pPr>
-            <w:r>
-              <w:t xml:space="preserve">Forbidden</w:t>
-            </w:r>
-          </w:p>
-        </w:tc>
-      </w:tr>
-      <w:tr>
-        <w:trPr>
-          <w:cantSplit/>
-        </w:trPr>
-        <w:tc>
-          <w:tcPr/>
-          <w:p>
-            <w:pPr>
-              <w:pStyle w:val="Compact"/>
-              <w:keepNext/>
-              <w:jc w:val="left"/>
-            </w:pPr>
-            <w:r>
-              <w:t xml:space="preserve">X2</w:t>
-            </w:r>
-          </w:p>
-        </w:tc>
-        <w:tc>
-          <w:tcPr/>
-          <w:p>
-            <w:pPr>
-              <w:pStyle w:val="Compact"/>
-              <w:keepNext/>
-              <w:jc w:val="left"/>
-            </w:pPr>
-            <w:r>
-              <w:t xml:space="preserve">Non-HR → HR-SRV</w:t>
-            </w:r>
-          </w:p>
-        </w:tc>
-        <w:tc>
-          <w:tcPr/>
-          <w:p>
-            <w:pPr>
-              <w:pStyle w:val="Compact"/>
-              <w:keepNext/>
-              <w:jc w:val="left"/>
-            </w:pPr>
-            <w:r>
-              <w:t xml:space="preserve">Any</w:t>
-            </w:r>
-          </w:p>
-        </w:tc>
-        <w:tc>
-          <w:tcPr/>
-          <w:p>
-            <w:pPr>
-              <w:pStyle w:val="Compact"/>
-              <w:keepNext/>
-              <w:jc w:val="left"/>
-            </w:pPr>
-            <w:r>
-              <w:t xml:space="preserve">Forbidden</w:t>
-            </w:r>
-          </w:p>
-        </w:tc>
-      </w:tr>
-      <w:tr>
-        <w:trPr>
-          <w:cantSplit/>
-        </w:trPr>
-        <w:tc>
-          <w:tcPr/>
-          <w:p>
-            <w:pPr>
-              <w:pStyle w:val="Compact"/>
-              <w:keepNext/>
-              <w:jc w:val="left"/>
-            </w:pPr>
-            <w:r>
-              <w:t xml:space="preserve">X3</w:t>
-            </w:r>
-          </w:p>
-        </w:tc>
-        <w:tc>
-          <w:tcPr/>
-          <w:p>
-            <w:pPr>
-              <w:pStyle w:val="Compact"/>
-              <w:keepNext/>
-              <w:jc w:val="left"/>
-            </w:pPr>
-            <w:r>
-              <w:t xml:space="preserve">Non-Finance → FIN-SRV</w:t>
-            </w:r>
-          </w:p>
-        </w:tc>
-        <w:tc>
-          <w:tcPr/>
-          <w:p>
-            <w:pPr>
-              <w:pStyle w:val="Compact"/>
-              <w:keepNext/>
-              <w:jc w:val="left"/>
-            </w:pPr>
-            <w:r>
-              <w:t xml:space="preserve">Any</w:t>
-            </w:r>
-          </w:p>
-        </w:tc>
-        <w:tc>
-          <w:tcPr/>
-          <w:p>
-            <w:pPr>
-              <w:pStyle w:val="Compact"/>
-              <w:keepNext/>
-              <w:jc w:val="left"/>
-            </w:pPr>
-            <w:r>
-              <w:t xml:space="preserve">Forbidden</w:t>
-            </w:r>
-          </w:p>
-        </w:tc>
-      </w:tr>
-      <w:tr>
-        <w:trPr>
-          <w:cantSplit/>
-        </w:trPr>
-        <w:tc>
-          <w:tcPr/>
-          <w:p>
-            <w:pPr>
-              <w:pStyle w:val="Compact"/>
-              <w:keepNext/>
-              <w:jc w:val="left"/>
-            </w:pPr>
-            <w:r>
-              <w:t xml:space="preserve">X4</w:t>
-            </w:r>
-          </w:p>
-        </w:tc>
-        <w:tc>
-          <w:tcPr/>
-          <w:p>
-            <w:pPr>
-              <w:pStyle w:val="Compact"/>
-              <w:keepNext/>
-              <w:jc w:val="left"/>
-            </w:pPr>
-            <w:r>
-              <w:t xml:space="preserve">Non-IT → router management</w:t>
-            </w:r>
-          </w:p>
-        </w:tc>
-        <w:tc>
-          <w:tcPr/>
-          <w:p>
-            <w:pPr>
-              <w:pStyle w:val="Compact"/>
-              <w:keepNext/>
-              <w:jc w:val="left"/>
-            </w:pPr>
-            <w:r>
-              <w:t xml:space="preserve">SSH/Telnet</w:t>
-            </w:r>
-          </w:p>
-        </w:tc>
-        <w:tc>
-          <w:tcPr/>
-          <w:p>
-            <w:pPr>
-              <w:pStyle w:val="Compact"/>
-              <w:keepNext/>
-              <w:jc w:val="left"/>
-            </w:pPr>
-            <w:r>
-              <w:t xml:space="preserve">Forbidden</w:t>
-            </w:r>
-          </w:p>
-        </w:tc>
-      </w:tr>
-      <w:tr>
-        <w:trPr>
-          <w:cantSplit/>
-        </w:trPr>
-        <w:tc>
-          <w:tcPr/>
-          <w:p>
-            <w:pPr>
-              <w:pStyle w:val="Compact"/>
-              <w:keepNext/>
-              <w:jc w:val="left"/>
-            </w:pPr>
-            <w:r>
-              <w:t xml:space="preserve">X5</w:t>
-            </w:r>
-          </w:p>
-        </w:tc>
-        <w:tc>
-          <w:tcPr/>
-          <w:p>
-            <w:pPr>
-              <w:pStyle w:val="Compact"/>
-              <w:keepNext/>
-              <w:jc w:val="left"/>
-            </w:pPr>
-            <w:r>
-              <w:t xml:space="preserve">Anyone → routers</w:t>
-            </w:r>
-          </w:p>
-        </w:tc>
-        <w:tc>
-          <w:tcPr/>
-          <w:p>
-            <w:pPr>
-              <w:pStyle w:val="Compact"/>
-              <w:keepNext/>
-              <w:jc w:val="left"/>
-            </w:pPr>
-            <w:r>
-              <w:t xml:space="preserve">Telnet</w:t>
-            </w:r>
-          </w:p>
-        </w:tc>
-        <w:tc>
-          <w:tcPr/>
-          <w:p>
-            <w:pPr>
-              <w:pStyle w:val="Compact"/>
-              <w:keepNext/>
-              <w:jc w:val="left"/>
-            </w:pPr>
-            <w:r>
-              <w:t xml:space="preserve">Forbidden</w:t>
-            </w:r>
-          </w:p>
-        </w:tc>
-      </w:tr>
-      <w:tr>
-        <w:trPr>
-          <w:cantSplit/>
-        </w:trPr>
-        <w:tc>
-          <w:tcPr/>
-          <w:p>
-            <w:pPr>
-              <w:pStyle w:val="Compact"/>
-              <w:keepNext/>
-              <w:jc w:val="left"/>
-            </w:pPr>
-            <w:r>
-              <w:t xml:space="preserve">X6</w:t>
-            </w:r>
-          </w:p>
-        </w:tc>
-        <w:tc>
-          <w:tcPr/>
-          <w:p>
-            <w:pPr>
-              <w:pStyle w:val="Compact"/>
-              <w:keepNext/>
-              <w:jc w:val="left"/>
-            </w:pPr>
-            <w:r>
-              <w:t xml:space="preserve">Non-IT → servers</w:t>
-            </w:r>
-          </w:p>
-        </w:tc>
-        <w:tc>
-          <w:tcPr/>
-          <w:p>
-            <w:pPr>
-              <w:pStyle w:val="Compact"/>
-              <w:keepNext/>
-              <w:jc w:val="left"/>
-            </w:pPr>
-            <w:r>
-              <w:t xml:space="preserve">ICMP and unused ports</w:t>
-            </w:r>
-          </w:p>
-        </w:tc>
-        <w:tc>
-          <w:tcPr/>
-          <w:p>
-            <w:pPr>
-              <w:pStyle w:val="Compact"/>
-              <w:keepNext/>
-              <w:jc w:val="left"/>
-            </w:pPr>
-            <w:r>
-              <w:t xml:space="preserve">Forbidden</w:t>
-            </w:r>
-          </w:p>
-        </w:tc>
-      </w:tr>
-      <w:tr>
-        <w:trPr>
-          <w:cantSplit/>
-        </w:trPr>
-        <w:tc>
-          <w:tcPr/>
-          <w:p>
-            <w:pPr>
-              <w:pStyle w:val="Compact"/>
-              <w:keepNext/>
-              <w:jc w:val="left"/>
-            </w:pPr>
-            <w:r>
-              <w:t xml:space="preserve">X7</w:t>
-            </w:r>
-          </w:p>
-        </w:tc>
-        <w:tc>
-          <w:tcPr/>
-          <w:p>
-            <w:pPr>
-              <w:pStyle w:val="Compact"/>
-              <w:keepNext/>
-              <w:jc w:val="left"/>
-            </w:pPr>
-            <w:r>
-              <w:t xml:space="preserve">External → anything except R8</w:t>
-            </w:r>
-          </w:p>
-        </w:tc>
-        <w:tc>
-          <w:tcPr/>
-          <w:p>
-            <w:pPr>
-              <w:pStyle w:val="Compact"/>
-              <w:keepNext/>
-              <w:jc w:val="left"/>
-            </w:pPr>
-            <w:r>
-              <w:t xml:space="preserve">Any</w:t>
-            </w:r>
-          </w:p>
-        </w:tc>
-        <w:tc>
-          <w:tcPr/>
-          <w:p>
-            <w:pPr>
-              <w:pStyle w:val="Compact"/>
-              <w:keepNext/>
-              <w:jc w:val="left"/>
-            </w:pPr>
-            <w:r>
-              <w:t xml:space="preserve">Forbidden</w:t>
-            </w:r>
-          </w:p>
-        </w:tc>
-      </w:tr>
-      <w:tr>
-        <w:trPr>
-          <w:cantSplit/>
-        </w:trPr>
-        <w:tc>
-          <w:tcPr/>
-          <w:p>
-            <w:pPr>
-              <w:pStyle w:val="Compact"/>
-              <w:jc w:val="left"/>
-            </w:pPr>
-            <w:r>
-              <w:t xml:space="preserve">U1</w:t>
-            </w:r>
-          </w:p>
-        </w:tc>
-        <w:tc>
-          <w:tcPr/>
-          <w:p>
-            <w:pPr>
-              <w:pStyle w:val="Compact"/>
-              <w:jc w:val="left"/>
-            </w:pPr>
-            <w:r>
-              <w:t xml:space="preserve">PC ↔ PC in the same VLAN</w:t>
-            </w:r>
-          </w:p>
-        </w:tc>
-        <w:tc>
-          <w:tcPr/>
-          <w:p>
-            <w:pPr>
-              <w:pStyle w:val="Compact"/>
-              <w:jc w:val="left"/>
-            </w:pPr>
-            <w:r>
-              <w:t xml:space="preserve">Any</w:t>
-            </w:r>
-          </w:p>
-        </w:tc>
-        <w:tc>
-          <w:tcPr/>
-          <w:p>
-            <w:pPr>
-              <w:pStyle w:val="Compact"/>
-              <w:jc w:val="left"/>
-            </w:pPr>
-            <w:r>
-              <w:t xml:space="preserve">Not filterable by a router ACL (Layer 2 only)</w:t>
-            </w:r>
-          </w:p>
-        </w:tc>
-      </w:tr>
-    </w:tbl>
-    <w:p>
-      <w:pPr>
-        <w:pStyle w:val="BodyText"/>
-        <w:spacing w:before="160"/>
-      </w:pPr>
-      <w:r>
-        <w:t xml:space="preserve">Packet Tracer servers do not offer a database service, so we represent the finance records system with FTP (R4). FTP is only a proxy. It shows how a service that opens a separate data connection interacts with port-based rules; it says nothing about how a real database protocol behaves. Part C discusses what this substitution leaves out.</w:t>
-      </w:r>
-    </w:p>
-    <w:bookmarkEnd w:id="36"/>
-    <w:bookmarkStart w:id="37" w:name="Xcced6eacccddb4bfcc35b39c9acc7567e2d67fc"/>
-    <w:p>
-      <w:pPr>
-        <w:pStyle w:val="Heading2"/>
-      </w:pPr>
-      <w:r>
-        <w:t xml:space="preserve">B4. Network Configuration and Stage 0 Baseline</w:t>
+        <w:t xml:space="preserve">B5. Implementation I: Network Configuration, Baseline and Pilot</w:t>
       </w:r>
     </w:p>
     <w:p>
@@ -5754,14 +6213,14 @@
         <w:t xml:space="preserve">[PLACEHOLDER: Figures F02–F04, VLAN, trunk and route outputs and the Stage 0 baseline.]</w:t>
       </w:r>
     </w:p>
-    <w:bookmarkEnd w:id="37"/>
-    <w:bookmarkStart w:id="38" w:name="b5.-policy-stages"/>
+    <w:bookmarkEnd w:id="38"/>
+    <w:bookmarkStart w:id="39" w:name="b6.-implementation-ii-policy-stages"/>
     <w:p>
       <w:pPr>
         <w:pStyle w:val="Heading2"/>
       </w:pPr>
       <w:r>
-        <w:t xml:space="preserve">B5. Policy Stages</w:t>
+        <w:t xml:space="preserve">B6. Implementation II: Policy Stages</w:t>
       </w:r>
     </w:p>
     <w:p>
@@ -6251,7 +6710,7 @@
         <w:pStyle w:val="Compact"/>
         <w:numPr>
           <w:ilvl w:val="0"/>
-          <w:numId w:val="1006"/>
+          <w:numId w:val="1007"/>
         </w:numPr>
       </w:pPr>
       <w:r>
@@ -6289,7 +6748,7 @@
         <w:pStyle w:val="Compact"/>
         <w:numPr>
           <w:ilvl w:val="0"/>
-          <w:numId w:val="1006"/>
+          <w:numId w:val="1007"/>
         </w:numPr>
       </w:pPr>
       <w:r>
@@ -6311,7 +6770,7 @@
         <w:pStyle w:val="Compact"/>
         <w:numPr>
           <w:ilvl w:val="0"/>
-          <w:numId w:val="1006"/>
+          <w:numId w:val="1007"/>
         </w:numPr>
       </w:pPr>
       <w:r>
@@ -6341,7 +6800,7 @@
         <w:pStyle w:val="Compact"/>
         <w:numPr>
           <w:ilvl w:val="0"/>
-          <w:numId w:val="1006"/>
+          <w:numId w:val="1007"/>
         </w:numPr>
       </w:pPr>
       <w:r>
@@ -6363,7 +6822,7 @@
         <w:pStyle w:val="Compact"/>
         <w:numPr>
           <w:ilvl w:val="0"/>
-          <w:numId w:val="1006"/>
+          <w:numId w:val="1007"/>
         </w:numPr>
         <w:spacing w:after="140"/>
       </w:pPr>
@@ -7102,14 +7561,14 @@
         <w:t xml:space="preserve">entry would block both. We have deliberately not added a data-port rule in advance. If pilot P7 shows that one is needed, the team will choose between adding one minimal entry and moving the finance service to HTTPS, and will record that decision. The forbidden FTP tests (T08, T09 and T16) depend only on the control connection being refused, so the data-channel question does not affect them. If an entry is added, T04, T08 and T16 will be re-run to show that it does not open FTP to anyone else.</w:t>
       </w:r>
     </w:p>
-    <w:bookmarkEnd w:id="38"/>
-    <w:bookmarkStart w:id="39" w:name="b6.-test-method"/>
+    <w:bookmarkEnd w:id="39"/>
+    <w:bookmarkStart w:id="40" w:name="b7.-testing-procedure"/>
     <w:p>
       <w:pPr>
         <w:pStyle w:val="Heading2"/>
       </w:pPr>
       <w:r>
-        <w:t xml:space="preserve">B6. Test Method</w:t>
+        <w:t xml:space="preserve">B7. Testing Procedure</w:t>
       </w:r>
     </w:p>
     <w:p>
@@ -7151,44 +7610,11 @@
         <w:pStyle w:val="Compact"/>
         <w:numPr>
           <w:ilvl w:val="0"/>
-          <w:numId w:val="1007"/>
+          <w:numId w:val="1008"/>
         </w:numPr>
       </w:pPr>
       <w:r>
         <w:t xml:space="preserve">required (8): T01, T03, T04, T05, T06, T14, T15, T17</w:t>
-      </w:r>
-    </w:p>
-    <w:p>
-      <w:pPr>
-        <w:pStyle w:val="Compact"/>
-        <w:numPr>
-          <w:ilvl w:val="0"/>
-          <w:numId w:val="1007"/>
-        </w:numPr>
-      </w:pPr>
-      <w:r>
-        <w:t xml:space="preserve">forbidden (8): T07, T08, T10, T11, T12, T13, T16, T19</w:t>
-      </w:r>
-    </w:p>
-    <w:p>
-      <w:pPr>
-        <w:pStyle w:val="Compact"/>
-        <w:numPr>
-          <w:ilvl w:val="0"/>
-          <w:numId w:val="1007"/>
-        </w:numPr>
-        <w:spacing w:after="140"/>
-      </w:pPr>
-      <w:r>
-        <w:t xml:space="preserve">control (1): T18</w:t>
-      </w:r>
-    </w:p>
-    <w:p>
-      <w:pPr>
-        <w:pStyle w:val="FirstParagraph"/>
-      </w:pPr>
-      <w:r>
-        <w:t xml:space="preserve">Each required and forbidden flow has at least one test among these 17, but three are covered only in part, and our claims are narrowed accordingly:</w:t>
       </w:r>
     </w:p>
     <w:p>
@@ -7200,6 +7626,39 @@
         </w:numPr>
       </w:pPr>
       <w:r>
+        <w:t xml:space="preserve">forbidden (8): T07, T08, T10, T11, T12, T13, T16, T19</w:t>
+      </w:r>
+    </w:p>
+    <w:p>
+      <w:pPr>
+        <w:pStyle w:val="Compact"/>
+        <w:numPr>
+          <w:ilvl w:val="0"/>
+          <w:numId w:val="1008"/>
+        </w:numPr>
+        <w:spacing w:after="140"/>
+      </w:pPr>
+      <w:r>
+        <w:t xml:space="preserve">control (1): T18</w:t>
+      </w:r>
+    </w:p>
+    <w:p>
+      <w:pPr>
+        <w:pStyle w:val="FirstParagraph"/>
+      </w:pPr>
+      <w:r>
+        <w:t xml:space="preserve">Each required and forbidden flow has at least one test among these 17, but three are covered only in part, and our claims are narrowed accordingly:</w:t>
+      </w:r>
+    </w:p>
+    <w:p>
+      <w:pPr>
+        <w:pStyle w:val="Compact"/>
+        <w:numPr>
+          <w:ilvl w:val="0"/>
+          <w:numId w:val="1009"/>
+        </w:numPr>
+      </w:pPr>
+      <w:r>
         <w:rPr>
           <w:bCs/>
           <w:b/>
@@ -7218,7 +7677,7 @@
         <w:pStyle w:val="Compact"/>
         <w:numPr>
           <w:ilvl w:val="0"/>
-          <w:numId w:val="1008"/>
+          <w:numId w:val="1009"/>
         </w:numPr>
       </w:pPr>
       <w:r>
@@ -7240,7 +7699,7 @@
         <w:pStyle w:val="Compact"/>
         <w:numPr>
           <w:ilvl w:val="0"/>
-          <w:numId w:val="1008"/>
+          <w:numId w:val="1009"/>
         </w:numPr>
         <w:spacing w:after="140"/>
       </w:pPr>
@@ -11640,14 +12099,14 @@
         </w:tc>
       </w:tr>
     </w:tbl>
-    <w:bookmarkEnd w:id="39"/>
-    <w:bookmarkStart w:id="40" w:name="X0dda729ee9a5f39f63343805e63b36939115dcb"/>
+    <w:bookmarkEnd w:id="40"/>
+    <w:bookmarkStart w:id="41" w:name="Xa247a0f7f7bb1e1d5af4c67e6a739ffb32fbd37"/>
     <w:p>
       <w:pPr>
         <w:pStyle w:val="Heading2"/>
       </w:pPr>
       <w:r>
-        <w:t xml:space="preserve">B7. Controlled Misconfiguration Experiments</w:t>
+        <w:t xml:space="preserve">B8. Controlled Misconfiguration Experiments</w:t>
       </w:r>
     </w:p>
     <w:p>
@@ -12060,14 +12519,14 @@
         </w:tc>
       </w:tr>
     </w:tbl>
-    <w:bookmarkEnd w:id="40"/>
-    <w:bookmarkStart w:id="41" w:name="b8.-metrics-and-comparative-analysis"/>
+    <w:bookmarkEnd w:id="41"/>
+    <w:bookmarkStart w:id="42" w:name="b9.-results-and-discussion"/>
     <w:p>
       <w:pPr>
         <w:pStyle w:val="Heading2"/>
       </w:pPr>
       <w:r>
-        <w:t xml:space="preserve">B8. Metrics and Comparative Analysis</w:t>
+        <w:t xml:space="preserve">B9. Results and Discussion</w:t>
       </w:r>
     </w:p>
     <w:p>
@@ -12083,7 +12542,7 @@
         <w:pStyle w:val="Compact"/>
         <w:numPr>
           <w:ilvl w:val="0"/>
-          <w:numId w:val="1009"/>
+          <w:numId w:val="1010"/>
         </w:numPr>
       </w:pPr>
       <w:r>
@@ -12105,7 +12564,7 @@
         <w:pStyle w:val="Compact"/>
         <w:numPr>
           <w:ilvl w:val="0"/>
-          <w:numId w:val="1009"/>
+          <w:numId w:val="1010"/>
         </w:numPr>
       </w:pPr>
       <w:r>
@@ -12127,7 +12586,7 @@
         <w:pStyle w:val="Compact"/>
         <w:numPr>
           <w:ilvl w:val="0"/>
-          <w:numId w:val="1009"/>
+          <w:numId w:val="1010"/>
         </w:numPr>
       </w:pPr>
       <w:r>
@@ -12146,7 +12605,7 @@
         <w:pStyle w:val="Compact"/>
         <w:numPr>
           <w:ilvl w:val="0"/>
-          <w:numId w:val="1009"/>
+          <w:numId w:val="1010"/>
         </w:numPr>
       </w:pPr>
       <w:r>
@@ -12180,7 +12639,7 @@
         <w:pStyle w:val="Compact"/>
         <w:numPr>
           <w:ilvl w:val="0"/>
-          <w:numId w:val="1009"/>
+          <w:numId w:val="1010"/>
         </w:numPr>
       </w:pPr>
       <w:r>
@@ -12199,7 +12658,7 @@
         <w:pStyle w:val="Compact"/>
         <w:numPr>
           <w:ilvl w:val="0"/>
-          <w:numId w:val="1009"/>
+          <w:numId w:val="1010"/>
         </w:numPr>
         <w:spacing w:after="140"/>
       </w:pPr>
@@ -12780,14 +13239,14 @@
         <w:t xml:space="preserve">[PLACEHOLDER: discussion of results, to be written after measurement. Assess E1–E4 as supported, partly supported or not supported, using only observed data.]</w:t>
       </w:r>
     </w:p>
-    <w:bookmarkEnd w:id="41"/>
-    <w:bookmarkStart w:id="42" w:name="b9.-evidence-plan"/>
+    <w:bookmarkEnd w:id="42"/>
+    <w:bookmarkStart w:id="43" w:name="b10.-evidence-plan"/>
     <w:p>
       <w:pPr>
         <w:pStyle w:val="Heading2"/>
       </w:pPr>
       <w:r>
-        <w:t xml:space="preserve">B9. Evidence Plan</w:t>
+        <w:t xml:space="preserve">B10. Evidence Plan</w:t>
       </w:r>
     </w:p>
     <w:p>
@@ -13519,9 +13978,9 @@
         <w:br w:type="page"/>
       </w:r>
     </w:p>
-    <w:bookmarkEnd w:id="42"/>
     <w:bookmarkEnd w:id="43"/>
-    <w:bookmarkStart w:id="44" w:name="X6f293ca93e6b1c028848361a6efc65d7760ed14"/>
+    <w:bookmarkEnd w:id="44"/>
+    <w:bookmarkStart w:id="45" w:name="X6f293ca93e6b1c028848361a6efc65d7760ed14"/>
     <w:p>
       <w:pPr>
         <w:pStyle w:val="Heading1"/>
@@ -13990,7 +14449,7 @@
         <w:t xml:space="preserve"> </w:t>
       </w:r>
       <w:r>
-        <w:t xml:space="preserve">We use FTP in place of a database, which Packet Tracer lacks. There is no NAT or DMZ, routing is static, and a single core router has no redundancy. Server-initiated traffic is neither filtered nor tested. Finally, we run only 17 of the 26 designed test cases, so the Sales exposure metric is not measured, zero-hit counts reflect only the tests run, and R5, X6 and X7 are covered only in part (B6).</w:t>
+        <w:t xml:space="preserve">We use FTP in place of a database, which Packet Tracer lacks. There is no NAT or DMZ, routing is static, and a single core router has no redundancy. Server-initiated traffic is neither filtered nor tested. Finally, we run only 17 of the 26 designed test cases, so the Sales exposure metric is not measured, zero-hit counts reflect only the tests run, and R5, X6 and X7 are covered only in part (B7).</w:t>
       </w:r>
     </w:p>
     <w:p>
@@ -13998,8 +14457,8 @@
         <w:br w:type="page"/>
       </w:r>
     </w:p>
-    <w:bookmarkEnd w:id="44"/>
-    <w:bookmarkStart w:id="45" w:name="individual-contribution-statement"/>
+    <w:bookmarkEnd w:id="45"/>
+    <w:bookmarkStart w:id="46" w:name="individual-contribution-statement"/>
     <w:p>
       <w:pPr>
         <w:pStyle w:val="Heading1"/>
@@ -14011,22 +14470,18 @@
     <w:p>
       <w:pPr>
         <w:pStyle w:val="FirstParagraph"/>
+      </w:pPr>
+      <w:r>
+        <w:t xml:space="preserve">All five members worked on one integrated project; nobody owned a separate topic. Each member led one functional area and reviewed another member’s work. Shared by everyone: rebuilding Stage 0 independently, reading the core sources, writing critical-analysis notes and a mock viva.</w:t>
+      </w:r>
+    </w:p>
+    <w:p>
+      <w:pPr>
+        <w:pStyle w:val="BodyText"/>
         <w:keepNext/>
       </w:pPr>
       <w:r>
-        <w:t xml:space="preserve">[PLACEHOLDER: complete from</w:t>
-      </w:r>
-      <w:r>
-        <w:t xml:space="preserve"> </w:t>
-      </w:r>
-      <w:r>
-        <w:rPr>
-          <w:rStyle w:val="VerbatimChar"/>
-        </w:rPr>
-        <w:t xml:space="preserve">documentation/contribution.md</w:t>
-      </w:r>
-      <w:r>
-        <w:t xml:space="preserve">. Each member lists their functional role, viva section, main contributions and what they reviewed or verified, then signs.]</w:t>
+        <w:t xml:space="preserve">Names and registration numbers are left blank for the team to fill in. [TEAM CHECK: each member must check that their row describes what they actually did by the submission date, edit it if not, and only then sign. Work listed here that has not happened yet must be removed or changed.]</w:t>
       </w:r>
     </w:p>
     <w:tbl>
@@ -14037,13 +14492,13 @@
         <w:tblLook w:firstRow="1" w:lastRow="0" w:firstColumn="0" w:lastColumn="0" w:noHBand="0" w:noVBand="0" w:val="0020"/>
       </w:tblPr>
       <w:tblGrid>
-        <w:gridCol w:w="1810"/>
-        <w:gridCol w:w="1810"/>
-        <w:gridCol w:w="678"/>
-        <w:gridCol w:w="678"/>
-        <w:gridCol w:w="1357"/>
-        <w:gridCol w:w="905"/>
-        <w:gridCol w:w="678"/>
+        <w:gridCol w:w="889"/>
+        <w:gridCol w:w="800"/>
+        <w:gridCol w:w="1067"/>
+        <w:gridCol w:w="2313"/>
+        <w:gridCol w:w="1423"/>
+        <w:gridCol w:w="889"/>
+        <w:gridCol w:w="533"/>
       </w:tblGrid>
       <w:tr>
         <w:trPr>
@@ -14094,23 +14549,7 @@
               <w:rPr>
                 <w:b/>
               </w:rPr>
-              <w:t xml:space="preserve">Role(s)</w:t>
-            </w:r>
-          </w:p>
-        </w:tc>
-        <w:tc>
-          <w:tcPr/>
-          <w:p>
-            <w:pPr>
-              <w:pStyle w:val="Compact"/>
-              <w:keepNext/>
-              <w:jc w:val="left"/>
-            </w:pPr>
-            <w:r>
-              <w:rPr>
-                <w:b/>
-              </w:rPr>
-              <w:t xml:space="preserve">Viva section</w:t>
+              <w:t xml:space="preserve">Role</w:t>
             </w:r>
           </w:p>
         </w:tc>
@@ -14158,373 +14597,469 @@
               <w:rPr>
                 <w:b/>
               </w:rPr>
-              <w:t xml:space="preserve">Sign.</w:t>
-            </w:r>
-          </w:p>
-        </w:tc>
-      </w:tr>
-      <w:tr>
-        <w:trPr>
-          <w:cantSplit/>
-        </w:trPr>
-        <w:tc>
-          <w:tcPr/>
-          <w:p>
-            <w:pPr>
-              <w:pStyle w:val="Compact"/>
-              <w:keepNext/>
-              <w:jc w:val="left"/>
-            </w:pPr>
-            <w:r>
-              <w:t xml:space="preserve">[PLACEHOLDER: name]</w:t>
-            </w:r>
-          </w:p>
-        </w:tc>
-        <w:tc>
-          <w:tcPr/>
-          <w:p>
-            <w:pPr>
-              <w:pStyle w:val="Compact"/>
-              <w:keepNext/>
-              <w:jc w:val="left"/>
-            </w:pPr>
-            <w:r>
-              <w:t xml:space="preserve">[PLACEHOLDER: reg. no.]</w:t>
-            </w:r>
-          </w:p>
-        </w:tc>
-        <w:tc>
-          <w:tcPr/>
-          <w:p>
-            <w:pPr>
-              <w:pStyle w:val="Compact"/>
-              <w:keepNext/>
-            </w:pPr>
-          </w:p>
-        </w:tc>
-        <w:tc>
-          <w:tcPr/>
-          <w:p>
-            <w:pPr>
-              <w:pStyle w:val="Compact"/>
-              <w:keepNext/>
-            </w:pPr>
-          </w:p>
-        </w:tc>
-        <w:tc>
-          <w:tcPr/>
-          <w:p>
-            <w:pPr>
-              <w:pStyle w:val="Compact"/>
-              <w:keepNext/>
-            </w:pPr>
-          </w:p>
-        </w:tc>
-        <w:tc>
-          <w:tcPr/>
-          <w:p>
-            <w:pPr>
-              <w:pStyle w:val="Compact"/>
-              <w:keepNext/>
-            </w:pPr>
-          </w:p>
-        </w:tc>
-        <w:tc>
-          <w:tcPr/>
-          <w:p>
-            <w:pPr>
-              <w:pStyle w:val="Compact"/>
-              <w:keepNext/>
-            </w:pPr>
-          </w:p>
-        </w:tc>
-      </w:tr>
-      <w:tr>
-        <w:trPr>
-          <w:cantSplit/>
-        </w:trPr>
-        <w:tc>
-          <w:tcPr/>
-          <w:p>
-            <w:pPr>
-              <w:pStyle w:val="Compact"/>
-              <w:keepNext/>
-              <w:jc w:val="left"/>
-            </w:pPr>
-            <w:r>
-              <w:t xml:space="preserve">[PLACEHOLDER: name]</w:t>
-            </w:r>
-          </w:p>
-        </w:tc>
-        <w:tc>
-          <w:tcPr/>
-          <w:p>
-            <w:pPr>
-              <w:pStyle w:val="Compact"/>
-              <w:keepNext/>
-              <w:jc w:val="left"/>
-            </w:pPr>
-            <w:r>
-              <w:t xml:space="preserve">[PLACEHOLDER: reg. no.]</w:t>
-            </w:r>
-          </w:p>
-        </w:tc>
-        <w:tc>
-          <w:tcPr/>
-          <w:p>
-            <w:pPr>
-              <w:pStyle w:val="Compact"/>
-              <w:keepNext/>
-            </w:pPr>
-          </w:p>
-        </w:tc>
-        <w:tc>
-          <w:tcPr/>
-          <w:p>
-            <w:pPr>
-              <w:pStyle w:val="Compact"/>
-              <w:keepNext/>
-            </w:pPr>
-          </w:p>
-        </w:tc>
-        <w:tc>
-          <w:tcPr/>
-          <w:p>
-            <w:pPr>
-              <w:pStyle w:val="Compact"/>
-              <w:keepNext/>
-            </w:pPr>
-          </w:p>
-        </w:tc>
-        <w:tc>
-          <w:tcPr/>
-          <w:p>
-            <w:pPr>
-              <w:pStyle w:val="Compact"/>
-              <w:keepNext/>
-            </w:pPr>
-          </w:p>
-        </w:tc>
-        <w:tc>
-          <w:tcPr/>
-          <w:p>
-            <w:pPr>
-              <w:pStyle w:val="Compact"/>
-              <w:keepNext/>
-            </w:pPr>
-          </w:p>
-        </w:tc>
-      </w:tr>
-      <w:tr>
-        <w:trPr>
-          <w:cantSplit/>
-        </w:trPr>
-        <w:tc>
-          <w:tcPr/>
-          <w:p>
-            <w:pPr>
-              <w:pStyle w:val="Compact"/>
-              <w:keepNext/>
-              <w:jc w:val="left"/>
-            </w:pPr>
-            <w:r>
-              <w:t xml:space="preserve">[PLACEHOLDER: name]</w:t>
-            </w:r>
-          </w:p>
-        </w:tc>
-        <w:tc>
-          <w:tcPr/>
-          <w:p>
-            <w:pPr>
-              <w:pStyle w:val="Compact"/>
-              <w:keepNext/>
-              <w:jc w:val="left"/>
-            </w:pPr>
-            <w:r>
-              <w:t xml:space="preserve">[PLACEHOLDER: reg. no.]</w:t>
-            </w:r>
-          </w:p>
-        </w:tc>
-        <w:tc>
-          <w:tcPr/>
-          <w:p>
-            <w:pPr>
-              <w:pStyle w:val="Compact"/>
-              <w:keepNext/>
-            </w:pPr>
-          </w:p>
-        </w:tc>
-        <w:tc>
-          <w:tcPr/>
-          <w:p>
-            <w:pPr>
-              <w:pStyle w:val="Compact"/>
-              <w:keepNext/>
-            </w:pPr>
-          </w:p>
-        </w:tc>
-        <w:tc>
-          <w:tcPr/>
-          <w:p>
-            <w:pPr>
-              <w:pStyle w:val="Compact"/>
-              <w:keepNext/>
-            </w:pPr>
-          </w:p>
-        </w:tc>
-        <w:tc>
-          <w:tcPr/>
-          <w:p>
-            <w:pPr>
-              <w:pStyle w:val="Compact"/>
-              <w:keepNext/>
-            </w:pPr>
-          </w:p>
-        </w:tc>
-        <w:tc>
-          <w:tcPr/>
-          <w:p>
-            <w:pPr>
-              <w:pStyle w:val="Compact"/>
-              <w:keepNext/>
-            </w:pPr>
-          </w:p>
-        </w:tc>
-      </w:tr>
-      <w:tr>
-        <w:trPr>
-          <w:cantSplit/>
-        </w:trPr>
-        <w:tc>
-          <w:tcPr/>
-          <w:p>
-            <w:pPr>
-              <w:pStyle w:val="Compact"/>
-              <w:keepNext/>
-              <w:jc w:val="left"/>
-            </w:pPr>
-            <w:r>
-              <w:t xml:space="preserve">[PLACEHOLDER: name]</w:t>
-            </w:r>
-          </w:p>
-        </w:tc>
-        <w:tc>
-          <w:tcPr/>
-          <w:p>
-            <w:pPr>
-              <w:pStyle w:val="Compact"/>
-              <w:keepNext/>
-              <w:jc w:val="left"/>
-            </w:pPr>
-            <w:r>
-              <w:t xml:space="preserve">[PLACEHOLDER: reg. no.]</w:t>
-            </w:r>
-          </w:p>
-        </w:tc>
-        <w:tc>
-          <w:tcPr/>
-          <w:p>
-            <w:pPr>
-              <w:pStyle w:val="Compact"/>
-              <w:keepNext/>
-            </w:pPr>
-          </w:p>
-        </w:tc>
-        <w:tc>
-          <w:tcPr/>
-          <w:p>
-            <w:pPr>
-              <w:pStyle w:val="Compact"/>
-              <w:keepNext/>
-            </w:pPr>
-          </w:p>
-        </w:tc>
-        <w:tc>
-          <w:tcPr/>
-          <w:p>
-            <w:pPr>
-              <w:pStyle w:val="Compact"/>
-              <w:keepNext/>
-            </w:pPr>
-          </w:p>
-        </w:tc>
-        <w:tc>
-          <w:tcPr/>
-          <w:p>
-            <w:pPr>
-              <w:pStyle w:val="Compact"/>
-              <w:keepNext/>
-            </w:pPr>
-          </w:p>
-        </w:tc>
-        <w:tc>
-          <w:tcPr/>
-          <w:p>
-            <w:pPr>
-              <w:pStyle w:val="Compact"/>
-              <w:keepNext/>
-            </w:pPr>
-          </w:p>
-        </w:tc>
-      </w:tr>
-      <w:tr>
-        <w:trPr>
-          <w:cantSplit/>
-        </w:trPr>
-        <w:tc>
-          <w:tcPr/>
-          <w:p>
-            <w:pPr>
-              <w:pStyle w:val="Compact"/>
-              <w:jc w:val="left"/>
-            </w:pPr>
-            <w:r>
-              <w:t xml:space="preserve">[PLACEHOLDER: name]</w:t>
-            </w:r>
-          </w:p>
-        </w:tc>
-        <w:tc>
-          <w:tcPr/>
-          <w:p>
-            <w:pPr>
-              <w:pStyle w:val="Compact"/>
-              <w:jc w:val="left"/>
-            </w:pPr>
-            <w:r>
-              <w:t xml:space="preserve">[PLACEHOLDER: reg. no.]</w:t>
-            </w:r>
-          </w:p>
-        </w:tc>
-        <w:tc>
-          <w:tcPr/>
-          <w:p>
-            <w:pPr>
-              <w:pStyle w:val="Compact"/>
-            </w:pPr>
-          </w:p>
-        </w:tc>
-        <w:tc>
-          <w:tcPr/>
-          <w:p>
-            <w:pPr>
-              <w:pStyle w:val="Compact"/>
-            </w:pPr>
-          </w:p>
-        </w:tc>
-        <w:tc>
-          <w:tcPr/>
-          <w:p>
-            <w:pPr>
-              <w:pStyle w:val="Compact"/>
-            </w:pPr>
-          </w:p>
-        </w:tc>
-        <w:tc>
-          <w:tcPr/>
-          <w:p>
-            <w:pPr>
-              <w:pStyle w:val="Compact"/>
-            </w:pPr>
+              <w:t xml:space="preserve">Viva</w:t>
+            </w:r>
+          </w:p>
+        </w:tc>
+        <w:tc>
+          <w:tcPr/>
+          <w:p>
+            <w:pPr>
+              <w:pStyle w:val="Compact"/>
+              <w:keepNext/>
+              <w:jc w:val="left"/>
+            </w:pPr>
+            <w:r>
+              <w:rPr>
+                <w:b/>
+              </w:rPr>
+              <w:t xml:space="preserve">Sign</w:t>
+            </w:r>
+          </w:p>
+        </w:tc>
+      </w:tr>
+      <w:tr>
+        <w:trPr>
+          <w:cantSplit/>
+        </w:trPr>
+        <w:tc>
+          <w:tcPr/>
+          <w:p>
+            <w:pPr>
+              <w:pStyle w:val="Compact"/>
+              <w:keepNext/>
+              <w:jc w:val="left"/>
+            </w:pPr>
+            <w:r>
+              <w:t xml:space="preserve">[Name]</w:t>
+            </w:r>
+          </w:p>
+        </w:tc>
+        <w:tc>
+          <w:tcPr/>
+          <w:p>
+            <w:pPr>
+              <w:pStyle w:val="Compact"/>
+              <w:keepNext/>
+              <w:jc w:val="left"/>
+            </w:pPr>
+            <w:r>
+              <w:t xml:space="preserve">[Reg. no.]</w:t>
+            </w:r>
+          </w:p>
+        </w:tc>
+        <w:tc>
+          <w:tcPr/>
+          <w:p>
+            <w:pPr>
+              <w:pStyle w:val="Compact"/>
+              <w:keepNext/>
+              <w:jc w:val="left"/>
+            </w:pPr>
+            <w:r>
+              <w:t xml:space="preserve">Network build</w:t>
+            </w:r>
+          </w:p>
+        </w:tc>
+        <w:tc>
+          <w:tcPr/>
+          <w:p>
+            <w:pPr>
+              <w:pStyle w:val="Compact"/>
+              <w:keepNext/>
+              <w:jc w:val="left"/>
+            </w:pPr>
+            <w:r>
+              <w:t xml:space="preserve">Topology and addressing plan; Stage 0 build in Packet Tracer; applying the Stage 1–3 scripts; saving running configurations; pilot steps P3, P7, P8</w:t>
+            </w:r>
+          </w:p>
+        </w:tc>
+        <w:tc>
+          <w:tcPr/>
+          <w:p>
+            <w:pPr>
+              <w:pStyle w:val="Compact"/>
+              <w:keepNext/>
+              <w:jc w:val="left"/>
+            </w:pPr>
+            <w:r>
+              <w:t xml:space="preserve">Test matrix expectations against the configurations (with Member 2)</w:t>
+            </w:r>
+          </w:p>
+        </w:tc>
+        <w:tc>
+          <w:tcPr/>
+          <w:p>
+            <w:pPr>
+              <w:pStyle w:val="Compact"/>
+              <w:keepNext/>
+              <w:jc w:val="left"/>
+            </w:pPr>
+            <w:r>
+              <w:t xml:space="preserve">B4–B6</w:t>
+            </w:r>
+          </w:p>
+        </w:tc>
+        <w:tc>
+          <w:tcPr/>
+          <w:p>
+            <w:pPr>
+              <w:pStyle w:val="Compact"/>
+              <w:keepNext/>
+            </w:pPr>
+          </w:p>
+        </w:tc>
+      </w:tr>
+      <w:tr>
+        <w:trPr>
+          <w:cantSplit/>
+        </w:trPr>
+        <w:tc>
+          <w:tcPr/>
+          <w:p>
+            <w:pPr>
+              <w:pStyle w:val="Compact"/>
+              <w:keepNext/>
+              <w:jc w:val="left"/>
+            </w:pPr>
+            <w:r>
+              <w:t xml:space="preserve">[Name]</w:t>
+            </w:r>
+          </w:p>
+        </w:tc>
+        <w:tc>
+          <w:tcPr/>
+          <w:p>
+            <w:pPr>
+              <w:pStyle w:val="Compact"/>
+              <w:keepNext/>
+              <w:jc w:val="left"/>
+            </w:pPr>
+            <w:r>
+              <w:t xml:space="preserve">[Reg. no.]</w:t>
+            </w:r>
+          </w:p>
+        </w:tc>
+        <w:tc>
+          <w:tcPr/>
+          <w:p>
+            <w:pPr>
+              <w:pStyle w:val="Compact"/>
+              <w:keepNext/>
+              <w:jc w:val="left"/>
+            </w:pPr>
+            <w:r>
+              <w:t xml:space="preserve">Testing and evidence</w:t>
+            </w:r>
+          </w:p>
+        </w:tc>
+        <w:tc>
+          <w:tcPr/>
+          <w:p>
+            <w:pPr>
+              <w:pStyle w:val="Compact"/>
+              <w:keepNext/>
+              <w:jc w:val="left"/>
+            </w:pPr>
+            <w:r>
+              <w:t xml:space="preserve">Test matrix and pass/fail criteria; running the 17 tests in Stages 0–3; results table; screenshots F01–F19</w:t>
+            </w:r>
+          </w:p>
+        </w:tc>
+        <w:tc>
+          <w:tcPr/>
+          <w:p>
+            <w:pPr>
+              <w:pStyle w:val="Compact"/>
+              <w:keepNext/>
+              <w:jc w:val="left"/>
+            </w:pPr>
+            <w:r>
+              <w:t xml:space="preserve">Stage scripts against the requirements (with Member 1)</w:t>
+            </w:r>
+          </w:p>
+        </w:tc>
+        <w:tc>
+          <w:tcPr/>
+          <w:p>
+            <w:pPr>
+              <w:pStyle w:val="Compact"/>
+              <w:keepNext/>
+              <w:jc w:val="left"/>
+            </w:pPr>
+            <w:r>
+              <w:t xml:space="preserve">B7, B9</w:t>
+            </w:r>
+          </w:p>
+        </w:tc>
+        <w:tc>
+          <w:tcPr/>
+          <w:p>
+            <w:pPr>
+              <w:pStyle w:val="Compact"/>
+              <w:keepNext/>
+            </w:pPr>
+          </w:p>
+        </w:tc>
+      </w:tr>
+      <w:tr>
+        <w:trPr>
+          <w:cantSplit/>
+        </w:trPr>
+        <w:tc>
+          <w:tcPr/>
+          <w:p>
+            <w:pPr>
+              <w:pStyle w:val="Compact"/>
+              <w:keepNext/>
+              <w:jc w:val="left"/>
+            </w:pPr>
+            <w:r>
+              <w:t xml:space="preserve">[Name]</w:t>
+            </w:r>
+          </w:p>
+        </w:tc>
+        <w:tc>
+          <w:tcPr/>
+          <w:p>
+            <w:pPr>
+              <w:pStyle w:val="Compact"/>
+              <w:keepNext/>
+              <w:jc w:val="left"/>
+            </w:pPr>
+            <w:r>
+              <w:t xml:space="preserve">[Reg. no.]</w:t>
+            </w:r>
+          </w:p>
+        </w:tc>
+        <w:tc>
+          <w:tcPr/>
+          <w:p>
+            <w:pPr>
+              <w:pStyle w:val="Compact"/>
+              <w:keepNext/>
+              <w:jc w:val="left"/>
+            </w:pPr>
+            <w:r>
+              <w:t xml:space="preserve">Literature</w:t>
+            </w:r>
+          </w:p>
+        </w:tc>
+        <w:tc>
+          <w:tcPr/>
+          <w:p>
+            <w:pPr>
+              <w:pStyle w:val="Compact"/>
+              <w:keepNext/>
+              <w:jc w:val="left"/>
+            </w:pPr>
+            <w:r>
+              <w:t xml:space="preserve">Literature search; Part A Sections 1–4 in own words; comparison table (Table 1)</w:t>
+            </w:r>
+          </w:p>
+        </w:tc>
+        <w:tc>
+          <w:tcPr/>
+          <w:p>
+            <w:pPr>
+              <w:pStyle w:val="Compact"/>
+              <w:keepNext/>
+              <w:jc w:val="left"/>
+            </w:pPr>
+            <w:r>
+              <w:t xml:space="preserve">Reference claims for [1], [2], [9]–[13]</w:t>
+            </w:r>
+          </w:p>
+        </w:tc>
+        <w:tc>
+          <w:tcPr/>
+          <w:p>
+            <w:pPr>
+              <w:pStyle w:val="Compact"/>
+              <w:keepNext/>
+              <w:jc w:val="left"/>
+            </w:pPr>
+            <w:r>
+              <w:t xml:space="preserve">Part A</w:t>
+            </w:r>
+          </w:p>
+        </w:tc>
+        <w:tc>
+          <w:tcPr/>
+          <w:p>
+            <w:pPr>
+              <w:pStyle w:val="Compact"/>
+              <w:keepNext/>
+            </w:pPr>
+          </w:p>
+        </w:tc>
+      </w:tr>
+      <w:tr>
+        <w:trPr>
+          <w:cantSplit/>
+        </w:trPr>
+        <w:tc>
+          <w:tcPr/>
+          <w:p>
+            <w:pPr>
+              <w:pStyle w:val="Compact"/>
+              <w:keepNext/>
+              <w:jc w:val="left"/>
+            </w:pPr>
+            <w:r>
+              <w:t xml:space="preserve">[Name]</w:t>
+            </w:r>
+          </w:p>
+        </w:tc>
+        <w:tc>
+          <w:tcPr/>
+          <w:p>
+            <w:pPr>
+              <w:pStyle w:val="Compact"/>
+              <w:keepNext/>
+              <w:jc w:val="left"/>
+            </w:pPr>
+            <w:r>
+              <w:t xml:space="preserve">[Reg. no.]</w:t>
+            </w:r>
+          </w:p>
+        </w:tc>
+        <w:tc>
+          <w:tcPr/>
+          <w:p>
+            <w:pPr>
+              <w:pStyle w:val="Compact"/>
+              <w:keepNext/>
+              <w:jc w:val="left"/>
+            </w:pPr>
+            <w:r>
+              <w:t xml:space="preserve">Citations and standards</w:t>
+            </w:r>
+          </w:p>
+        </w:tc>
+        <w:tc>
+          <w:tcPr/>
+          <w:p>
+            <w:pPr>
+              <w:pStyle w:val="Compact"/>
+              <w:keepNext/>
+              <w:jc w:val="left"/>
+            </w:pPr>
+            <w:r>
+              <w:t xml:space="preserve">Reference list and verification record (Appendix B); standards sections ([3]–[7], [15], [16]); Stage 1 terminology check</w:t>
+            </w:r>
+          </w:p>
+        </w:tc>
+        <w:tc>
+          <w:tcPr/>
+          <w:p>
+            <w:pPr>
+              <w:pStyle w:val="Compact"/>
+              <w:keepNext/>
+              <w:jc w:val="left"/>
+            </w:pPr>
+            <w:r>
+              <w:t xml:space="preserve">Citations in Parts A–C; full-text checks</w:t>
+            </w:r>
+          </w:p>
+        </w:tc>
+        <w:tc>
+          <w:tcPr/>
+          <w:p>
+            <w:pPr>
+              <w:pStyle w:val="Compact"/>
+              <w:keepNext/>
+              <w:jc w:val="left"/>
+            </w:pPr>
+            <w:r>
+              <w:t xml:space="preserve">References, Part A §2.1, §2.4</w:t>
+            </w:r>
+          </w:p>
+        </w:tc>
+        <w:tc>
+          <w:tcPr/>
+          <w:p>
+            <w:pPr>
+              <w:pStyle w:val="Compact"/>
+              <w:keepNext/>
+            </w:pPr>
+          </w:p>
+        </w:tc>
+      </w:tr>
+      <w:tr>
+        <w:trPr>
+          <w:cantSplit/>
+        </w:trPr>
+        <w:tc>
+          <w:tcPr/>
+          <w:p>
+            <w:pPr>
+              <w:pStyle w:val="Compact"/>
+              <w:jc w:val="left"/>
+            </w:pPr>
+            <w:r>
+              <w:t xml:space="preserve">[Name]</w:t>
+            </w:r>
+          </w:p>
+        </w:tc>
+        <w:tc>
+          <w:tcPr/>
+          <w:p>
+            <w:pPr>
+              <w:pStyle w:val="Compact"/>
+              <w:jc w:val="left"/>
+            </w:pPr>
+            <w:r>
+              <w:t xml:space="preserve">[Reg. no.]</w:t>
+            </w:r>
+          </w:p>
+        </w:tc>
+        <w:tc>
+          <w:tcPr/>
+          <w:p>
+            <w:pPr>
+              <w:pStyle w:val="Compact"/>
+              <w:jc w:val="left"/>
+            </w:pPr>
+            <w:r>
+              <w:t xml:space="preserve">Integration and QC</w:t>
+            </w:r>
+          </w:p>
+        </w:tc>
+        <w:tc>
+          <w:tcPr/>
+          <w:p>
+            <w:pPr>
+              <w:pStyle w:val="Compact"/>
+              <w:jc w:val="left"/>
+            </w:pPr>
+            <w:r>
+              <w:t xml:space="preserve">Requirements matrix; metric definitions; configuration analysis; misconfiguration experiments M1/M2; Part C; final formatting</w:t>
+            </w:r>
+          </w:p>
+        </w:tc>
+        <w:tc>
+          <w:tcPr/>
+          <w:p>
+            <w:pPr>
+              <w:pStyle w:val="Compact"/>
+              <w:jc w:val="left"/>
+            </w:pPr>
+            <w:r>
+              <w:t xml:space="preserve">Whole report for consistency; numbers against evidence</w:t>
+            </w:r>
+          </w:p>
+        </w:tc>
+        <w:tc>
+          <w:tcPr/>
+          <w:p>
+            <w:pPr>
+              <w:pStyle w:val="Compact"/>
+              <w:jc w:val="left"/>
+            </w:pPr>
+            <w:r>
+              <w:t xml:space="preserve">B1–B3, B8, Part C</w:t>
+            </w:r>
           </w:p>
         </w:tc>
         <w:tc>
@@ -14537,8 +15072,8 @@
         </w:tc>
       </w:tr>
     </w:tbl>
-    <w:bookmarkEnd w:id="45"/>
-    <w:bookmarkStart w:id="46" w:name="appendix-a-configuration-sources"/>
+    <w:bookmarkEnd w:id="46"/>
+    <w:bookmarkStart w:id="47" w:name="appendix-a-configuration-sources"/>
     <w:p>
       <w:pPr>
         <w:pStyle w:val="Heading1"/>
@@ -14978,8 +15513,8 @@
         <w:t xml:space="preserve">outputs after the build.]</w:t>
       </w:r>
     </w:p>
-    <w:bookmarkEnd w:id="46"/>
-    <w:bookmarkStart w:id="47" w:name="appendix-b-reference-verification-record"/>
+    <w:bookmarkEnd w:id="47"/>
+    <w:bookmarkStart w:id="48" w:name="appendix-b-reference-verification-record"/>
     <w:p>
       <w:pPr>
         <w:pStyle w:val="Heading1"/>
@@ -16077,7 +16612,7 @@
         <w:pStyle w:val="Compact"/>
         <w:numPr>
           <w:ilvl w:val="0"/>
-          <w:numId w:val="1010"/>
+          <w:numId w:val="1011"/>
         </w:numPr>
       </w:pPr>
       <w:r>
@@ -16099,7 +16634,7 @@
         <w:pStyle w:val="Compact"/>
         <w:numPr>
           <w:ilvl w:val="0"/>
-          <w:numId w:val="1010"/>
+          <w:numId w:val="1011"/>
         </w:numPr>
       </w:pPr>
       <w:r>
@@ -16137,7 +16672,7 @@
         <w:pStyle w:val="Compact"/>
         <w:numPr>
           <w:ilvl w:val="0"/>
-          <w:numId w:val="1010"/>
+          <w:numId w:val="1011"/>
         </w:numPr>
       </w:pPr>
       <w:r>
@@ -16154,7 +16689,7 @@
         <w:t xml:space="preserve">every claim must be checked against the full text before submission (last column above).</w:t>
       </w:r>
     </w:p>
-    <w:bookmarkEnd w:id="47"/>
+    <w:bookmarkEnd w:id="48"/>
     <w:sectPr>
       <w:footerReference w:type="default" r:id="rIdFooterPg"/>
       <w:pgSz w:w="11906" w:h="16838"/>
@@ -16534,7 +17069,34 @@
     </w:lvlOverride>
   </w:num>
   <w:num w:numId="1004">
-    <w:abstractNumId w:val="991"/>
+    <w:abstractNumId w:val="99411"/>
+    <w:lvlOverride w:ilvl="0">
+      <w:startOverride w:val="1"/>
+    </w:lvlOverride>
+    <w:lvlOverride w:ilvl="1">
+      <w:startOverride w:val="1"/>
+    </w:lvlOverride>
+    <w:lvlOverride w:ilvl="2">
+      <w:startOverride w:val="1"/>
+    </w:lvlOverride>
+    <w:lvlOverride w:ilvl="3">
+      <w:startOverride w:val="1"/>
+    </w:lvlOverride>
+    <w:lvlOverride w:ilvl="4">
+      <w:startOverride w:val="1"/>
+    </w:lvlOverride>
+    <w:lvlOverride w:ilvl="5">
+      <w:startOverride w:val="1"/>
+    </w:lvlOverride>
+    <w:lvlOverride w:ilvl="6">
+      <w:startOverride w:val="1"/>
+    </w:lvlOverride>
+    <w:lvlOverride w:ilvl="7">
+      <w:startOverride w:val="1"/>
+    </w:lvlOverride>
+    <w:lvlOverride w:ilvl="8">
+      <w:startOverride w:val="1"/>
+    </w:lvlOverride>
   </w:num>
   <w:num w:numId="1005">
     <w:abstractNumId w:val="991"/>
@@ -16554,6 +17116,9 @@
   <w:num w:numId="1010">
     <w:abstractNumId w:val="991"/>
   </w:num>
+  <w:num w:numId="1011">
+    <w:abstractNumId w:val="991"/>
+  </w:num>
 </w:numbering>
 </file>
 
@@ -16562,9 +17127,9 @@
   <w:docDefaults>
     <w:rPrDefault>
       <w:rPr>
-        <w:rFonts w:ascii="Times New Roman" w:cs="Times New Roman" w:eastAsia="Times New Roman" w:hAnsi="Times New Roman"/>
-        <w:sz w:val="24"/>
-        <w:szCs w:val="24"/>
+        <w:rFonts w:ascii="Arial" w:cs="Arial" w:eastAsia="Arial" w:hAnsi="Arial"/>
+        <w:sz w:val="22"/>
+        <w:szCs w:val="22"/>
         <w:lang w:bidi="ar-SA" w:eastAsia="en-US" w:val="en-US"/>
       </w:rPr>
     </w:rPrDefault>
@@ -16619,12 +17184,12 @@
       <w:jc w:val="center"/>
     </w:pPr>
     <w:rPr>
-      <w:rFonts w:ascii="Times New Roman" w:cs="Times New Roman" w:eastAsia="Times New Roman" w:hAnsi="Times New Roman"/>
+      <w:rFonts w:ascii="Arial" w:cs="Arial" w:eastAsia="Arial" w:hAnsi="Arial"/>
       <w:b/>
       <w:bCs/>
       <w:color w:val="000000"/>
-      <w:sz w:val="34"/>
-      <w:szCs w:val="34"/>
+      <w:sz w:val="32"/>
+      <w:szCs w:val="32"/>
     </w:rPr>
   </w:style>
   <w:style w:styleId="Subtitle" w:type="paragraph">
@@ -16639,7 +17204,7 @@
       <w:jc w:val="center"/>
     </w:pPr>
     <w:rPr>
-      <w:rFonts w:ascii="Times New Roman" w:cs="Times New Roman" w:eastAsia="Times New Roman" w:hAnsi="Times New Roman"/>
+      <w:rFonts w:ascii="Arial" w:cs="Arial" w:eastAsia="Arial" w:hAnsi="Arial"/>
       <w:color w:val="000000"/>
       <w:sz w:val="24"/>
       <w:szCs w:val="24"/>
@@ -16719,7 +17284,7 @@
       <w:outlineLvl w:val="0"/>
     </w:pPr>
     <w:rPr>
-      <w:rFonts w:ascii="Times New Roman" w:cs="Times New Roman" w:eastAsia="Times New Roman" w:hAnsi="Times New Roman"/>
+      <w:rFonts w:ascii="Arial" w:cs="Arial" w:eastAsia="Arial" w:hAnsi="Arial"/>
       <w:b/>
       <w:bCs/>
       <w:color w:val="000000"/>
@@ -16741,12 +17306,12 @@
       <w:outlineLvl w:val="1"/>
     </w:pPr>
     <w:rPr>
-      <w:rFonts w:ascii="Times New Roman" w:cs="Times New Roman" w:eastAsia="Times New Roman" w:hAnsi="Times New Roman"/>
+      <w:rFonts w:ascii="Arial" w:cs="Arial" w:eastAsia="Arial" w:hAnsi="Arial"/>
       <w:b/>
       <w:bCs/>
       <w:color w:val="000000"/>
-      <w:sz w:val="26"/>
-      <w:szCs w:val="26"/>
+      <w:sz w:val="24"/>
+      <w:szCs w:val="24"/>
     </w:rPr>
   </w:style>
   <w:style w:styleId="Heading3" w:type="paragraph">
@@ -16763,12 +17328,12 @@
       <w:outlineLvl w:val="2"/>
     </w:pPr>
     <w:rPr>
-      <w:rFonts w:ascii="Times New Roman" w:cs="Times New Roman" w:eastAsia="Times New Roman" w:hAnsi="Times New Roman"/>
+      <w:rFonts w:ascii="Arial" w:cs="Arial" w:eastAsia="Arial" w:hAnsi="Arial"/>
       <w:b/>
       <w:bCs/>
       <w:color w:val="000000"/>
-      <w:sz w:val="24"/>
-      <w:szCs w:val="24"/>
+      <w:sz w:val="22"/>
+      <w:szCs w:val="22"/>
     </w:rPr>
   </w:style>
   <w:style w:styleId="Heading4" w:type="paragraph">
@@ -16785,14 +17350,14 @@
       <w:outlineLvl w:val="3"/>
     </w:pPr>
     <w:rPr>
-      <w:rFonts w:ascii="Times New Roman" w:cs="Times New Roman" w:eastAsia="Times New Roman" w:hAnsi="Times New Roman"/>
+      <w:rFonts w:ascii="Arial" w:cs="Arial" w:eastAsia="Arial" w:hAnsi="Arial"/>
       <w:b/>
       <w:bCs/>
       <w:i/>
       <w:iCs/>
       <w:color w:val="000000"/>
-      <w:sz w:val="24"/>
-      <w:szCs w:val="24"/>
+      <w:sz w:val="22"/>
+      <w:szCs w:val="22"/>
     </w:rPr>
   </w:style>
   <w:style w:styleId="Heading5" w:type="paragraph">
@@ -16928,8 +17493,8 @@
     <w:unhideWhenUsed/>
     <w:qFormat/>
     <w:rPr>
-      <w:sz w:val="20"/>
-      <w:szCs w:val="20"/>
+      <w:sz w:val="18"/>
+      <w:szCs w:val="18"/>
     </w:rPr>
     <w:tblPr>
       <w:tblInd w:type="dxa" w:w="0"/>

</xml_diff>

<commit_message>
Complete the non-result parts of the case study
- Figure 1: planned topology with enforcement points, drawn from the
  addressing plan by tools/draw_topology.py (labelled as a design
  drawing; the Packet Tracer screenshot F01 is still to be added)
- B11 Conclusion of the case study: what is complete, what still needs
  the Packet Tracer runs
- Appendix C: ACL portions of the Stage 1-3 scripts (entry counts match
  Table 6: 11 / 26 / 40 with carried-over ACLs)
- build-docx.py: resource path for figures; PNG content type

Co-Authored-By: Claude Opus 5.5 <noreply@anthropic.com>
Claude-Session: https://claude.ai/code/session_01VZE4XfkebTWLatWpMU9HD1
</commit_message>
<xml_diff>
--- a/report/case-study-draft-rev.docx
+++ b/report/case-study-draft-rev.docx
@@ -757,7 +757,7 @@
         <w:t xml:space="preserve"> </w:t>
       </w:r>
       <w:r>
-        <w:t xml:space="preserve">All figures will be screenshots taken from our own Packet Tracer simulation.</w:t>
+        <w:t xml:space="preserve">Figure 1 is a design drawing of the planned topology, made from our addressing plan. All other figures will be screenshots taken from our own Packet Tracer simulation;</w:t>
       </w:r>
       <w:r>
         <w:t xml:space="preserve"> </w:t>
@@ -767,13 +767,10 @@
           <w:bCs/>
           <w:b/>
         </w:rPr>
-        <w:t xml:space="preserve">None has been captured yet.</w:t>
-      </w:r>
-      <w:r>
-        <w:t xml:space="preserve"> </w:t>
-      </w:r>
-      <w:r>
-        <w:t xml:space="preserve">Table 10 lists the planned figures.</w:t>
+        <w:t xml:space="preserve">none has been captured yet</w:t>
+      </w:r>
+      <w:r>
+        <w:t xml:space="preserve">. Table 10 lists the planned screenshots.</w:t>
       </w:r>
     </w:p>
     <w:p>
@@ -3283,7 +3280,7 @@
     <w:bookmarkEnd w:id="31"/>
     <w:bookmarkEnd w:id="32"/>
     <w:bookmarkEnd w:id="33"/>
-    <w:bookmarkStart w:id="44" w:name="part-b-simulation-based-case-study"/>
+    <w:bookmarkStart w:id="48" w:name="part-b-simulation-based-case-study"/>
     <w:p>
       <w:pPr>
         <w:pStyle w:val="Heading1"/>
@@ -5035,7 +5032,7 @@
       </w:r>
     </w:p>
     <w:bookmarkEnd w:id="36"/>
-    <w:bookmarkStart w:id="37" w:name="b4.-network-design"/>
+    <w:bookmarkStart w:id="40" w:name="b4.-network-design"/>
     <w:p>
       <w:pPr>
         <w:pStyle w:val="Heading2"/>
@@ -6024,14 +6021,69 @@
     </w:p>
     <w:p>
       <w:pPr>
+        <w:pStyle w:val="CaptionedFigure"/>
+      </w:pPr>
+      <w:r>
+        <w:drawing>
+          <wp:inline>
+            <wp:extent cx="5334000" cy="3955211"/>
+            <wp:effectExtent b="0" l="0" r="0" t="0"/>
+            <wp:docPr descr="Figure 1. Planned network topology and enforcement points (AP1–AP7). Design drawing made from our addressing plan; the Packet Tracer screenshot (F01) will be added after the build." title="" id="38" name="Picture"/>
+            <a:graphic>
+              <a:graphicData uri="http://schemas.openxmlformats.org/drawingml/2006/picture">
+                <pic:pic>
+                  <pic:nvPicPr>
+                    <pic:cNvPr descr="../figures/design-topology.png" id="39" name="Picture"/>
+                    <pic:cNvPicPr>
+                      <a:picLocks noChangeArrowheads="1" noChangeAspect="1"/>
+                    </pic:cNvPicPr>
+                  </pic:nvPicPr>
+                  <pic:blipFill>
+                    <a:blip r:embed="rId37"/>
+                    <a:stretch>
+                      <a:fillRect/>
+                    </a:stretch>
+                  </pic:blipFill>
+                  <pic:spPr bwMode="auto">
+                    <a:xfrm>
+                      <a:off x="0" y="0"/>
+                      <a:ext cx="5334000" cy="3955211"/>
+                    </a:xfrm>
+                    <a:prstGeom prst="rect">
+                      <a:avLst/>
+                    </a:prstGeom>
+                    <a:noFill/>
+                    <a:ln w="9525">
+                      <a:noFill/>
+                      <a:headEnd/>
+                      <a:tailEnd/>
+                    </a:ln>
+                  </pic:spPr>
+                </pic:pic>
+              </a:graphicData>
+            </a:graphic>
+          </wp:inline>
+        </w:drawing>
+      </w:r>
+    </w:p>
+    <w:p>
+      <w:pPr>
+        <w:pStyle w:val="ImageCaption"/>
+      </w:pPr>
+      <w:r>
+        <w:t xml:space="preserve">Figure 1. Planned network topology and enforcement points (AP1–AP7). Design drawing made from our addressing plan; the Packet Tracer screenshot (F01) will be added after the build.</w:t>
+      </w:r>
+    </w:p>
+    <w:p>
+      <w:pPr>
         <w:pStyle w:val="BodyText"/>
       </w:pPr>
       <w:r>
-        <w:t xml:space="preserve">[PLACEHOLDER: Figure F01, topology screenshot.]</w:t>
-      </w:r>
-    </w:p>
-    <w:bookmarkEnd w:id="37"/>
-    <w:bookmarkStart w:id="38" w:name="X58f26ca0c760d2c91008adc2fb95ca2331fe3d9"/>
+        <w:t xml:space="preserve">[PLACEHOLDER: Figure F01, topology screenshot from our Packet Tracer file.]</w:t>
+      </w:r>
+    </w:p>
+    <w:bookmarkEnd w:id="40"/>
+    <w:bookmarkStart w:id="41" w:name="X58f26ca0c760d2c91008adc2fb95ca2331fe3d9"/>
     <w:p>
       <w:pPr>
         <w:pStyle w:val="Heading2"/>
@@ -6213,8 +6265,8 @@
         <w:t xml:space="preserve">[PLACEHOLDER: Figures F02–F04, VLAN, trunk and route outputs and the Stage 0 baseline.]</w:t>
       </w:r>
     </w:p>
-    <w:bookmarkEnd w:id="38"/>
-    <w:bookmarkStart w:id="39" w:name="b6.-implementation-ii-policy-stages"/>
+    <w:bookmarkEnd w:id="41"/>
+    <w:bookmarkStart w:id="42" w:name="b6.-implementation-ii-policy-stages"/>
     <w:p>
       <w:pPr>
         <w:pStyle w:val="Heading2"/>
@@ -7561,8 +7613,8 @@
         <w:t xml:space="preserve">entry would block both. We have deliberately not added a data-port rule in advance. If pilot P7 shows that one is needed, the team will choose between adding one minimal entry and moving the finance service to HTTPS, and will record that decision. The forbidden FTP tests (T08, T09 and T16) depend only on the control connection being refused, so the data-channel question does not affect them. If an entry is added, T04, T08 and T16 will be re-run to show that it does not open FTP to anyone else.</w:t>
       </w:r>
     </w:p>
-    <w:bookmarkEnd w:id="39"/>
-    <w:bookmarkStart w:id="40" w:name="b7.-testing-procedure"/>
+    <w:bookmarkEnd w:id="42"/>
+    <w:bookmarkStart w:id="43" w:name="b7.-testing-procedure"/>
     <w:p>
       <w:pPr>
         <w:pStyle w:val="Heading2"/>
@@ -12099,8 +12151,8 @@
         </w:tc>
       </w:tr>
     </w:tbl>
-    <w:bookmarkEnd w:id="40"/>
-    <w:bookmarkStart w:id="41" w:name="Xa247a0f7f7bb1e1d5af4c67e6a739ffb32fbd37"/>
+    <w:bookmarkEnd w:id="43"/>
+    <w:bookmarkStart w:id="44" w:name="Xa247a0f7f7bb1e1d5af4c67e6a739ffb32fbd37"/>
     <w:p>
       <w:pPr>
         <w:pStyle w:val="Heading2"/>
@@ -12519,8 +12571,8 @@
         </w:tc>
       </w:tr>
     </w:tbl>
-    <w:bookmarkEnd w:id="41"/>
-    <w:bookmarkStart w:id="42" w:name="b9.-results-and-discussion"/>
+    <w:bookmarkEnd w:id="44"/>
+    <w:bookmarkStart w:id="45" w:name="b9.-results-and-discussion"/>
     <w:p>
       <w:pPr>
         <w:pStyle w:val="Heading2"/>
@@ -13239,8 +13291,8 @@
         <w:t xml:space="preserve">[PLACEHOLDER: discussion of results, to be written after measurement. Assess E1–E4 as supported, partly supported or not supported, using only observed data.]</w:t>
       </w:r>
     </w:p>
-    <w:bookmarkEnd w:id="42"/>
-    <w:bookmarkStart w:id="43" w:name="b10.-evidence-plan"/>
+    <w:bookmarkEnd w:id="45"/>
+    <w:bookmarkStart w:id="46" w:name="b10.-evidence-plan"/>
     <w:p>
       <w:pPr>
         <w:pStyle w:val="Heading2"/>
@@ -13970,17 +14022,96 @@
         </w:tc>
       </w:tr>
     </w:tbl>
-    <w:p>
-      <w:pPr>
-        <w:spacing w:before="160"/>
-      </w:pPr>
+    <w:bookmarkEnd w:id="46"/>
+    <w:bookmarkStart w:id="47" w:name="b11.-conclusion-of-the-case-study"/>
+    <w:p>
+      <w:pPr>
+        <w:pStyle w:val="Heading2"/>
+      </w:pPr>
+      <w:r>
+        <w:t xml:space="preserve">B11. Conclusion of the Case Study</w:t>
+      </w:r>
+    </w:p>
+    <w:p>
+      <w:pPr>
+        <w:pStyle w:val="FirstParagraph"/>
+      </w:pPr>
+      <w:r>
+        <w:rPr>
+          <w:bCs/>
+          <w:b/>
+        </w:rPr>
+        <w:t xml:space="preserve">What is complete.</w:t>
+      </w:r>
+      <w:r>
+        <w:t xml:space="preserve"> </w:t>
+      </w:r>
+      <w:r>
+        <w:t xml:space="preserve">The case study is fully designed. We have a 19-device network plan, a written list of eight required and seven forbidden flows, three policy stages applied at the same seven enforcement points, 26 designed test cases (17 to be run in this draft), two controlled misconfiguration experiments, and metric definitions fixed before any measurement. The configuration-derived figures in Table 6 already show the cost side of the trade-off we set out to study: from Stage 1 to Stage 3, explicit entries rise from 11 to 40 and order-dependent pairs from 0 to 24, while the edge ACL becomes shorter but stricter.</w:t>
+      </w:r>
+    </w:p>
+    <w:p>
+      <w:pPr>
+        <w:pStyle w:val="BodyText"/>
+      </w:pPr>
+      <w:r>
+        <w:rPr>
+          <w:bCs/>
+          <w:b/>
+        </w:rPr>
+        <w:t xml:space="preserve">What remains.</w:t>
+      </w:r>
+      <w:r>
+        <w:t xml:space="preserve"> </w:t>
+      </w:r>
+      <w:r>
+        <w:t xml:space="preserve">The security side (how much unnecessary access each stage actually leaves) can only come from running the tests in Packet Tracer. Until then, E1–E4 in B1 remain expectations. [PLACEHOLDER: after the runs, state in three or four sentences whether E1–E4 were supported, partly supported or not supported, citing Table 7 and Table 9.]</w:t>
+      </w:r>
+    </w:p>
+    <w:p>
+      <w:pPr>
+        <w:pStyle w:val="BodyText"/>
+      </w:pPr>
+      <w:r>
+        <w:rPr>
+          <w:bCs/>
+          <w:b/>
+        </w:rPr>
+        <w:t xml:space="preserve">Lesson so far.</w:t>
+      </w:r>
+      <w:r>
+        <w:t xml:space="preserve"> </w:t>
+      </w:r>
+      <w:r>
+        <w:t xml:space="preserve">Writing the required and forbidden flows down first was what made the comparison possible: without Table 2 there would be no fixed definition of</w:t>
+      </w:r>
+      <w:r>
+        <w:t xml:space="preserve"> </w:t>
+      </w:r>
+      <w:r>
+        <w:t xml:space="preserve">“</w:t>
+      </w:r>
+      <w:r>
+        <w:t xml:space="preserve">unnecessary</w:t>
+      </w:r>
+      <w:r>
+        <w:t xml:space="preserve">”</w:t>
+      </w:r>
+      <w:r>
+        <w:t xml:space="preserve"> </w:t>
+      </w:r>
+      <w:r>
+        <w:t xml:space="preserve">access to measure each stage against.</w:t>
+      </w:r>
+    </w:p>
+    <w:p>
       <w:r>
         <w:br w:type="page"/>
       </w:r>
     </w:p>
-    <w:bookmarkEnd w:id="43"/>
-    <w:bookmarkEnd w:id="44"/>
-    <w:bookmarkStart w:id="45" w:name="X6f293ca93e6b1c028848361a6efc65d7760ed14"/>
+    <w:bookmarkEnd w:id="47"/>
+    <w:bookmarkEnd w:id="48"/>
+    <w:bookmarkStart w:id="49" w:name="X6f293ca93e6b1c028848361a6efc65d7760ed14"/>
     <w:p>
       <w:pPr>
         <w:pStyle w:val="Heading1"/>
@@ -14457,8 +14588,8 @@
         <w:br w:type="page"/>
       </w:r>
     </w:p>
-    <w:bookmarkEnd w:id="45"/>
-    <w:bookmarkStart w:id="46" w:name="individual-contribution-statement"/>
+    <w:bookmarkEnd w:id="49"/>
+    <w:bookmarkStart w:id="50" w:name="individual-contribution-statement"/>
     <w:p>
       <w:pPr>
         <w:pStyle w:val="Heading1"/>
@@ -15072,8 +15203,8 @@
         </w:tc>
       </w:tr>
     </w:tbl>
-    <w:bookmarkEnd w:id="46"/>
-    <w:bookmarkStart w:id="47" w:name="appendix-a-configuration-sources"/>
+    <w:bookmarkEnd w:id="50"/>
+    <w:bookmarkStart w:id="51" w:name="appendix-a-configuration-sources"/>
     <w:p>
       <w:pPr>
         <w:pStyle w:val="Heading1"/>
@@ -15513,8 +15644,1794 @@
         <w:t xml:space="preserve">outputs after the build.]</w:t>
       </w:r>
     </w:p>
-    <w:bookmarkEnd w:id="47"/>
-    <w:bookmarkStart w:id="48" w:name="appendix-b-reference-verification-record"/>
+    <w:bookmarkEnd w:id="51"/>
+    <w:bookmarkStart w:id="55" w:name="X86e75e02aa72984c798d30d13de2ceb40b8940e"/>
+    <w:p>
+      <w:pPr>
+        <w:pStyle w:val="Heading1"/>
+      </w:pPr>
+      <w:r>
+        <w:t xml:space="preserve">Appendix C — Policy Configuration Scripts (Stages 1–3)</w:t>
+      </w:r>
+    </w:p>
+    <w:p>
+      <w:pPr>
+        <w:pStyle w:val="FirstParagraph"/>
+      </w:pPr>
+      <w:r>
+        <w:t xml:space="preserve">These are the ACL parts of our configuration scripts, as planned. They have</w:t>
+      </w:r>
+      <w:r>
+        <w:t xml:space="preserve"> </w:t>
+      </w:r>
+      <w:r>
+        <w:rPr>
+          <w:bCs/>
+          <w:b/>
+        </w:rPr>
+        <w:t xml:space="preserve">not yet been applied in Packet Tracer</w:t>
+      </w:r>
+      <w:r>
+        <w:t xml:space="preserve">; after the build they will be replaced by the saved</w:t>
+      </w:r>
+      <w:r>
+        <w:t xml:space="preserve"> </w:t>
+      </w:r>
+      <w:r>
+        <w:rPr>
+          <w:rStyle w:val="VerbatimChar"/>
+        </w:rPr>
+        <w:t xml:space="preserve">show running-config</w:t>
+      </w:r>
+      <w:r>
+        <w:t xml:space="preserve"> </w:t>
+      </w:r>
+      <w:r>
+        <w:t xml:space="preserve">output. Base configuration (Stage 0) is in the repository. Each stage is applied on top of the previous one, so an ACL not listed under a stage is carried over unchanged (for example, the Stage 1 edge ACL stays in place in Stage 2).</w:t>
+      </w:r>
+    </w:p>
+    <w:bookmarkStart w:id="52" w:name="stage-1"/>
+    <w:p>
+      <w:pPr>
+        <w:pStyle w:val="Heading2"/>
+      </w:pPr>
+      <w:r>
+        <w:t xml:space="preserve">Stage 1</w:t>
+      </w:r>
+    </w:p>
+    <w:p>
+      <w:pPr>
+        <w:pStyle w:val="FirstParagraph"/>
+        <w:keepNext/>
+      </w:pPr>
+      <w:r>
+        <w:rPr>
+          <w:bCs/>
+          <w:b/>
+        </w:rPr>
+        <w:t xml:space="preserve">R-EDGE</w:t>
+      </w:r>
+    </w:p>
+    <w:p>
+      <w:pPr>
+        <w:pStyle w:val="SourceCode"/>
+        <w:keepLines/>
+      </w:pPr>
+      <w:r>
+        <w:rPr>
+          <w:rStyle w:val="VerbatimChar"/>
+        </w:rPr>
+        <w:t xml:space="preserve">ip access-list extended ACL-EDGE-IN</w:t>
+      </w:r>
+      <w:r>
+        <w:br/>
+      </w:r>
+      <w:r>
+        <w:rPr>
+          <w:rStyle w:val="VerbatimChar"/>
+        </w:rPr>
+        <w:t xml:space="preserve"> remark R8 public portal</w:t>
+      </w:r>
+      <w:r>
+        <w:br/>
+      </w:r>
+      <w:r>
+        <w:rPr>
+          <w:rStyle w:val="VerbatimChar"/>
+        </w:rPr>
+        <w:t xml:space="preserve"> permit tcp any host 192.168.50.10 eq www</w:t>
+      </w:r>
+      <w:r>
+        <w:br/>
+      </w:r>
+      <w:r>
+        <w:rPr>
+          <w:rStyle w:val="VerbatimChar"/>
+        </w:rPr>
+        <w:t xml:space="preserve"> permit tcp any host 192.168.50.10 eq 443</w:t>
+      </w:r>
+      <w:r>
+        <w:br/>
+      </w:r>
+      <w:r>
+        <w:rPr>
+          <w:rStyle w:val="VerbatimChar"/>
+        </w:rPr>
+        <w:t xml:space="preserve"> remark R7 return traffic - broad (any source port)</w:t>
+      </w:r>
+      <w:r>
+        <w:br/>
+      </w:r>
+      <w:r>
+        <w:rPr>
+          <w:rStyle w:val="VerbatimChar"/>
+        </w:rPr>
+        <w:t xml:space="preserve"> permit tcp any 192.168.0.0 0.0.255.255 established</w:t>
+      </w:r>
+      <w:r>
+        <w:br/>
+      </w:r>
+      <w:r>
+        <w:rPr>
+          <w:rStyle w:val="VerbatimChar"/>
+        </w:rPr>
+        <w:t xml:space="preserve"> remark Broad ICMP returns</w:t>
+      </w:r>
+      <w:r>
+        <w:br/>
+      </w:r>
+      <w:r>
+        <w:rPr>
+          <w:rStyle w:val="VerbatimChar"/>
+        </w:rPr>
+        <w:t xml:space="preserve"> permit icmp any 192.168.0.0 0.0.255.255 echo-reply</w:t>
+      </w:r>
+      <w:r>
+        <w:br/>
+      </w:r>
+      <w:r>
+        <w:rPr>
+          <w:rStyle w:val="VerbatimChar"/>
+        </w:rPr>
+        <w:t xml:space="preserve"> permit icmp any 192.168.0.0 0.0.255.255 unreachable</w:t>
+      </w:r>
+      <w:r>
+        <w:br/>
+      </w:r>
+      <w:r>
+        <w:rPr>
+          <w:rStyle w:val="VerbatimChar"/>
+        </w:rPr>
+        <w:t xml:space="preserve"> permit icmp any 192.168.0.0 0.0.255.255 time-exceeded</w:t>
+      </w:r>
+      <w:r>
+        <w:br/>
+      </w:r>
+      <w:r>
+        <w:rPr>
+          <w:rStyle w:val="VerbatimChar"/>
+        </w:rPr>
+        <w:t xml:space="preserve"> remark X7 explicit deny for counters</w:t>
+      </w:r>
+      <w:r>
+        <w:br/>
+      </w:r>
+      <w:r>
+        <w:rPr>
+          <w:rStyle w:val="VerbatimChar"/>
+        </w:rPr>
+        <w:t xml:space="preserve"> deny ip any any</w:t>
+      </w:r>
+    </w:p>
+    <w:p>
+      <w:pPr>
+        <w:pStyle w:val="SourceCode"/>
+        <w:keepLines/>
+      </w:pPr>
+      <w:r>
+        <w:rPr>
+          <w:rStyle w:val="VerbatimChar"/>
+        </w:rPr>
+        <w:t xml:space="preserve">interface GigabitEthernet0/1</w:t>
+      </w:r>
+      <w:r>
+        <w:br/>
+      </w:r>
+      <w:r>
+        <w:rPr>
+          <w:rStyle w:val="VerbatimChar"/>
+        </w:rPr>
+        <w:t xml:space="preserve"> ip access-group ACL-EDGE-IN in</w:t>
+      </w:r>
+    </w:p>
+    <w:p>
+      <w:pPr>
+        <w:pStyle w:val="SourceCode"/>
+        <w:keepLines/>
+      </w:pPr>
+      <w:r>
+        <w:rPr>
+          <w:rStyle w:val="VerbatimChar"/>
+        </w:rPr>
+        <w:t xml:space="preserve">ip access-list standard ACL-VTY</w:t>
+      </w:r>
+      <w:r>
+        <w:br/>
+      </w:r>
+      <w:r>
+        <w:rPr>
+          <w:rStyle w:val="VerbatimChar"/>
+        </w:rPr>
+        <w:t xml:space="preserve"> remark Broad - any internal source may reach the login prompt</w:t>
+      </w:r>
+      <w:r>
+        <w:br/>
+      </w:r>
+      <w:r>
+        <w:rPr>
+          <w:rStyle w:val="VerbatimChar"/>
+        </w:rPr>
+        <w:t xml:space="preserve"> permit 192.168.0.0 0.0.255.255</w:t>
+      </w:r>
+    </w:p>
+    <w:p>
+      <w:pPr>
+        <w:pStyle w:val="SourceCode"/>
+        <w:keepLines/>
+      </w:pPr>
+      <w:r>
+        <w:rPr>
+          <w:rStyle w:val="VerbatimChar"/>
+        </w:rPr>
+        <w:t xml:space="preserve">line vty 0 15</w:t>
+      </w:r>
+      <w:r>
+        <w:br/>
+      </w:r>
+      <w:r>
+        <w:rPr>
+          <w:rStyle w:val="VerbatimChar"/>
+        </w:rPr>
+        <w:t xml:space="preserve"> access-class ACL-VTY in</w:t>
+      </w:r>
+    </w:p>
+    <w:p>
+      <w:pPr>
+        <w:pStyle w:val="FirstParagraph"/>
+        <w:keepNext/>
+      </w:pPr>
+      <w:r>
+        <w:rPr>
+          <w:bCs/>
+          <w:b/>
+        </w:rPr>
+        <w:t xml:space="preserve">R-CORE</w:t>
+      </w:r>
+    </w:p>
+    <w:p>
+      <w:pPr>
+        <w:pStyle w:val="SourceCode"/>
+        <w:keepLines/>
+      </w:pPr>
+      <w:r>
+        <w:rPr>
+          <w:rStyle w:val="VerbatimChar"/>
+        </w:rPr>
+        <w:t xml:space="preserve">ip access-list extended ACL-USERS-IN</w:t>
+      </w:r>
+      <w:r>
+        <w:br/>
+      </w:r>
+      <w:r>
+        <w:rPr>
+          <w:rStyle w:val="VerbatimChar"/>
+        </w:rPr>
+        <w:t xml:space="preserve"> remark Broad - any internal source to any destination</w:t>
+      </w:r>
+      <w:r>
+        <w:br/>
+      </w:r>
+      <w:r>
+        <w:rPr>
+          <w:rStyle w:val="VerbatimChar"/>
+        </w:rPr>
+        <w:t xml:space="preserve"> permit ip 192.168.0.0 0.0.255.255 any</w:t>
+      </w:r>
+      <w:r>
+        <w:br/>
+      </w:r>
+      <w:r>
+        <w:rPr>
+          <w:rStyle w:val="VerbatimChar"/>
+        </w:rPr>
+        <w:t xml:space="preserve"> remark Catch-all: sources outside 192.168.0.0/16 (not BCP 38 validation); explicit for counters</w:t>
+      </w:r>
+      <w:r>
+        <w:br/>
+      </w:r>
+      <w:r>
+        <w:rPr>
+          <w:rStyle w:val="VerbatimChar"/>
+        </w:rPr>
+        <w:t xml:space="preserve"> deny ip any any</w:t>
+      </w:r>
+    </w:p>
+    <w:p>
+      <w:pPr>
+        <w:pStyle w:val="SourceCode"/>
+        <w:keepLines/>
+      </w:pPr>
+      <w:r>
+        <w:rPr>
+          <w:rStyle w:val="VerbatimChar"/>
+        </w:rPr>
+        <w:t xml:space="preserve">interface GigabitEthernet0/0.10</w:t>
+      </w:r>
+      <w:r>
+        <w:br/>
+      </w:r>
+      <w:r>
+        <w:rPr>
+          <w:rStyle w:val="VerbatimChar"/>
+        </w:rPr>
+        <w:t xml:space="preserve"> ip access-group ACL-USERS-IN in</w:t>
+      </w:r>
+      <w:r>
+        <w:br/>
+      </w:r>
+      <w:r>
+        <w:rPr>
+          <w:rStyle w:val="VerbatimChar"/>
+        </w:rPr>
+        <w:t xml:space="preserve">interface GigabitEthernet0/0.20</w:t>
+      </w:r>
+      <w:r>
+        <w:br/>
+      </w:r>
+      <w:r>
+        <w:rPr>
+          <w:rStyle w:val="VerbatimChar"/>
+        </w:rPr>
+        <w:t xml:space="preserve"> ip access-group ACL-USERS-IN in</w:t>
+      </w:r>
+      <w:r>
+        <w:br/>
+      </w:r>
+      <w:r>
+        <w:rPr>
+          <w:rStyle w:val="VerbatimChar"/>
+        </w:rPr>
+        <w:t xml:space="preserve">interface GigabitEthernet0/0.30</w:t>
+      </w:r>
+      <w:r>
+        <w:br/>
+      </w:r>
+      <w:r>
+        <w:rPr>
+          <w:rStyle w:val="VerbatimChar"/>
+        </w:rPr>
+        <w:t xml:space="preserve"> ip access-group ACL-USERS-IN in</w:t>
+      </w:r>
+      <w:r>
+        <w:br/>
+      </w:r>
+      <w:r>
+        <w:rPr>
+          <w:rStyle w:val="VerbatimChar"/>
+        </w:rPr>
+        <w:t xml:space="preserve">interface GigabitEthernet0/0.40</w:t>
+      </w:r>
+      <w:r>
+        <w:br/>
+      </w:r>
+      <w:r>
+        <w:rPr>
+          <w:rStyle w:val="VerbatimChar"/>
+        </w:rPr>
+        <w:t xml:space="preserve"> ip access-group ACL-USERS-IN in</w:t>
+      </w:r>
+    </w:p>
+    <w:p>
+      <w:pPr>
+        <w:pStyle w:val="SourceCode"/>
+        <w:keepLines/>
+      </w:pPr>
+      <w:r>
+        <w:rPr>
+          <w:rStyle w:val="VerbatimChar"/>
+        </w:rPr>
+        <w:t xml:space="preserve">ip access-list standard ACL-VTY</w:t>
+      </w:r>
+      <w:r>
+        <w:br/>
+      </w:r>
+      <w:r>
+        <w:rPr>
+          <w:rStyle w:val="VerbatimChar"/>
+        </w:rPr>
+        <w:t xml:space="preserve"> remark Broad - any internal source may reach the login prompt</w:t>
+      </w:r>
+      <w:r>
+        <w:br/>
+      </w:r>
+      <w:r>
+        <w:rPr>
+          <w:rStyle w:val="VerbatimChar"/>
+        </w:rPr>
+        <w:t xml:space="preserve"> permit 192.168.0.0 0.0.255.255</w:t>
+      </w:r>
+    </w:p>
+    <w:p>
+      <w:pPr>
+        <w:pStyle w:val="SourceCode"/>
+        <w:keepLines/>
+      </w:pPr>
+      <w:r>
+        <w:rPr>
+          <w:rStyle w:val="VerbatimChar"/>
+        </w:rPr>
+        <w:t xml:space="preserve">line vty 0 15</w:t>
+      </w:r>
+      <w:r>
+        <w:br/>
+      </w:r>
+      <w:r>
+        <w:rPr>
+          <w:rStyle w:val="VerbatimChar"/>
+        </w:rPr>
+        <w:t xml:space="preserve"> access-class ACL-VTY in</w:t>
+      </w:r>
+    </w:p>
+    <w:bookmarkEnd w:id="52"/>
+    <w:bookmarkStart w:id="53" w:name="stage-2"/>
+    <w:p>
+      <w:pPr>
+        <w:pStyle w:val="Heading2"/>
+      </w:pPr>
+      <w:r>
+        <w:t xml:space="preserve">Stage 2</w:t>
+      </w:r>
+    </w:p>
+    <w:p>
+      <w:pPr>
+        <w:pStyle w:val="FirstParagraph"/>
+        <w:keepNext/>
+      </w:pPr>
+      <w:r>
+        <w:rPr>
+          <w:bCs/>
+          <w:b/>
+        </w:rPr>
+        <w:t xml:space="preserve">R-EDGE</w:t>
+      </w:r>
+    </w:p>
+    <w:p>
+      <w:pPr>
+        <w:pStyle w:val="SourceCode"/>
+        <w:keepLines/>
+      </w:pPr>
+      <w:r>
+        <w:rPr>
+          <w:rStyle w:val="VerbatimChar"/>
+        </w:rPr>
+        <w:t xml:space="preserve">line vty 0 15</w:t>
+      </w:r>
+      <w:r>
+        <w:br/>
+      </w:r>
+      <w:r>
+        <w:rPr>
+          <w:rStyle w:val="VerbatimChar"/>
+        </w:rPr>
+        <w:t xml:space="preserve"> no access-class ACL-VTY in</w:t>
+      </w:r>
+    </w:p>
+    <w:p>
+      <w:pPr>
+        <w:pStyle w:val="SourceCode"/>
+        <w:keepLines/>
+      </w:pPr>
+      <w:r>
+        <w:rPr>
+          <w:rStyle w:val="VerbatimChar"/>
+        </w:rPr>
+        <w:t xml:space="preserve">ip access-list standard ACL-VTY</w:t>
+      </w:r>
+      <w:r>
+        <w:br/>
+      </w:r>
+      <w:r>
+        <w:rPr>
+          <w:rStyle w:val="VerbatimChar"/>
+        </w:rPr>
+        <w:t xml:space="preserve"> remark R5 X4 - IT only</w:t>
+      </w:r>
+      <w:r>
+        <w:br/>
+      </w:r>
+      <w:r>
+        <w:rPr>
+          <w:rStyle w:val="VerbatimChar"/>
+        </w:rPr>
+        <w:t xml:space="preserve"> permit 192.168.30.0 0.0.0.255</w:t>
+      </w:r>
+    </w:p>
+    <w:p>
+      <w:pPr>
+        <w:pStyle w:val="SourceCode"/>
+        <w:keepLines/>
+      </w:pPr>
+      <w:r>
+        <w:rPr>
+          <w:rStyle w:val="VerbatimChar"/>
+        </w:rPr>
+        <w:t xml:space="preserve">line vty 0 15</w:t>
+      </w:r>
+      <w:r>
+        <w:br/>
+      </w:r>
+      <w:r>
+        <w:rPr>
+          <w:rStyle w:val="VerbatimChar"/>
+        </w:rPr>
+        <w:t xml:space="preserve"> access-class ACL-VTY in</w:t>
+      </w:r>
+    </w:p>
+    <w:p>
+      <w:pPr>
+        <w:pStyle w:val="FirstParagraph"/>
+        <w:keepNext/>
+      </w:pPr>
+      <w:r>
+        <w:rPr>
+          <w:bCs/>
+          <w:b/>
+        </w:rPr>
+        <w:t xml:space="preserve">R-CORE</w:t>
+      </w:r>
+    </w:p>
+    <w:p>
+      <w:pPr>
+        <w:pStyle w:val="SourceCode"/>
+        <w:keepLines/>
+      </w:pPr>
+      <w:r>
+        <w:rPr>
+          <w:rStyle w:val="VerbatimChar"/>
+        </w:rPr>
+        <w:t xml:space="preserve">ip access-list extended ACL-HR-IN</w:t>
+      </w:r>
+      <w:r>
+        <w:br/>
+      </w:r>
+      <w:r>
+        <w:rPr>
+          <w:rStyle w:val="VerbatimChar"/>
+        </w:rPr>
+        <w:t xml:space="preserve"> remark R1 R2 R3 - whole server zone</w:t>
+      </w:r>
+      <w:r>
+        <w:br/>
+      </w:r>
+      <w:r>
+        <w:rPr>
+          <w:rStyle w:val="VerbatimChar"/>
+        </w:rPr>
+        <w:t xml:space="preserve"> permit ip 192.168.10.0 0.0.0.255 192.168.50.0 0.0.0.255</w:t>
+      </w:r>
+      <w:r>
+        <w:br/>
+      </w:r>
+      <w:r>
+        <w:rPr>
+          <w:rStyle w:val="VerbatimChar"/>
+        </w:rPr>
+        <w:t xml:space="preserve"> remark X1 X4 - other internal destinations</w:t>
+      </w:r>
+      <w:r>
+        <w:br/>
+      </w:r>
+      <w:r>
+        <w:rPr>
+          <w:rStyle w:val="VerbatimChar"/>
+        </w:rPr>
+        <w:t xml:space="preserve"> deny ip 192.168.10.0 0.0.0.255 192.168.0.0 0.0.255.255</w:t>
+      </w:r>
+      <w:r>
+        <w:br/>
+      </w:r>
+      <w:r>
+        <w:rPr>
+          <w:rStyle w:val="VerbatimChar"/>
+        </w:rPr>
+        <w:t xml:space="preserve"> remark R7 - outside</w:t>
+      </w:r>
+      <w:r>
+        <w:br/>
+      </w:r>
+      <w:r>
+        <w:rPr>
+          <w:rStyle w:val="VerbatimChar"/>
+        </w:rPr>
+        <w:t xml:space="preserve"> permit ip 192.168.10.0 0.0.0.255 any</w:t>
+      </w:r>
+      <w:r>
+        <w:br/>
+      </w:r>
+      <w:r>
+        <w:rPr>
+          <w:rStyle w:val="VerbatimChar"/>
+        </w:rPr>
+        <w:t xml:space="preserve"> deny ip any any</w:t>
+      </w:r>
+    </w:p>
+    <w:p>
+      <w:pPr>
+        <w:pStyle w:val="SourceCode"/>
+        <w:keepLines/>
+      </w:pPr>
+      <w:r>
+        <w:rPr>
+          <w:rStyle w:val="VerbatimChar"/>
+        </w:rPr>
+        <w:t xml:space="preserve">ip access-list extended ACL-FIN-IN</w:t>
+      </w:r>
+      <w:r>
+        <w:br/>
+      </w:r>
+      <w:r>
+        <w:rPr>
+          <w:rStyle w:val="VerbatimChar"/>
+        </w:rPr>
+        <w:t xml:space="preserve"> remark R1 R2 R4 - whole server zone</w:t>
+      </w:r>
+      <w:r>
+        <w:br/>
+      </w:r>
+      <w:r>
+        <w:rPr>
+          <w:rStyle w:val="VerbatimChar"/>
+        </w:rPr>
+        <w:t xml:space="preserve"> permit ip 192.168.20.0 0.0.0.255 192.168.50.0 0.0.0.255</w:t>
+      </w:r>
+      <w:r>
+        <w:br/>
+      </w:r>
+      <w:r>
+        <w:rPr>
+          <w:rStyle w:val="VerbatimChar"/>
+        </w:rPr>
+        <w:t xml:space="preserve"> remark X1 X4</w:t>
+      </w:r>
+      <w:r>
+        <w:br/>
+      </w:r>
+      <w:r>
+        <w:rPr>
+          <w:rStyle w:val="VerbatimChar"/>
+        </w:rPr>
+        <w:t xml:space="preserve"> deny ip 192.168.20.0 0.0.0.255 192.168.0.0 0.0.255.255</w:t>
+      </w:r>
+      <w:r>
+        <w:br/>
+      </w:r>
+      <w:r>
+        <w:rPr>
+          <w:rStyle w:val="VerbatimChar"/>
+        </w:rPr>
+        <w:t xml:space="preserve"> remark R7</w:t>
+      </w:r>
+      <w:r>
+        <w:br/>
+      </w:r>
+      <w:r>
+        <w:rPr>
+          <w:rStyle w:val="VerbatimChar"/>
+        </w:rPr>
+        <w:t xml:space="preserve"> permit ip 192.168.20.0 0.0.0.255 any</w:t>
+      </w:r>
+      <w:r>
+        <w:br/>
+      </w:r>
+      <w:r>
+        <w:rPr>
+          <w:rStyle w:val="VerbatimChar"/>
+        </w:rPr>
+        <w:t xml:space="preserve"> deny ip any any</w:t>
+      </w:r>
+    </w:p>
+    <w:p>
+      <w:pPr>
+        <w:pStyle w:val="SourceCode"/>
+        <w:keepLines/>
+      </w:pPr>
+      <w:r>
+        <w:rPr>
+          <w:rStyle w:val="VerbatimChar"/>
+        </w:rPr>
+        <w:t xml:space="preserve">ip access-list extended ACL-IT-IN</w:t>
+      </w:r>
+      <w:r>
+        <w:br/>
+      </w:r>
+      <w:r>
+        <w:rPr>
+          <w:rStyle w:val="VerbatimChar"/>
+        </w:rPr>
+        <w:t xml:space="preserve"> remark R1 R2 R6 - whole server zone</w:t>
+      </w:r>
+      <w:r>
+        <w:br/>
+      </w:r>
+      <w:r>
+        <w:rPr>
+          <w:rStyle w:val="VerbatimChar"/>
+        </w:rPr>
+        <w:t xml:space="preserve"> permit ip 192.168.30.0 0.0.0.255 192.168.50.0 0.0.0.255</w:t>
+      </w:r>
+      <w:r>
+        <w:br/>
+      </w:r>
+      <w:r>
+        <w:rPr>
+          <w:rStyle w:val="VerbatimChar"/>
+        </w:rPr>
+        <w:t xml:space="preserve"> remark R5 - R-CORE management address</w:t>
+      </w:r>
+      <w:r>
+        <w:br/>
+      </w:r>
+      <w:r>
+        <w:rPr>
+          <w:rStyle w:val="VerbatimChar"/>
+        </w:rPr>
+        <w:t xml:space="preserve"> permit ip 192.168.30.0 0.0.0.255 host 192.168.30.1</w:t>
+      </w:r>
+      <w:r>
+        <w:br/>
+      </w:r>
+      <w:r>
+        <w:rPr>
+          <w:rStyle w:val="VerbatimChar"/>
+        </w:rPr>
+        <w:t xml:space="preserve"> remark X1</w:t>
+      </w:r>
+      <w:r>
+        <w:br/>
+      </w:r>
+      <w:r>
+        <w:rPr>
+          <w:rStyle w:val="VerbatimChar"/>
+        </w:rPr>
+        <w:t xml:space="preserve"> deny ip 192.168.30.0 0.0.0.255 192.168.0.0 0.0.255.255</w:t>
+      </w:r>
+      <w:r>
+        <w:br/>
+      </w:r>
+      <w:r>
+        <w:rPr>
+          <w:rStyle w:val="VerbatimChar"/>
+        </w:rPr>
+        <w:t xml:space="preserve"> remark R7 and R5 (R-EDGE 10.0.0.2)</w:t>
+      </w:r>
+      <w:r>
+        <w:br/>
+      </w:r>
+      <w:r>
+        <w:rPr>
+          <w:rStyle w:val="VerbatimChar"/>
+        </w:rPr>
+        <w:t xml:space="preserve"> permit ip 192.168.30.0 0.0.0.255 any</w:t>
+      </w:r>
+      <w:r>
+        <w:br/>
+      </w:r>
+      <w:r>
+        <w:rPr>
+          <w:rStyle w:val="VerbatimChar"/>
+        </w:rPr>
+        <w:t xml:space="preserve"> deny ip any any</w:t>
+      </w:r>
+    </w:p>
+    <w:p>
+      <w:pPr>
+        <w:pStyle w:val="SourceCode"/>
+        <w:keepLines/>
+      </w:pPr>
+      <w:r>
+        <w:rPr>
+          <w:rStyle w:val="VerbatimChar"/>
+        </w:rPr>
+        <w:t xml:space="preserve">ip access-list extended ACL-SAL-IN</w:t>
+      </w:r>
+      <w:r>
+        <w:br/>
+      </w:r>
+      <w:r>
+        <w:rPr>
+          <w:rStyle w:val="VerbatimChar"/>
+        </w:rPr>
+        <w:t xml:space="preserve"> remark R1 R2 - whole server zone</w:t>
+      </w:r>
+      <w:r>
+        <w:br/>
+      </w:r>
+      <w:r>
+        <w:rPr>
+          <w:rStyle w:val="VerbatimChar"/>
+        </w:rPr>
+        <w:t xml:space="preserve"> permit ip 192.168.40.0 0.0.0.255 192.168.50.0 0.0.0.255</w:t>
+      </w:r>
+      <w:r>
+        <w:br/>
+      </w:r>
+      <w:r>
+        <w:rPr>
+          <w:rStyle w:val="VerbatimChar"/>
+        </w:rPr>
+        <w:t xml:space="preserve"> remark X1 X4</w:t>
+      </w:r>
+      <w:r>
+        <w:br/>
+      </w:r>
+      <w:r>
+        <w:rPr>
+          <w:rStyle w:val="VerbatimChar"/>
+        </w:rPr>
+        <w:t xml:space="preserve"> deny ip 192.168.40.0 0.0.0.255 192.168.0.0 0.0.255.255</w:t>
+      </w:r>
+      <w:r>
+        <w:br/>
+      </w:r>
+      <w:r>
+        <w:rPr>
+          <w:rStyle w:val="VerbatimChar"/>
+        </w:rPr>
+        <w:t xml:space="preserve"> remark R7</w:t>
+      </w:r>
+      <w:r>
+        <w:br/>
+      </w:r>
+      <w:r>
+        <w:rPr>
+          <w:rStyle w:val="VerbatimChar"/>
+        </w:rPr>
+        <w:t xml:space="preserve"> permit ip 192.168.40.0 0.0.0.255 any</w:t>
+      </w:r>
+      <w:r>
+        <w:br/>
+      </w:r>
+      <w:r>
+        <w:rPr>
+          <w:rStyle w:val="VerbatimChar"/>
+        </w:rPr>
+        <w:t xml:space="preserve"> deny ip any any</w:t>
+      </w:r>
+    </w:p>
+    <w:p>
+      <w:pPr>
+        <w:pStyle w:val="SourceCode"/>
+        <w:keepLines/>
+      </w:pPr>
+      <w:r>
+        <w:rPr>
+          <w:rStyle w:val="VerbatimChar"/>
+        </w:rPr>
+        <w:t xml:space="preserve">interface GigabitEthernet0/0.10</w:t>
+      </w:r>
+      <w:r>
+        <w:br/>
+      </w:r>
+      <w:r>
+        <w:rPr>
+          <w:rStyle w:val="VerbatimChar"/>
+        </w:rPr>
+        <w:t xml:space="preserve"> ip access-group ACL-HR-IN in</w:t>
+      </w:r>
+      <w:r>
+        <w:br/>
+      </w:r>
+      <w:r>
+        <w:rPr>
+          <w:rStyle w:val="VerbatimChar"/>
+        </w:rPr>
+        <w:t xml:space="preserve">interface GigabitEthernet0/0.20</w:t>
+      </w:r>
+      <w:r>
+        <w:br/>
+      </w:r>
+      <w:r>
+        <w:rPr>
+          <w:rStyle w:val="VerbatimChar"/>
+        </w:rPr>
+        <w:t xml:space="preserve"> ip access-group ACL-FIN-IN in</w:t>
+      </w:r>
+      <w:r>
+        <w:br/>
+      </w:r>
+      <w:r>
+        <w:rPr>
+          <w:rStyle w:val="VerbatimChar"/>
+        </w:rPr>
+        <w:t xml:space="preserve">interface GigabitEthernet0/0.30</w:t>
+      </w:r>
+      <w:r>
+        <w:br/>
+      </w:r>
+      <w:r>
+        <w:rPr>
+          <w:rStyle w:val="VerbatimChar"/>
+        </w:rPr>
+        <w:t xml:space="preserve"> ip access-group ACL-IT-IN in</w:t>
+      </w:r>
+      <w:r>
+        <w:br/>
+      </w:r>
+      <w:r>
+        <w:rPr>
+          <w:rStyle w:val="VerbatimChar"/>
+        </w:rPr>
+        <w:t xml:space="preserve">interface GigabitEthernet0/0.40</w:t>
+      </w:r>
+      <w:r>
+        <w:br/>
+      </w:r>
+      <w:r>
+        <w:rPr>
+          <w:rStyle w:val="VerbatimChar"/>
+        </w:rPr>
+        <w:t xml:space="preserve"> ip access-group ACL-SAL-IN in</w:t>
+      </w:r>
+      <w:r>
+        <w:br/>
+      </w:r>
+      <w:r>
+        <w:rPr>
+          <w:rStyle w:val="VerbatimChar"/>
+        </w:rPr>
+        <w:t xml:space="preserve">line vty 0 15</w:t>
+      </w:r>
+      <w:r>
+        <w:br/>
+      </w:r>
+      <w:r>
+        <w:rPr>
+          <w:rStyle w:val="VerbatimChar"/>
+        </w:rPr>
+        <w:t xml:space="preserve"> no access-class ACL-VTY in</w:t>
+      </w:r>
+    </w:p>
+    <w:p>
+      <w:pPr>
+        <w:pStyle w:val="SourceCode"/>
+        <w:keepLines/>
+      </w:pPr>
+      <w:r>
+        <w:rPr>
+          <w:rStyle w:val="VerbatimChar"/>
+        </w:rPr>
+        <w:t xml:space="preserve">ip access-list standard ACL-VTY</w:t>
+      </w:r>
+      <w:r>
+        <w:br/>
+      </w:r>
+      <w:r>
+        <w:rPr>
+          <w:rStyle w:val="VerbatimChar"/>
+        </w:rPr>
+        <w:t xml:space="preserve"> remark R5 X4 - IT only</w:t>
+      </w:r>
+      <w:r>
+        <w:br/>
+      </w:r>
+      <w:r>
+        <w:rPr>
+          <w:rStyle w:val="VerbatimChar"/>
+        </w:rPr>
+        <w:t xml:space="preserve"> permit 192.168.30.0 0.0.0.255</w:t>
+      </w:r>
+    </w:p>
+    <w:p>
+      <w:pPr>
+        <w:pStyle w:val="SourceCode"/>
+        <w:keepLines/>
+      </w:pPr>
+      <w:r>
+        <w:rPr>
+          <w:rStyle w:val="VerbatimChar"/>
+        </w:rPr>
+        <w:t xml:space="preserve">line vty 0 15</w:t>
+      </w:r>
+      <w:r>
+        <w:br/>
+      </w:r>
+      <w:r>
+        <w:rPr>
+          <w:rStyle w:val="VerbatimChar"/>
+        </w:rPr>
+        <w:t xml:space="preserve"> access-class ACL-VTY in</w:t>
+      </w:r>
+    </w:p>
+    <w:bookmarkEnd w:id="53"/>
+    <w:bookmarkStart w:id="54" w:name="stage-3"/>
+    <w:p>
+      <w:pPr>
+        <w:pStyle w:val="Heading2"/>
+      </w:pPr>
+      <w:r>
+        <w:t xml:space="preserve">Stage 3</w:t>
+      </w:r>
+    </w:p>
+    <w:p>
+      <w:pPr>
+        <w:pStyle w:val="FirstParagraph"/>
+        <w:keepNext/>
+      </w:pPr>
+      <w:r>
+        <w:rPr>
+          <w:bCs/>
+          <w:b/>
+        </w:rPr>
+        <w:t xml:space="preserve">R-EDGE</w:t>
+      </w:r>
+    </w:p>
+    <w:p>
+      <w:pPr>
+        <w:pStyle w:val="SourceCode"/>
+        <w:keepLines/>
+      </w:pPr>
+      <w:r>
+        <w:rPr>
+          <w:rStyle w:val="VerbatimChar"/>
+        </w:rPr>
+        <w:t xml:space="preserve">ip access-list extended ACL-EDGE-IN</w:t>
+      </w:r>
+      <w:r>
+        <w:br/>
+      </w:r>
+      <w:r>
+        <w:rPr>
+          <w:rStyle w:val="VerbatimChar"/>
+        </w:rPr>
+        <w:t xml:space="preserve"> remark R8 public portal</w:t>
+      </w:r>
+      <w:r>
+        <w:br/>
+      </w:r>
+      <w:r>
+        <w:rPr>
+          <w:rStyle w:val="VerbatimChar"/>
+        </w:rPr>
+        <w:t xml:space="preserve"> permit tcp any host 192.168.50.10 eq www</w:t>
+      </w:r>
+      <w:r>
+        <w:br/>
+      </w:r>
+      <w:r>
+        <w:rPr>
+          <w:rStyle w:val="VerbatimChar"/>
+        </w:rPr>
+        <w:t xml:space="preserve"> permit tcp any host 192.168.50.10 eq 443</w:t>
+      </w:r>
+      <w:r>
+        <w:br/>
+      </w:r>
+      <w:r>
+        <w:rPr>
+          <w:rStyle w:val="VerbatimChar"/>
+        </w:rPr>
+        <w:t xml:space="preserve"> remark R7 return traffic - web source ports only</w:t>
+      </w:r>
+      <w:r>
+        <w:br/>
+      </w:r>
+      <w:r>
+        <w:rPr>
+          <w:rStyle w:val="VerbatimChar"/>
+        </w:rPr>
+        <w:t xml:space="preserve"> permit tcp any eq www 192.168.0.0 0.0.255.255 established</w:t>
+      </w:r>
+      <w:r>
+        <w:br/>
+      </w:r>
+      <w:r>
+        <w:rPr>
+          <w:rStyle w:val="VerbatimChar"/>
+        </w:rPr>
+        <w:t xml:space="preserve"> permit tcp any eq 443 192.168.0.0 0.0.255.255 established</w:t>
+      </w:r>
+      <w:r>
+        <w:br/>
+      </w:r>
+      <w:r>
+        <w:rPr>
+          <w:rStyle w:val="VerbatimChar"/>
+        </w:rPr>
+        <w:t xml:space="preserve"> remark X7</w:t>
+      </w:r>
+      <w:r>
+        <w:br/>
+      </w:r>
+      <w:r>
+        <w:rPr>
+          <w:rStyle w:val="VerbatimChar"/>
+        </w:rPr>
+        <w:t xml:space="preserve"> deny ip any any</w:t>
+      </w:r>
+    </w:p>
+    <w:p>
+      <w:pPr>
+        <w:pStyle w:val="SourceCode"/>
+        <w:keepLines/>
+      </w:pPr>
+      <w:r>
+        <w:rPr>
+          <w:rStyle w:val="VerbatimChar"/>
+        </w:rPr>
+        <w:t xml:space="preserve">interface GigabitEthernet0/1</w:t>
+      </w:r>
+      <w:r>
+        <w:br/>
+      </w:r>
+      <w:r>
+        <w:rPr>
+          <w:rStyle w:val="VerbatimChar"/>
+        </w:rPr>
+        <w:t xml:space="preserve"> ip access-group ACL-EDGE-IN in</w:t>
+      </w:r>
+      <w:r>
+        <w:br/>
+      </w:r>
+      <w:r>
+        <w:rPr>
+          <w:rStyle w:val="VerbatimChar"/>
+        </w:rPr>
+        <w:t xml:space="preserve">line vty 0 15</w:t>
+      </w:r>
+      <w:r>
+        <w:br/>
+      </w:r>
+      <w:r>
+        <w:rPr>
+          <w:rStyle w:val="VerbatimChar"/>
+        </w:rPr>
+        <w:t xml:space="preserve"> transport input ssh</w:t>
+      </w:r>
+    </w:p>
+    <w:p>
+      <w:pPr>
+        <w:pStyle w:val="FirstParagraph"/>
+        <w:keepNext/>
+      </w:pPr>
+      <w:r>
+        <w:rPr>
+          <w:bCs/>
+          <w:b/>
+        </w:rPr>
+        <w:t xml:space="preserve">R-CORE</w:t>
+      </w:r>
+    </w:p>
+    <w:p>
+      <w:pPr>
+        <w:pStyle w:val="SourceCode"/>
+        <w:keepLines/>
+      </w:pPr>
+      <w:r>
+        <w:rPr>
+          <w:rStyle w:val="VerbatimChar"/>
+        </w:rPr>
+        <w:t xml:space="preserve">ip access-list extended ACL-HR-IN</w:t>
+      </w:r>
+      <w:r>
+        <w:br/>
+      </w:r>
+      <w:r>
+        <w:rPr>
+          <w:rStyle w:val="VerbatimChar"/>
+        </w:rPr>
+        <w:t xml:space="preserve"> remark R1 DNS</w:t>
+      </w:r>
+      <w:r>
+        <w:br/>
+      </w:r>
+      <w:r>
+        <w:rPr>
+          <w:rStyle w:val="VerbatimChar"/>
+        </w:rPr>
+        <w:t xml:space="preserve"> permit udp 192.168.10.0 0.0.0.255 host 192.168.50.20 eq domain</w:t>
+      </w:r>
+      <w:r>
+        <w:br/>
+      </w:r>
+      <w:r>
+        <w:rPr>
+          <w:rStyle w:val="VerbatimChar"/>
+        </w:rPr>
+        <w:t xml:space="preserve"> remark R2 portal</w:t>
+      </w:r>
+      <w:r>
+        <w:br/>
+      </w:r>
+      <w:r>
+        <w:rPr>
+          <w:rStyle w:val="VerbatimChar"/>
+        </w:rPr>
+        <w:t xml:space="preserve"> permit tcp 192.168.10.0 0.0.0.255 host 192.168.50.10 eq www</w:t>
+      </w:r>
+      <w:r>
+        <w:br/>
+      </w:r>
+      <w:r>
+        <w:rPr>
+          <w:rStyle w:val="VerbatimChar"/>
+        </w:rPr>
+        <w:t xml:space="preserve"> permit tcp 192.168.10.0 0.0.0.255 host 192.168.50.10 eq 443</w:t>
+      </w:r>
+      <w:r>
+        <w:br/>
+      </w:r>
+      <w:r>
+        <w:rPr>
+          <w:rStyle w:val="VerbatimChar"/>
+        </w:rPr>
+        <w:t xml:space="preserve"> remark R3 HR application</w:t>
+      </w:r>
+      <w:r>
+        <w:br/>
+      </w:r>
+      <w:r>
+        <w:rPr>
+          <w:rStyle w:val="VerbatimChar"/>
+        </w:rPr>
+        <w:t xml:space="preserve"> permit tcp 192.168.10.0 0.0.0.255 host 192.168.50.30 eq 443</w:t>
+      </w:r>
+      <w:r>
+        <w:br/>
+      </w:r>
+      <w:r>
+        <w:rPr>
+          <w:rStyle w:val="VerbatimChar"/>
+        </w:rPr>
+        <w:t xml:space="preserve"> remark X1-X6 - must stay ABOVE the R7 permits</w:t>
+      </w:r>
+      <w:r>
+        <w:br/>
+      </w:r>
+      <w:r>
+        <w:rPr>
+          <w:rStyle w:val="VerbatimChar"/>
+        </w:rPr>
+        <w:t xml:space="preserve"> deny ip 192.168.10.0 0.0.0.255 192.168.0.0 0.0.255.255</w:t>
+      </w:r>
+      <w:r>
+        <w:br/>
+      </w:r>
+      <w:r>
+        <w:rPr>
+          <w:rStyle w:val="VerbatimChar"/>
+        </w:rPr>
+        <w:t xml:space="preserve"> remark R7 Internet web</w:t>
+      </w:r>
+      <w:r>
+        <w:br/>
+      </w:r>
+      <w:r>
+        <w:rPr>
+          <w:rStyle w:val="VerbatimChar"/>
+        </w:rPr>
+        <w:t xml:space="preserve"> permit tcp 192.168.10.0 0.0.0.255 any eq www</w:t>
+      </w:r>
+      <w:r>
+        <w:br/>
+      </w:r>
+      <w:r>
+        <w:rPr>
+          <w:rStyle w:val="VerbatimChar"/>
+        </w:rPr>
+        <w:t xml:space="preserve"> permit tcp 192.168.10.0 0.0.0.255 any eq 443</w:t>
+      </w:r>
+      <w:r>
+        <w:br/>
+      </w:r>
+      <w:r>
+        <w:rPr>
+          <w:rStyle w:val="VerbatimChar"/>
+        </w:rPr>
+        <w:t xml:space="preserve"> deny ip any any</w:t>
+      </w:r>
+    </w:p>
+    <w:p>
+      <w:pPr>
+        <w:pStyle w:val="SourceCode"/>
+        <w:keepLines/>
+      </w:pPr>
+      <w:r>
+        <w:rPr>
+          <w:rStyle w:val="VerbatimChar"/>
+        </w:rPr>
+        <w:t xml:space="preserve">ip access-list extended ACL-FIN-IN</w:t>
+      </w:r>
+      <w:r>
+        <w:br/>
+      </w:r>
+      <w:r>
+        <w:rPr>
+          <w:rStyle w:val="VerbatimChar"/>
+        </w:rPr>
+        <w:t xml:space="preserve"> remark R1 DNS</w:t>
+      </w:r>
+      <w:r>
+        <w:br/>
+      </w:r>
+      <w:r>
+        <w:rPr>
+          <w:rStyle w:val="VerbatimChar"/>
+        </w:rPr>
+        <w:t xml:space="preserve"> permit udp 192.168.20.0 0.0.0.255 host 192.168.50.20 eq domain</w:t>
+      </w:r>
+      <w:r>
+        <w:br/>
+      </w:r>
+      <w:r>
+        <w:rPr>
+          <w:rStyle w:val="VerbatimChar"/>
+        </w:rPr>
+        <w:t xml:space="preserve"> remark R2 portal</w:t>
+      </w:r>
+      <w:r>
+        <w:br/>
+      </w:r>
+      <w:r>
+        <w:rPr>
+          <w:rStyle w:val="VerbatimChar"/>
+        </w:rPr>
+        <w:t xml:space="preserve"> permit tcp 192.168.20.0 0.0.0.255 host 192.168.50.10 eq www</w:t>
+      </w:r>
+      <w:r>
+        <w:br/>
+      </w:r>
+      <w:r>
+        <w:rPr>
+          <w:rStyle w:val="VerbatimChar"/>
+        </w:rPr>
+        <w:t xml:space="preserve"> permit tcp 192.168.20.0 0.0.0.255 host 192.168.50.10 eq 443</w:t>
+      </w:r>
+      <w:r>
+        <w:br/>
+      </w:r>
+      <w:r>
+        <w:rPr>
+          <w:rStyle w:val="VerbatimChar"/>
+        </w:rPr>
+        <w:t xml:space="preserve"> remark R4 finance records - FTP control only. No data-port entry unless pilot P7 requires it</w:t>
+      </w:r>
+      <w:r>
+        <w:br/>
+      </w:r>
+      <w:r>
+        <w:rPr>
+          <w:rStyle w:val="VerbatimChar"/>
+        </w:rPr>
+        <w:t xml:space="preserve"> permit tcp 192.168.20.0 0.0.0.255 host 192.168.50.40 eq ftp</w:t>
+      </w:r>
+      <w:r>
+        <w:br/>
+      </w:r>
+      <w:r>
+        <w:rPr>
+          <w:rStyle w:val="VerbatimChar"/>
+        </w:rPr>
+        <w:t xml:space="preserve"> remark X1-X6 - must stay ABOVE the R7 permits</w:t>
+      </w:r>
+      <w:r>
+        <w:br/>
+      </w:r>
+      <w:r>
+        <w:rPr>
+          <w:rStyle w:val="VerbatimChar"/>
+        </w:rPr>
+        <w:t xml:space="preserve"> deny ip 192.168.20.0 0.0.0.255 192.168.0.0 0.0.255.255</w:t>
+      </w:r>
+      <w:r>
+        <w:br/>
+      </w:r>
+      <w:r>
+        <w:rPr>
+          <w:rStyle w:val="VerbatimChar"/>
+        </w:rPr>
+        <w:t xml:space="preserve"> remark R7 Internet web</w:t>
+      </w:r>
+      <w:r>
+        <w:br/>
+      </w:r>
+      <w:r>
+        <w:rPr>
+          <w:rStyle w:val="VerbatimChar"/>
+        </w:rPr>
+        <w:t xml:space="preserve"> permit tcp 192.168.20.0 0.0.0.255 any eq www</w:t>
+      </w:r>
+      <w:r>
+        <w:br/>
+      </w:r>
+      <w:r>
+        <w:rPr>
+          <w:rStyle w:val="VerbatimChar"/>
+        </w:rPr>
+        <w:t xml:space="preserve"> permit tcp 192.168.20.0 0.0.0.255 any eq 443</w:t>
+      </w:r>
+      <w:r>
+        <w:br/>
+      </w:r>
+      <w:r>
+        <w:rPr>
+          <w:rStyle w:val="VerbatimChar"/>
+        </w:rPr>
+        <w:t xml:space="preserve"> deny ip any any</w:t>
+      </w:r>
+    </w:p>
+    <w:p>
+      <w:pPr>
+        <w:pStyle w:val="SourceCode"/>
+        <w:keepLines/>
+      </w:pPr>
+      <w:r>
+        <w:rPr>
+          <w:rStyle w:val="VerbatimChar"/>
+        </w:rPr>
+        <w:t xml:space="preserve">ip access-list extended ACL-IT-IN</w:t>
+      </w:r>
+      <w:r>
+        <w:br/>
+      </w:r>
+      <w:r>
+        <w:rPr>
+          <w:rStyle w:val="VerbatimChar"/>
+        </w:rPr>
+        <w:t xml:space="preserve"> remark R1 DNS</w:t>
+      </w:r>
+      <w:r>
+        <w:br/>
+      </w:r>
+      <w:r>
+        <w:rPr>
+          <w:rStyle w:val="VerbatimChar"/>
+        </w:rPr>
+        <w:t xml:space="preserve"> permit udp 192.168.30.0 0.0.0.255 host 192.168.50.20 eq domain</w:t>
+      </w:r>
+      <w:r>
+        <w:br/>
+      </w:r>
+      <w:r>
+        <w:rPr>
+          <w:rStyle w:val="VerbatimChar"/>
+        </w:rPr>
+        <w:t xml:space="preserve"> remark R2 portal</w:t>
+      </w:r>
+      <w:r>
+        <w:br/>
+      </w:r>
+      <w:r>
+        <w:rPr>
+          <w:rStyle w:val="VerbatimChar"/>
+        </w:rPr>
+        <w:t xml:space="preserve"> permit tcp 192.168.30.0 0.0.0.255 host 192.168.50.10 eq www</w:t>
+      </w:r>
+      <w:r>
+        <w:br/>
+      </w:r>
+      <w:r>
+        <w:rPr>
+          <w:rStyle w:val="VerbatimChar"/>
+        </w:rPr>
+        <w:t xml:space="preserve"> permit tcp 192.168.30.0 0.0.0.255 host 192.168.50.10 eq 443</w:t>
+      </w:r>
+      <w:r>
+        <w:br/>
+      </w:r>
+      <w:r>
+        <w:rPr>
+          <w:rStyle w:val="VerbatimChar"/>
+        </w:rPr>
+        <w:t xml:space="preserve"> remark R6 troubleshooting ping to servers</w:t>
+      </w:r>
+      <w:r>
+        <w:br/>
+      </w:r>
+      <w:r>
+        <w:rPr>
+          <w:rStyle w:val="VerbatimChar"/>
+        </w:rPr>
+        <w:t xml:space="preserve"> permit icmp 192.168.30.0 0.0.0.255 192.168.50.0 0.0.0.255 echo</w:t>
+      </w:r>
+      <w:r>
+        <w:br/>
+      </w:r>
+      <w:r>
+        <w:rPr>
+          <w:rStyle w:val="VerbatimChar"/>
+        </w:rPr>
+        <w:t xml:space="preserve"> remark R5 SSH to R-CORE and R-EDGE</w:t>
+      </w:r>
+      <w:r>
+        <w:br/>
+      </w:r>
+      <w:r>
+        <w:rPr>
+          <w:rStyle w:val="VerbatimChar"/>
+        </w:rPr>
+        <w:t xml:space="preserve"> permit tcp 192.168.30.0 0.0.0.255 host 192.168.30.1 eq 22</w:t>
+      </w:r>
+      <w:r>
+        <w:br/>
+      </w:r>
+      <w:r>
+        <w:rPr>
+          <w:rStyle w:val="VerbatimChar"/>
+        </w:rPr>
+        <w:t xml:space="preserve"> permit tcp 192.168.30.0 0.0.0.255 host 10.0.0.2 eq 22</w:t>
+      </w:r>
+      <w:r>
+        <w:br/>
+      </w:r>
+      <w:r>
+        <w:rPr>
+          <w:rStyle w:val="VerbatimChar"/>
+        </w:rPr>
+        <w:t xml:space="preserve"> remark X1 X2 X3 X5 - must stay ABOVE the R7 permits</w:t>
+      </w:r>
+      <w:r>
+        <w:br/>
+      </w:r>
+      <w:r>
+        <w:rPr>
+          <w:rStyle w:val="VerbatimChar"/>
+        </w:rPr>
+        <w:t xml:space="preserve"> deny ip 192.168.30.0 0.0.0.255 192.168.0.0 0.0.255.255</w:t>
+      </w:r>
+      <w:r>
+        <w:br/>
+      </w:r>
+      <w:r>
+        <w:rPr>
+          <w:rStyle w:val="VerbatimChar"/>
+        </w:rPr>
+        <w:t xml:space="preserve"> remark R7 Internet web</w:t>
+      </w:r>
+      <w:r>
+        <w:br/>
+      </w:r>
+      <w:r>
+        <w:rPr>
+          <w:rStyle w:val="VerbatimChar"/>
+        </w:rPr>
+        <w:t xml:space="preserve"> permit tcp 192.168.30.0 0.0.0.255 any eq www</w:t>
+      </w:r>
+      <w:r>
+        <w:br/>
+      </w:r>
+      <w:r>
+        <w:rPr>
+          <w:rStyle w:val="VerbatimChar"/>
+        </w:rPr>
+        <w:t xml:space="preserve"> permit tcp 192.168.30.0 0.0.0.255 any eq 443</w:t>
+      </w:r>
+      <w:r>
+        <w:br/>
+      </w:r>
+      <w:r>
+        <w:rPr>
+          <w:rStyle w:val="VerbatimChar"/>
+        </w:rPr>
+        <w:t xml:space="preserve"> deny ip any any</w:t>
+      </w:r>
+    </w:p>
+    <w:p>
+      <w:pPr>
+        <w:pStyle w:val="SourceCode"/>
+        <w:keepLines/>
+      </w:pPr>
+      <w:r>
+        <w:rPr>
+          <w:rStyle w:val="VerbatimChar"/>
+        </w:rPr>
+        <w:t xml:space="preserve">ip access-list extended ACL-SAL-IN</w:t>
+      </w:r>
+      <w:r>
+        <w:br/>
+      </w:r>
+      <w:r>
+        <w:rPr>
+          <w:rStyle w:val="VerbatimChar"/>
+        </w:rPr>
+        <w:t xml:space="preserve"> remark R1 DNS</w:t>
+      </w:r>
+      <w:r>
+        <w:br/>
+      </w:r>
+      <w:r>
+        <w:rPr>
+          <w:rStyle w:val="VerbatimChar"/>
+        </w:rPr>
+        <w:t xml:space="preserve"> permit udp 192.168.40.0 0.0.0.255 host 192.168.50.20 eq domain</w:t>
+      </w:r>
+      <w:r>
+        <w:br/>
+      </w:r>
+      <w:r>
+        <w:rPr>
+          <w:rStyle w:val="VerbatimChar"/>
+        </w:rPr>
+        <w:t xml:space="preserve"> remark R2 portal</w:t>
+      </w:r>
+      <w:r>
+        <w:br/>
+      </w:r>
+      <w:r>
+        <w:rPr>
+          <w:rStyle w:val="VerbatimChar"/>
+        </w:rPr>
+        <w:t xml:space="preserve"> permit tcp 192.168.40.0 0.0.0.255 host 192.168.50.10 eq www</w:t>
+      </w:r>
+      <w:r>
+        <w:br/>
+      </w:r>
+      <w:r>
+        <w:rPr>
+          <w:rStyle w:val="VerbatimChar"/>
+        </w:rPr>
+        <w:t xml:space="preserve"> permit tcp 192.168.40.0 0.0.0.255 host 192.168.50.10 eq 443</w:t>
+      </w:r>
+      <w:r>
+        <w:br/>
+      </w:r>
+      <w:r>
+        <w:rPr>
+          <w:rStyle w:val="VerbatimChar"/>
+        </w:rPr>
+        <w:t xml:space="preserve"> remark X1-X6 - must stay ABOVE the R7 permits</w:t>
+      </w:r>
+      <w:r>
+        <w:br/>
+      </w:r>
+      <w:r>
+        <w:rPr>
+          <w:rStyle w:val="VerbatimChar"/>
+        </w:rPr>
+        <w:t xml:space="preserve"> deny ip 192.168.40.0 0.0.0.255 192.168.0.0 0.0.255.255</w:t>
+      </w:r>
+      <w:r>
+        <w:br/>
+      </w:r>
+      <w:r>
+        <w:rPr>
+          <w:rStyle w:val="VerbatimChar"/>
+        </w:rPr>
+        <w:t xml:space="preserve"> remark R7 Internet web</w:t>
+      </w:r>
+      <w:r>
+        <w:br/>
+      </w:r>
+      <w:r>
+        <w:rPr>
+          <w:rStyle w:val="VerbatimChar"/>
+        </w:rPr>
+        <w:t xml:space="preserve"> permit tcp 192.168.40.0 0.0.0.255 any eq www</w:t>
+      </w:r>
+      <w:r>
+        <w:br/>
+      </w:r>
+      <w:r>
+        <w:rPr>
+          <w:rStyle w:val="VerbatimChar"/>
+        </w:rPr>
+        <w:t xml:space="preserve"> permit tcp 192.168.40.0 0.0.0.255 any eq 443</w:t>
+      </w:r>
+      <w:r>
+        <w:br/>
+      </w:r>
+      <w:r>
+        <w:rPr>
+          <w:rStyle w:val="VerbatimChar"/>
+        </w:rPr>
+        <w:t xml:space="preserve"> deny ip any any</w:t>
+      </w:r>
+    </w:p>
+    <w:p>
+      <w:pPr>
+        <w:pStyle w:val="SourceCode"/>
+        <w:keepLines/>
+      </w:pPr>
+      <w:r>
+        <w:rPr>
+          <w:rStyle w:val="VerbatimChar"/>
+        </w:rPr>
+        <w:t xml:space="preserve">interface GigabitEthernet0/0.10</w:t>
+      </w:r>
+      <w:r>
+        <w:br/>
+      </w:r>
+      <w:r>
+        <w:rPr>
+          <w:rStyle w:val="VerbatimChar"/>
+        </w:rPr>
+        <w:t xml:space="preserve"> ip access-group ACL-HR-IN in</w:t>
+      </w:r>
+      <w:r>
+        <w:br/>
+      </w:r>
+      <w:r>
+        <w:rPr>
+          <w:rStyle w:val="VerbatimChar"/>
+        </w:rPr>
+        <w:t xml:space="preserve">interface GigabitEthernet0/0.20</w:t>
+      </w:r>
+      <w:r>
+        <w:br/>
+      </w:r>
+      <w:r>
+        <w:rPr>
+          <w:rStyle w:val="VerbatimChar"/>
+        </w:rPr>
+        <w:t xml:space="preserve"> ip access-group ACL-FIN-IN in</w:t>
+      </w:r>
+      <w:r>
+        <w:br/>
+      </w:r>
+      <w:r>
+        <w:rPr>
+          <w:rStyle w:val="VerbatimChar"/>
+        </w:rPr>
+        <w:t xml:space="preserve">interface GigabitEthernet0/0.30</w:t>
+      </w:r>
+      <w:r>
+        <w:br/>
+      </w:r>
+      <w:r>
+        <w:rPr>
+          <w:rStyle w:val="VerbatimChar"/>
+        </w:rPr>
+        <w:t xml:space="preserve"> ip access-group ACL-IT-IN in</w:t>
+      </w:r>
+      <w:r>
+        <w:br/>
+      </w:r>
+      <w:r>
+        <w:rPr>
+          <w:rStyle w:val="VerbatimChar"/>
+        </w:rPr>
+        <w:t xml:space="preserve">interface GigabitEthernet0/0.40</w:t>
+      </w:r>
+      <w:r>
+        <w:br/>
+      </w:r>
+      <w:r>
+        <w:rPr>
+          <w:rStyle w:val="VerbatimChar"/>
+        </w:rPr>
+        <w:t xml:space="preserve"> ip access-group ACL-SAL-IN in</w:t>
+      </w:r>
+      <w:r>
+        <w:br/>
+      </w:r>
+      <w:r>
+        <w:rPr>
+          <w:rStyle w:val="VerbatimChar"/>
+        </w:rPr>
+        <w:t xml:space="preserve">line vty 0 15</w:t>
+      </w:r>
+      <w:r>
+        <w:br/>
+      </w:r>
+      <w:r>
+        <w:rPr>
+          <w:rStyle w:val="VerbatimChar"/>
+        </w:rPr>
+        <w:t xml:space="preserve"> transport input ssh</w:t>
+      </w:r>
+    </w:p>
+    <w:bookmarkEnd w:id="54"/>
+    <w:bookmarkEnd w:id="55"/>
+    <w:bookmarkStart w:id="56" w:name="appendix-b-reference-verification-record"/>
     <w:p>
       <w:pPr>
         <w:pStyle w:val="Heading1"/>
@@ -16689,7 +18606,7 @@
         <w:t xml:space="preserve">every claim must be checked against the full text before submission (last column above).</w:t>
       </w:r>
     </w:p>
-    <w:bookmarkEnd w:id="48"/>
+    <w:bookmarkEnd w:id="56"/>
     <w:sectPr>
       <w:footerReference w:type="default" r:id="rIdFooterPg"/>
       <w:pgSz w:w="11906" w:h="16838"/>

</xml_diff>

<commit_message>
Add team member names and role assignment
Ram (P1 network build), Darshan (P2 testing and evidence), Aadhavan
(P3 literature), Naveen (P4 citations and standards), Himenesh (P5
integration and QC). Title page, contribution statement,
documentation/contribution.md and decisions log updated; registration
numbers still to be supplied.

Co-Authored-By: Claude Opus 5.5 <noreply@anthropic.com>
Claude-Session: https://claude.ai/code/session_01VZE4XfkebTWLatWpMU9HD1
</commit_message>
<xml_diff>
--- a/report/case-study-draft-rev.docx
+++ b/report/case-study-draft-rev.docx
@@ -317,7 +317,7 @@
               <w:jc w:val="left"/>
             </w:pPr>
             <w:r>
-              <w:t xml:space="preserve">[PLACEHOLDER: name — registration number]</w:t>
+              <w:t xml:space="preserve">Ram — [PLACEHOLDER: registration number]</w:t>
             </w:r>
           </w:p>
         </w:tc>
@@ -352,7 +352,7 @@
               <w:jc w:val="left"/>
             </w:pPr>
             <w:r>
-              <w:t xml:space="preserve">[PLACEHOLDER: name — registration number]</w:t>
+              <w:t xml:space="preserve">Darshan — [PLACEHOLDER: registration number]</w:t>
             </w:r>
           </w:p>
         </w:tc>
@@ -387,7 +387,7 @@
               <w:jc w:val="left"/>
             </w:pPr>
             <w:r>
-              <w:t xml:space="preserve">[PLACEHOLDER: name — registration number]</w:t>
+              <w:t xml:space="preserve">Aadhavan — [PLACEHOLDER: registration number]</w:t>
             </w:r>
           </w:p>
         </w:tc>
@@ -422,7 +422,7 @@
               <w:jc w:val="left"/>
             </w:pPr>
             <w:r>
-              <w:t xml:space="preserve">[PLACEHOLDER: name — registration number]</w:t>
+              <w:t xml:space="preserve">Naveen — [PLACEHOLDER: registration number]</w:t>
             </w:r>
           </w:p>
         </w:tc>
@@ -457,7 +457,7 @@
               <w:jc w:val="left"/>
             </w:pPr>
             <w:r>
-              <w:t xml:space="preserve">[PLACEHOLDER: name — registration number]</w:t>
+              <w:t xml:space="preserve">Himenesh — [PLACEHOLDER: registration number]</w:t>
             </w:r>
           </w:p>
         </w:tc>
@@ -14612,7 +14612,7 @@
         <w:keepNext/>
       </w:pPr>
       <w:r>
-        <w:t xml:space="preserve">Names and registration numbers are left blank for the team to fill in. [TEAM CHECK: each member must check that their row describes what they actually did by the submission date, edit it if not, and only then sign. Work listed here that has not happened yet must be removed or changed.]</w:t>
+        <w:t xml:space="preserve">Registration numbers are left blank for the team to fill in; full names to be confirmed. [TEAM CHECK: each member must check that their row describes what they actually did by the submission date, edit it if not, and only then sign. Work listed here that has not happened yet must be removed or changed.]</w:t>
       </w:r>
     </w:p>
     <w:tbl>
@@ -14762,7 +14762,7 @@
               <w:jc w:val="left"/>
             </w:pPr>
             <w:r>
-              <w:t xml:space="preserve">[Name]</w:t>
+              <w:t xml:space="preserve">Ram</w:t>
             </w:r>
           </w:p>
         </w:tc>
@@ -14814,7 +14814,7 @@
               <w:jc w:val="left"/>
             </w:pPr>
             <w:r>
-              <w:t xml:space="preserve">Test matrix expectations against the configurations (with Member 2)</w:t>
+              <w:t xml:space="preserve">Test matrix expectations against the configurations (with Darshan)</w:t>
             </w:r>
           </w:p>
         </w:tc>
@@ -14854,7 +14854,7 @@
               <w:jc w:val="left"/>
             </w:pPr>
             <w:r>
-              <w:t xml:space="preserve">[Name]</w:t>
+              <w:t xml:space="preserve">Darshan</w:t>
             </w:r>
           </w:p>
         </w:tc>
@@ -14906,7 +14906,7 @@
               <w:jc w:val="left"/>
             </w:pPr>
             <w:r>
-              <w:t xml:space="preserve">Stage scripts against the requirements (with Member 1)</w:t>
+              <w:t xml:space="preserve">Stage scripts against the requirements (with Ram)</w:t>
             </w:r>
           </w:p>
         </w:tc>
@@ -14946,7 +14946,7 @@
               <w:jc w:val="left"/>
             </w:pPr>
             <w:r>
-              <w:t xml:space="preserve">[Name]</w:t>
+              <w:t xml:space="preserve">Aadhavan</w:t>
             </w:r>
           </w:p>
         </w:tc>
@@ -15038,7 +15038,7 @@
               <w:jc w:val="left"/>
             </w:pPr>
             <w:r>
-              <w:t xml:space="preserve">[Name]</w:t>
+              <w:t xml:space="preserve">Naveen</w:t>
             </w:r>
           </w:p>
         </w:tc>
@@ -15129,7 +15129,7 @@
               <w:jc w:val="left"/>
             </w:pPr>
             <w:r>
-              <w:t xml:space="preserve">[Name]</w:t>
+              <w:t xml:space="preserve">Himenesh</w:t>
             </w:r>
           </w:p>
         </w:tc>

</xml_diff>